<commit_message>
docs: update technical report, README and Postman collection for opaque token authentication
</commit_message>
<xml_diff>
--- a/Relazione Tecnica LeagueMate.docx
+++ b/Relazione Tecnica LeagueMate.docx
@@ -116,7 +116,7 @@
         <w:keepNext/>
         <w:spacing w:before="320" w:after="160"/>
       </w:pPr>
-      <w:bookmarkStart w:id="0" w:name="_Toc241332061"/>
+      <w:bookmarkStart w:id="0" w:name="_Toc241397544"/>
       <w:r>
         <w:rPr>
           <w:b/>
@@ -162,7 +162,7 @@
           <w:r>
             <w:fldChar w:fldCharType="separate"/>
           </w:r>
-          <w:hyperlink w:anchor="_Toc241332061" w:history="1">
+          <w:hyperlink w:anchor="_Toc241397544" w:history="1">
             <w:r>
               <w:rPr>
                 <w:rStyle w:val="Collegamentoipertestuale"/>
@@ -188,7 +188,7 @@
               <w:rPr>
                 <w:noProof/>
               </w:rPr>
-              <w:instrText xml:space="preserve"> PAGEREF _Toc241332061 \h </w:instrText>
+              <w:instrText xml:space="preserve"> PAGEREF _Toc241397544 \h </w:instrText>
             </w:r>
             <w:r>
               <w:rPr>
@@ -231,7 +231,7 @@
               <w14:ligatures w14:val="standardContextual"/>
             </w:rPr>
           </w:pPr>
-          <w:hyperlink w:anchor="_Toc241332062" w:history="1">
+          <w:hyperlink w:anchor="_Toc241397545" w:history="1">
             <w:r>
               <w:rPr>
                 <w:rStyle w:val="Collegamentoipertestuale"/>
@@ -257,7 +257,7 @@
               <w:rPr>
                 <w:noProof/>
               </w:rPr>
-              <w:instrText xml:space="preserve"> PAGEREF _Toc241332062 \h </w:instrText>
+              <w:instrText xml:space="preserve"> PAGEREF _Toc241397545 \h </w:instrText>
             </w:r>
             <w:r>
               <w:rPr>
@@ -300,7 +300,7 @@
               <w14:ligatures w14:val="standardContextual"/>
             </w:rPr>
           </w:pPr>
-          <w:hyperlink w:anchor="_Toc241332063" w:history="1">
+          <w:hyperlink w:anchor="_Toc241397546" w:history="1">
             <w:r>
               <w:rPr>
                 <w:rStyle w:val="Collegamentoipertestuale"/>
@@ -326,7 +326,7 @@
               <w:rPr>
                 <w:noProof/>
               </w:rPr>
-              <w:instrText xml:space="preserve"> PAGEREF _Toc241332063 \h </w:instrText>
+              <w:instrText xml:space="preserve"> PAGEREF _Toc241397546 \h </w:instrText>
             </w:r>
             <w:r>
               <w:rPr>
@@ -369,7 +369,7 @@
               <w14:ligatures w14:val="standardContextual"/>
             </w:rPr>
           </w:pPr>
-          <w:hyperlink w:anchor="_Toc241332064" w:history="1">
+          <w:hyperlink w:anchor="_Toc241397547" w:history="1">
             <w:r>
               <w:rPr>
                 <w:rStyle w:val="Collegamentoipertestuale"/>
@@ -395,7 +395,7 @@
               <w:rPr>
                 <w:noProof/>
               </w:rPr>
-              <w:instrText xml:space="preserve"> PAGEREF _Toc241332064 \h </w:instrText>
+              <w:instrText xml:space="preserve"> PAGEREF _Toc241397547 \h </w:instrText>
             </w:r>
             <w:r>
               <w:rPr>
@@ -438,7 +438,7 @@
               <w14:ligatures w14:val="standardContextual"/>
             </w:rPr>
           </w:pPr>
-          <w:hyperlink w:anchor="_Toc241332065" w:history="1">
+          <w:hyperlink w:anchor="_Toc241397548" w:history="1">
             <w:r>
               <w:rPr>
                 <w:rStyle w:val="Collegamentoipertestuale"/>
@@ -464,7 +464,7 @@
               <w:rPr>
                 <w:noProof/>
               </w:rPr>
-              <w:instrText xml:space="preserve"> PAGEREF _Toc241332065 \h </w:instrText>
+              <w:instrText xml:space="preserve"> PAGEREF _Toc241397548 \h </w:instrText>
             </w:r>
             <w:r>
               <w:rPr>
@@ -507,7 +507,7 @@
               <w14:ligatures w14:val="standardContextual"/>
             </w:rPr>
           </w:pPr>
-          <w:hyperlink w:anchor="_Toc241332066" w:history="1">
+          <w:hyperlink w:anchor="_Toc241397549" w:history="1">
             <w:r>
               <w:rPr>
                 <w:rStyle w:val="Collegamentoipertestuale"/>
@@ -532,7 +532,7 @@
               <w:rPr>
                 <w:noProof/>
               </w:rPr>
-              <w:instrText xml:space="preserve"> PAGEREF _Toc241332066 \h </w:instrText>
+              <w:instrText xml:space="preserve"> PAGEREF _Toc241397549 \h </w:instrText>
             </w:r>
             <w:r>
               <w:rPr>
@@ -575,7 +575,7 @@
               <w14:ligatures w14:val="standardContextual"/>
             </w:rPr>
           </w:pPr>
-          <w:hyperlink w:anchor="_Toc241332067" w:history="1">
+          <w:hyperlink w:anchor="_Toc241397550" w:history="1">
             <w:r>
               <w:rPr>
                 <w:rStyle w:val="Collegamentoipertestuale"/>
@@ -601,7 +601,7 @@
               <w:rPr>
                 <w:noProof/>
               </w:rPr>
-              <w:instrText xml:space="preserve"> PAGEREF _Toc241332067 \h </w:instrText>
+              <w:instrText xml:space="preserve"> PAGEREF _Toc241397550 \h </w:instrText>
             </w:r>
             <w:r>
               <w:rPr>
@@ -644,7 +644,7 @@
               <w14:ligatures w14:val="standardContextual"/>
             </w:rPr>
           </w:pPr>
-          <w:hyperlink w:anchor="_Toc241332068" w:history="1">
+          <w:hyperlink w:anchor="_Toc241397551" w:history="1">
             <w:r>
               <w:rPr>
                 <w:rStyle w:val="Collegamentoipertestuale"/>
@@ -670,7 +670,7 @@
               <w:rPr>
                 <w:noProof/>
               </w:rPr>
-              <w:instrText xml:space="preserve"> PAGEREF _Toc241332068 \h </w:instrText>
+              <w:instrText xml:space="preserve"> PAGEREF _Toc241397551 \h </w:instrText>
             </w:r>
             <w:r>
               <w:rPr>
@@ -713,7 +713,7 @@
               <w14:ligatures w14:val="standardContextual"/>
             </w:rPr>
           </w:pPr>
-          <w:hyperlink w:anchor="_Toc241332069" w:history="1">
+          <w:hyperlink w:anchor="_Toc241397552" w:history="1">
             <w:r>
               <w:rPr>
                 <w:rStyle w:val="Collegamentoipertestuale"/>
@@ -739,7 +739,7 @@
               <w:rPr>
                 <w:noProof/>
               </w:rPr>
-              <w:instrText xml:space="preserve"> PAGEREF _Toc241332069 \h </w:instrText>
+              <w:instrText xml:space="preserve"> PAGEREF _Toc241397552 \h </w:instrText>
             </w:r>
             <w:r>
               <w:rPr>
@@ -782,7 +782,7 @@
               <w14:ligatures w14:val="standardContextual"/>
             </w:rPr>
           </w:pPr>
-          <w:hyperlink w:anchor="_Toc241332070" w:history="1">
+          <w:hyperlink w:anchor="_Toc241397553" w:history="1">
             <w:r>
               <w:rPr>
                 <w:rStyle w:val="Collegamentoipertestuale"/>
@@ -807,7 +807,7 @@
               <w:rPr>
                 <w:noProof/>
               </w:rPr>
-              <w:instrText xml:space="preserve"> PAGEREF _Toc241332070 \h </w:instrText>
+              <w:instrText xml:space="preserve"> PAGEREF _Toc241397553 \h </w:instrText>
             </w:r>
             <w:r>
               <w:rPr>
@@ -850,7 +850,7 @@
               <w14:ligatures w14:val="standardContextual"/>
             </w:rPr>
           </w:pPr>
-          <w:hyperlink w:anchor="_Toc241332071" w:history="1">
+          <w:hyperlink w:anchor="_Toc241397554" w:history="1">
             <w:r>
               <w:rPr>
                 <w:rStyle w:val="Collegamentoipertestuale"/>
@@ -876,7 +876,7 @@
               <w:rPr>
                 <w:noProof/>
               </w:rPr>
-              <w:instrText xml:space="preserve"> PAGEREF _Toc241332071 \h </w:instrText>
+              <w:instrText xml:space="preserve"> PAGEREF _Toc241397554 \h </w:instrText>
             </w:r>
             <w:r>
               <w:rPr>
@@ -919,7 +919,7 @@
               <w14:ligatures w14:val="standardContextual"/>
             </w:rPr>
           </w:pPr>
-          <w:hyperlink w:anchor="_Toc241332072" w:history="1">
+          <w:hyperlink w:anchor="_Toc241397555" w:history="1">
             <w:r>
               <w:rPr>
                 <w:rStyle w:val="Collegamentoipertestuale"/>
@@ -945,7 +945,7 @@
               <w:rPr>
                 <w:noProof/>
               </w:rPr>
-              <w:instrText xml:space="preserve"> PAGEREF _Toc241332072 \h </w:instrText>
+              <w:instrText xml:space="preserve"> PAGEREF _Toc241397555 \h </w:instrText>
             </w:r>
             <w:r>
               <w:rPr>
@@ -988,7 +988,7 @@
               <w14:ligatures w14:val="standardContextual"/>
             </w:rPr>
           </w:pPr>
-          <w:hyperlink w:anchor="_Toc241332073" w:history="1">
+          <w:hyperlink w:anchor="_Toc241397556" w:history="1">
             <w:r>
               <w:rPr>
                 <w:rStyle w:val="Collegamentoipertestuale"/>
@@ -1014,7 +1014,7 @@
               <w:rPr>
                 <w:noProof/>
               </w:rPr>
-              <w:instrText xml:space="preserve"> PAGEREF _Toc241332073 \h </w:instrText>
+              <w:instrText xml:space="preserve"> PAGEREF _Toc241397556 \h </w:instrText>
             </w:r>
             <w:r>
               <w:rPr>
@@ -1057,7 +1057,7 @@
               <w14:ligatures w14:val="standardContextual"/>
             </w:rPr>
           </w:pPr>
-          <w:hyperlink w:anchor="_Toc241332074" w:history="1">
+          <w:hyperlink w:anchor="_Toc241397557" w:history="1">
             <w:r>
               <w:rPr>
                 <w:rStyle w:val="Collegamentoipertestuale"/>
@@ -1083,7 +1083,7 @@
               <w:rPr>
                 <w:noProof/>
               </w:rPr>
-              <w:instrText xml:space="preserve"> PAGEREF _Toc241332074 \h </w:instrText>
+              <w:instrText xml:space="preserve"> PAGEREF _Toc241397557 \h </w:instrText>
             </w:r>
             <w:r>
               <w:rPr>
@@ -1126,7 +1126,7 @@
               <w14:ligatures w14:val="standardContextual"/>
             </w:rPr>
           </w:pPr>
-          <w:hyperlink w:anchor="_Toc241332075" w:history="1">
+          <w:hyperlink w:anchor="_Toc241397558" w:history="1">
             <w:r>
               <w:rPr>
                 <w:rStyle w:val="Collegamentoipertestuale"/>
@@ -1152,7 +1152,7 @@
               <w:rPr>
                 <w:noProof/>
               </w:rPr>
-              <w:instrText xml:space="preserve"> PAGEREF _Toc241332075 \h </w:instrText>
+              <w:instrText xml:space="preserve"> PAGEREF _Toc241397558 \h </w:instrText>
             </w:r>
             <w:r>
               <w:rPr>
@@ -1195,7 +1195,7 @@
               <w14:ligatures w14:val="standardContextual"/>
             </w:rPr>
           </w:pPr>
-          <w:hyperlink w:anchor="_Toc241332076" w:history="1">
+          <w:hyperlink w:anchor="_Toc241397559" w:history="1">
             <w:r>
               <w:rPr>
                 <w:rStyle w:val="Collegamentoipertestuale"/>
@@ -1221,7 +1221,7 @@
               <w:rPr>
                 <w:noProof/>
               </w:rPr>
-              <w:instrText xml:space="preserve"> PAGEREF _Toc241332076 \h </w:instrText>
+              <w:instrText xml:space="preserve"> PAGEREF _Toc241397559 \h </w:instrText>
             </w:r>
             <w:r>
               <w:rPr>
@@ -1264,7 +1264,7 @@
               <w14:ligatures w14:val="standardContextual"/>
             </w:rPr>
           </w:pPr>
-          <w:hyperlink w:anchor="_Toc241332077" w:history="1">
+          <w:hyperlink w:anchor="_Toc241397560" w:history="1">
             <w:r>
               <w:rPr>
                 <w:rStyle w:val="Collegamentoipertestuale"/>
@@ -1290,7 +1290,7 @@
               <w:rPr>
                 <w:noProof/>
               </w:rPr>
-              <w:instrText xml:space="preserve"> PAGEREF _Toc241332077 \h </w:instrText>
+              <w:instrText xml:space="preserve"> PAGEREF _Toc241397560 \h </w:instrText>
             </w:r>
             <w:r>
               <w:rPr>
@@ -1333,7 +1333,7 @@
               <w14:ligatures w14:val="standardContextual"/>
             </w:rPr>
           </w:pPr>
-          <w:hyperlink w:anchor="_Toc241332078" w:history="1">
+          <w:hyperlink w:anchor="_Toc241397561" w:history="1">
             <w:r>
               <w:rPr>
                 <w:rStyle w:val="Collegamentoipertestuale"/>
@@ -1358,7 +1358,7 @@
               <w:rPr>
                 <w:noProof/>
               </w:rPr>
-              <w:instrText xml:space="preserve"> PAGEREF _Toc241332078 \h </w:instrText>
+              <w:instrText xml:space="preserve"> PAGEREF _Toc241397561 \h </w:instrText>
             </w:r>
             <w:r>
               <w:rPr>
@@ -1375,7 +1375,7 @@
               <w:rPr>
                 <w:noProof/>
               </w:rPr>
-              <w:t>11</w:t>
+              <w:t>12</w:t>
             </w:r>
             <w:r>
               <w:rPr>
@@ -1401,7 +1401,7 @@
               <w14:ligatures w14:val="standardContextual"/>
             </w:rPr>
           </w:pPr>
-          <w:hyperlink w:anchor="_Toc241332079" w:history="1">
+          <w:hyperlink w:anchor="_Toc241397562" w:history="1">
             <w:r>
               <w:rPr>
                 <w:rStyle w:val="Collegamentoipertestuale"/>
@@ -1427,7 +1427,7 @@
               <w:rPr>
                 <w:noProof/>
               </w:rPr>
-              <w:instrText xml:space="preserve"> PAGEREF _Toc241332079 \h </w:instrText>
+              <w:instrText xml:space="preserve"> PAGEREF _Toc241397562 \h </w:instrText>
             </w:r>
             <w:r>
               <w:rPr>
@@ -1444,7 +1444,7 @@
               <w:rPr>
                 <w:noProof/>
               </w:rPr>
-              <w:t>11</w:t>
+              <w:t>12</w:t>
             </w:r>
             <w:r>
               <w:rPr>
@@ -1470,7 +1470,7 @@
               <w14:ligatures w14:val="standardContextual"/>
             </w:rPr>
           </w:pPr>
-          <w:hyperlink w:anchor="_Toc241332080" w:history="1">
+          <w:hyperlink w:anchor="_Toc241397563" w:history="1">
             <w:r>
               <w:rPr>
                 <w:rStyle w:val="Collegamentoipertestuale"/>
@@ -1495,7 +1495,7 @@
               <w:rPr>
                 <w:noProof/>
               </w:rPr>
-              <w:instrText xml:space="preserve"> PAGEREF _Toc241332080 \h </w:instrText>
+              <w:instrText xml:space="preserve"> PAGEREF _Toc241397563 \h </w:instrText>
             </w:r>
             <w:r>
               <w:rPr>
@@ -1512,7 +1512,7 @@
               <w:rPr>
                 <w:noProof/>
               </w:rPr>
-              <w:t>11</w:t>
+              <w:t>12</w:t>
             </w:r>
             <w:r>
               <w:rPr>
@@ -1538,7 +1538,7 @@
               <w14:ligatures w14:val="standardContextual"/>
             </w:rPr>
           </w:pPr>
-          <w:hyperlink w:anchor="_Toc241332081" w:history="1">
+          <w:hyperlink w:anchor="_Toc241397564" w:history="1">
             <w:r>
               <w:rPr>
                 <w:rStyle w:val="Collegamentoipertestuale"/>
@@ -1564,7 +1564,7 @@
               <w:rPr>
                 <w:noProof/>
               </w:rPr>
-              <w:instrText xml:space="preserve"> PAGEREF _Toc241332081 \h </w:instrText>
+              <w:instrText xml:space="preserve"> PAGEREF _Toc241397564 \h </w:instrText>
             </w:r>
             <w:r>
               <w:rPr>
@@ -1581,7 +1581,7 @@
               <w:rPr>
                 <w:noProof/>
               </w:rPr>
-              <w:t>12</w:t>
+              <w:t>13</w:t>
             </w:r>
             <w:r>
               <w:rPr>
@@ -1607,7 +1607,7 @@
               <w14:ligatures w14:val="standardContextual"/>
             </w:rPr>
           </w:pPr>
-          <w:hyperlink w:anchor="_Toc241332082" w:history="1">
+          <w:hyperlink w:anchor="_Toc241397565" w:history="1">
             <w:r>
               <w:rPr>
                 <w:rStyle w:val="Collegamentoipertestuale"/>
@@ -1633,7 +1633,7 @@
               <w:rPr>
                 <w:noProof/>
               </w:rPr>
-              <w:instrText xml:space="preserve"> PAGEREF _Toc241332082 \h </w:instrText>
+              <w:instrText xml:space="preserve"> PAGEREF _Toc241397565 \h </w:instrText>
             </w:r>
             <w:r>
               <w:rPr>
@@ -1650,7 +1650,7 @@
               <w:rPr>
                 <w:noProof/>
               </w:rPr>
-              <w:t>12</w:t>
+              <w:t>13</w:t>
             </w:r>
             <w:r>
               <w:rPr>
@@ -1678,7 +1678,7 @@
         <w:keepNext/>
         <w:spacing w:before="320" w:after="160"/>
       </w:pPr>
-      <w:bookmarkStart w:id="1" w:name="_Toc241332062"/>
+      <w:bookmarkStart w:id="1" w:name="_Toc241397545"/>
       <w:r>
         <w:rPr>
           <w:b/>
@@ -1825,7 +1825,7 @@
         <w:keepNext/>
         <w:spacing w:before="320" w:after="160"/>
       </w:pPr>
-      <w:bookmarkStart w:id="2" w:name="_Toc241332063"/>
+      <w:bookmarkStart w:id="2" w:name="_Toc241397546"/>
       <w:r>
         <w:rPr>
           <w:b/>
@@ -1913,7 +1913,7 @@
         <w:keepNext/>
         <w:spacing w:before="240" w:after="120"/>
       </w:pPr>
-      <w:bookmarkStart w:id="3" w:name="_Toc241332064"/>
+      <w:bookmarkStart w:id="3" w:name="_Toc241397547"/>
       <w:r>
         <w:rPr>
           <w:b/>
@@ -2443,7 +2443,7 @@
                 <w:sz w:val="20"/>
                 <w:szCs w:val="20"/>
               </w:rPr>
-              <w:t>Filtro JWT, rate limit sul login, autorizzazione sui tornei, configurazione di sicurezza</w:t>
+              <w:t>Authorization Server, token opachi, rate limit sul login, autorizzazione sui tornei, CORS, configurazione di sicurezza</w:t>
             </w:r>
           </w:p>
         </w:tc>
@@ -2561,7 +2561,7 @@
         <w:keepNext/>
         <w:spacing w:before="240" w:after="120"/>
       </w:pPr>
-      <w:bookmarkStart w:id="4" w:name="_Toc241332065"/>
+      <w:bookmarkStart w:id="4" w:name="_Toc241397548"/>
       <w:r>
         <w:rPr>
           <w:b/>
@@ -2570,17 +2570,7 @@
           <w:sz w:val="25"/>
           <w:szCs w:val="25"/>
         </w:rPr>
-        <w:t>2</w:t>
-      </w:r>
-      <w:r>
-        <w:rPr>
-          <w:b/>
-          <w:bCs/>
-          <w:color w:val="333333"/>
-          <w:sz w:val="25"/>
-          <w:szCs w:val="25"/>
-        </w:rPr>
-        <w:t>.2 Moduli funzionali</w:t>
+        <w:t>2.2 Moduli funzionali</w:t>
       </w:r>
       <w:bookmarkEnd w:id="4"/>
     </w:p>
@@ -2728,7 +2718,7 @@
                 <w:sz w:val="20"/>
                 <w:szCs w:val="20"/>
               </w:rPr>
-              <w:t>Registrazione e login, rilascio del token JWT</w:t>
+              <w:t>Registrazione, login, rinnovo e revoca dei token (Spring Authorization Server)</w:t>
             </w:r>
           </w:p>
         </w:tc>
@@ -2830,7 +2820,7 @@
                 <w:sz w:val="20"/>
                 <w:szCs w:val="20"/>
               </w:rPr>
-              <w:t>CRUD tornei, iscrizioni, calendario (anche andata e ritorno), chiusura, classifica, statistiche, co-organizzatori</w:t>
+              <w:t>CRUD tornei, iscrizioni, calendario (anche andata e ritorno), chiusura, classifica, statistiche, co-organizzatori, squadre iscritte, tornei dell'organizzatore</w:t>
             </w:r>
           </w:p>
         </w:tc>
@@ -3006,7 +2996,7 @@
           <w:sz w:val="25"/>
         </w:rPr>
       </w:pPr>
-      <w:bookmarkStart w:id="5" w:name="_Toc241332066"/>
+      <w:bookmarkStart w:id="5" w:name="_Toc241397549"/>
       <w:r>
         <w:rPr>
           <w:b/>
@@ -3075,7 +3065,13 @@
         <w:t>OpenApiConfig</w:t>
       </w:r>
       <w:r>
-        <w:t xml:space="preserve"> dichiara lo schema di autenticazione Bearer JWT, così da poter provare anche gli endpoint protetti incollando il token ottenuto dal login.</w:t>
+        <w:t xml:space="preserve"> dichiara lo </w:t>
+      </w:r>
+      <w:r>
+        <w:t>schema di autenticazione Bearer</w:t>
+      </w:r>
+      <w:r>
+        <w:t>, così da poter provare anche gli endpoint protetti incollando il token ottenuto dal login.</w:t>
       </w:r>
     </w:p>
     <w:p>
@@ -3109,11 +3105,73 @@
     </w:p>
     <w:p>
       <w:pPr>
+        <w:spacing w:after="120" w:line="276" w:lineRule="auto"/>
+        <w:jc w:val="both"/>
+      </w:pPr>
+      <w:r>
+        <w:t>Per il frontend web l'API espone anche gli endpoint di consultazione che servono a una pagina di torneo: il calendario completo con giornate e partite (</w:t>
+      </w:r>
+      <w:r>
+        <w:rPr>
+          <w:rFonts w:ascii="Consolas" w:hAnsi="Consolas"/>
+          <w:color w:val="C0392B"/>
+          <w:sz w:val="20"/>
+        </w:rPr>
+        <w:t>GET /api/tournaments/{id}/rounds</w:t>
+      </w:r>
+      <w:r>
+        <w:t>), le squadre iscritte (</w:t>
+      </w:r>
+      <w:r>
+        <w:rPr>
+          <w:rFonts w:ascii="Consolas" w:hAnsi="Consolas"/>
+          <w:color w:val="C0392B"/>
+          <w:sz w:val="20"/>
+        </w:rPr>
+        <w:t>/teams</w:t>
+      </w:r>
+      <w:r>
+        <w:t>) e i tornei organizzati dall'utente autenticato (</w:t>
+      </w:r>
+      <w:r>
+        <w:rPr>
+          <w:rFonts w:ascii="Consolas" w:hAnsi="Consolas"/>
+          <w:color w:val="C0392B"/>
+          <w:sz w:val="20"/>
+        </w:rPr>
+        <w:t>/mine</w:t>
+      </w:r>
+      <w:r>
+        <w:t xml:space="preserve">). Il </w:t>
+      </w:r>
+      <w:r>
+        <w:rPr>
+          <w:b/>
+        </w:rPr>
+        <w:t>CORS</w:t>
+      </w:r>
+      <w:r>
+        <w:t xml:space="preserve"> è abilitato per le origini del frontend, configurabili con la variabile </w:t>
+      </w:r>
+      <w:r>
+        <w:rPr>
+          <w:rFonts w:ascii="Consolas" w:hAnsi="Consolas"/>
+          <w:color w:val="C0392B"/>
+          <w:sz w:val="20"/>
+        </w:rPr>
+        <w:t>CORS_ALLOWED_ORIGINS</w:t>
+      </w:r>
+      <w:r>
+        <w:t xml:space="preserve"> (per impostazione predefinita le porte di sviluppo di Vite e di Create React App).</w:t>
+      </w:r>
+    </w:p>
+    <w:p>
+      <w:pPr>
         <w:pStyle w:val="Titolo1"/>
         <w:keepNext/>
         <w:spacing w:before="320" w:after="160"/>
       </w:pPr>
-      <w:bookmarkStart w:id="6" w:name="_Toc241332067"/>
+      <w:bookmarkStart w:id="6" w:name="_Toc241397550"/>
       <w:r>
         <w:rPr>
           <w:b/>
@@ -3122,17 +3180,7 @@
           <w:sz w:val="30"/>
           <w:szCs w:val="30"/>
         </w:rPr>
-        <w:t>3</w:t>
-      </w:r>
-      <w:r>
-        <w:rPr>
-          <w:b/>
-          <w:bCs/>
-          <w:color w:val="1F4E79"/>
-          <w:sz w:val="30"/>
-          <w:szCs w:val="30"/>
-        </w:rPr>
-        <w:t>. Modello dei dati e relazioni</w:t>
+        <w:t>3. Modello dei dati e relazioni</w:t>
       </w:r>
       <w:bookmarkEnd w:id="6"/>
     </w:p>
@@ -3161,7 +3209,7 @@
         <w:keepNext/>
         <w:spacing w:before="240" w:after="120"/>
       </w:pPr>
-      <w:bookmarkStart w:id="7" w:name="_Toc241332068"/>
+      <w:bookmarkStart w:id="7" w:name="_Toc241397551"/>
       <w:r>
         <w:rPr>
           <w:b/>
@@ -3722,6 +3770,7 @@
         <w:jc w:val="both"/>
       </w:pPr>
       <w:r>
+        <w:lastRenderedPageBreak/>
         <w:t xml:space="preserve">Di conseguenza il progetto usa una sola </w:t>
       </w:r>
       <w:r>
@@ -3743,7 +3792,7 @@
         <w:keepNext/>
         <w:spacing w:before="240" w:after="120"/>
       </w:pPr>
-      <w:bookmarkStart w:id="8" w:name="_Toc241332069"/>
+      <w:bookmarkStart w:id="8" w:name="_Toc241397552"/>
       <w:r>
         <w:rPr>
           <w:b/>
@@ -3752,7 +3801,6 @@
           <w:sz w:val="25"/>
           <w:szCs w:val="25"/>
         </w:rPr>
-        <w:lastRenderedPageBreak/>
         <w:t>3.2 Elementi avanzati di persistenza</w:t>
       </w:r>
       <w:bookmarkEnd w:id="8"/>
@@ -4432,7 +4480,7 @@
           <w:sz w:val="25"/>
         </w:rPr>
       </w:pPr>
-      <w:bookmarkStart w:id="9" w:name="_Toc241332070"/>
+      <w:bookmarkStart w:id="9" w:name="_Toc241397553"/>
       <w:r>
         <w:rPr>
           <w:b/>
@@ -4503,7 +4551,7 @@
         <w:t>V3__add_double_round_robin.sql</w:t>
       </w:r>
       <w:r>
-        <w:t xml:space="preserve">), applicato automaticamente all'avvio in ordine di versione. Flyway registra nella tabella </w:t>
+        <w:t xml:space="preserve">, </w:t>
       </w:r>
       <w:r>
         <w:rPr>
@@ -4511,19 +4559,10 @@
           <w:color w:val="C0392B"/>
           <w:sz w:val="20"/>
         </w:rPr>
-        <w:t>flyway_schema_history</w:t>
-      </w:r>
-      <w:r>
-        <w:t xml:space="preserve"> quali migrazioni sono già state eseguite, per cui ogni database — di sviluppo, di test o di produzione — si trova sempre nello stesso stato.</w:t>
-      </w:r>
-    </w:p>
-    <w:p>
-      <w:pPr>
-        <w:spacing w:after="120" w:line="276" w:lineRule="auto"/>
-        <w:jc w:val="both"/>
-      </w:pPr>
-      <w:r>
-        <w:t xml:space="preserve">Hibernate è configurato con </w:t>
+        <w:t>V4__oauth2_authorizations.sql</w:t>
+      </w:r>
+      <w:r>
+        <w:t xml:space="preserve">), applicato automaticamente all'avvio in ordine di versione. Flyway registra nella tabella </w:t>
       </w:r>
       <w:r>
         <w:rPr>
@@ -4531,10 +4570,10 @@
           <w:color w:val="C0392B"/>
           <w:sz w:val="20"/>
         </w:rPr>
-        <w:t>ddl-auto=validate</w:t>
-      </w:r>
-      <w:r>
-        <w:t>: non crea né modifica mai le tabelle, ma all'avvio verifica che le entità corrispondano allo schema e, in caso contrario, impedisce all'applicazione di partire. Lo schema ha così un'unica fonte di verità, le migrazioni, ed è impossibile che codice e database divergano senza che nessuno se ne accorga.</w:t>
+        <w:t>flyway_schema_history</w:t>
+      </w:r>
+      <w:r>
+        <w:t xml:space="preserve"> quali migrazioni sono già state eseguite, per cui ogni database — di sviluppo, di test o di produzione — si trova sempre nello stesso stato. L'ultima migrazione crea la tabella delle autorizzazioni usata dall'autenticazione, descritta nel capitolo 5.</w:t>
       </w:r>
     </w:p>
     <w:p>
@@ -4543,7 +4582,7 @@
         <w:jc w:val="both"/>
       </w:pPr>
       <w:r>
-        <w:t xml:space="preserve">I dati dimostrativi (utenti, squadre e torneo di esempio) sono separati dallo schema: si trovano in una migrazione ripetibile nella cartella </w:t>
+        <w:t xml:space="preserve">Hibernate è configurato con </w:t>
       </w:r>
       <w:r>
         <w:rPr>
@@ -4551,6 +4590,26 @@
           <w:color w:val="C0392B"/>
           <w:sz w:val="20"/>
         </w:rPr>
+        <w:t>ddl-auto=validate</w:t>
+      </w:r>
+      <w:r>
+        <w:t>: non crea né modifica mai le tabelle, ma all'avvio verifica che le entità corrispondano allo schema e, in caso contrario, impedisce all'applicazione di partire. Lo schema ha così un'unica fonte di verità, le migrazioni, ed è impossibile che codice e database divergano senza che nessuno se ne accorga.</w:t>
+      </w:r>
+    </w:p>
+    <w:p>
+      <w:pPr>
+        <w:spacing w:after="120" w:line="276" w:lineRule="auto"/>
+        <w:jc w:val="both"/>
+      </w:pPr>
+      <w:r>
+        <w:t xml:space="preserve">I dati dimostrativi (utenti, squadre e torneo di esempio) sono separati dallo schema: si trovano in una migrazione ripetibile nella cartella </w:t>
+      </w:r>
+      <w:r>
+        <w:rPr>
+          <w:rFonts w:ascii="Consolas" w:hAnsi="Consolas"/>
+          <w:color w:val="C0392B"/>
+          <w:sz w:val="20"/>
+        </w:rPr>
         <w:t>db/demo</w:t>
       </w:r>
       <w:r>
@@ -4563,7 +4622,7 @@
         <w:keepNext/>
         <w:spacing w:before="320" w:after="160"/>
       </w:pPr>
-      <w:bookmarkStart w:id="10" w:name="_Toc241332071"/>
+      <w:bookmarkStart w:id="10" w:name="_Toc241397554"/>
       <w:r>
         <w:rPr>
           <w:b/>
@@ -4572,17 +4631,7 @@
           <w:sz w:val="30"/>
           <w:szCs w:val="30"/>
         </w:rPr>
-        <w:t>4</w:t>
-      </w:r>
-      <w:r>
-        <w:rPr>
-          <w:b/>
-          <w:bCs/>
-          <w:color w:val="1F4E79"/>
-          <w:sz w:val="30"/>
-          <w:szCs w:val="30"/>
-        </w:rPr>
-        <w:t>. Funzionalità delle classi principali</w:t>
+        <w:t>4. Funzionalità delle classi principali</w:t>
       </w:r>
       <w:bookmarkEnd w:id="10"/>
     </w:p>
@@ -4592,7 +4641,7 @@
         <w:keepNext/>
         <w:spacing w:before="240" w:after="120"/>
       </w:pPr>
-      <w:bookmarkStart w:id="11" w:name="_Toc241332072"/>
+      <w:bookmarkStart w:id="11" w:name="_Toc241397555"/>
       <w:r>
         <w:rPr>
           <w:b/>
@@ -4762,7 +4811,7 @@
         <w:keepNext/>
         <w:spacing w:before="240" w:after="120"/>
       </w:pPr>
-      <w:bookmarkStart w:id="12" w:name="_Toc241332073"/>
+      <w:bookmarkStart w:id="12" w:name="_Toc241397556"/>
       <w:r>
         <w:rPr>
           <w:b/>
@@ -4812,6 +4861,7 @@
         <w:jc w:val="both"/>
       </w:pPr>
       <w:r>
+        <w:lastRenderedPageBreak/>
         <w:t xml:space="preserve">Ogni squadra è rappresentata da un accumulatore tipizzato </w:t>
       </w:r>
       <w:r>
@@ -4860,11 +4910,7 @@
         <w:t>registerLoss</w:t>
       </w:r>
       <w:r>
-        <w:t xml:space="preserve">), che sostituisce una precedente implementazione </w:t>
-      </w:r>
-      <w:r>
-        <w:lastRenderedPageBreak/>
-        <w:t xml:space="preserve">basata su liste di interi con indici posizionali, difficile da leggere e da mantenere. Le squadre sono indicizzate per </w:t>
+        <w:t xml:space="preserve">), che sostituisce una precedente implementazione basata su liste di interi con indici posizionali, difficile da leggere e da mantenere. Le squadre sono indicizzate per </w:t>
       </w:r>
       <w:r>
         <w:rPr>
@@ -4947,7 +4993,13 @@
           <w:szCs w:val="18"/>
           <w:lang w:val="en-US"/>
         </w:rPr>
-        <w:t xml:space="preserve">      </w:t>
+        <w:t xml:space="preserve">        .thenComparing(Comparator.comparingInt(StandingEntry::goalDifference).reversed())</w:t>
+      </w:r>
+      <w:r>
+        <w:rPr>
+          <w:lang w:val="en-US"/>
+        </w:rPr>
+        <w:br/>
       </w:r>
       <w:r>
         <w:rPr>
@@ -4957,7 +5009,7 @@
           <w:szCs w:val="18"/>
           <w:lang w:val="en-US"/>
         </w:rPr>
-        <w:t xml:space="preserve">  .thenComparing(Comparator.comparingInt(StandingEntry::goalDifference).reversed())</w:t>
+        <w:t xml:space="preserve">        .thenComparing(Comparator.comparingInt(StandingEntry::goalsFor).reversed())</w:t>
       </w:r>
       <w:r>
         <w:rPr>
@@ -4973,7 +5025,7 @@
           <w:szCs w:val="18"/>
           <w:lang w:val="en-US"/>
         </w:rPr>
-        <w:t xml:space="preserve">        .thenComparing(Comparator.comparingInt(StandingEntry::goalsFor).reversed())</w:t>
+        <w:t xml:space="preserve">        .thenComparing(StandingEntry::teamName))</w:t>
       </w:r>
       <w:r>
         <w:rPr>
@@ -4989,22 +5041,6 @@
           <w:szCs w:val="18"/>
           <w:lang w:val="en-US"/>
         </w:rPr>
-        <w:t xml:space="preserve">        .thenComparing(StandingEntry::teamName))</w:t>
-      </w:r>
-      <w:r>
-        <w:rPr>
-          <w:lang w:val="en-US"/>
-        </w:rPr>
-        <w:br/>
-      </w:r>
-      <w:r>
-        <w:rPr>
-          <w:rFonts w:ascii="Consolas" w:eastAsia="Consolas" w:hAnsi="Consolas" w:cs="Consolas"/>
-          <w:color w:val="2C3E50"/>
-          <w:sz w:val="18"/>
-          <w:szCs w:val="18"/>
-          <w:lang w:val="en-US"/>
-        </w:rPr>
         <w:t xml:space="preserve">    .toList();</w:t>
       </w:r>
     </w:p>
@@ -5014,7 +5050,7 @@
         <w:keepNext/>
         <w:spacing w:before="240" w:after="120"/>
       </w:pPr>
-      <w:bookmarkStart w:id="13" w:name="_Toc241332074"/>
+      <w:bookmarkStart w:id="13" w:name="_Toc241397557"/>
       <w:r>
         <w:rPr>
           <w:b/>
@@ -5067,7 +5103,7 @@
           <w:u w:val="single"/>
         </w:rPr>
       </w:pPr>
-      <w:bookmarkStart w:id="14" w:name="_Toc241332075"/>
+      <w:bookmarkStart w:id="14" w:name="_Toc241397558"/>
       <w:r>
         <w:rPr>
           <w:b/>
@@ -5174,7 +5210,18 @@
         <w:spacing w:after="80" w:line="264" w:lineRule="auto"/>
       </w:pPr>
       <w:r>
-        <w:t>La stessa squadra non può iscriversi due volte allo stesso torneo.</w:t>
+        <w:t xml:space="preserve">I punti per vittoria e pareggio si possono modificare solo mentre il torneo è in </w:t>
+      </w:r>
+      <w:r>
+        <w:rPr>
+          <w:rFonts w:ascii="Consolas" w:hAnsi="Consolas"/>
+          <w:color w:val="C0392B"/>
+          <w:sz w:val="20"/>
+        </w:rPr>
+        <w:t>DRAFT</w:t>
+      </w:r>
+      <w:r>
+        <w:t>: dopo l'avvio cambierebbero retroattivamente la classifica.</w:t>
       </w:r>
     </w:p>
     <w:p>
@@ -5187,18 +5234,7 @@
         <w:spacing w:after="80" w:line="264" w:lineRule="auto"/>
       </w:pPr>
       <w:r>
-        <w:t xml:space="preserve">I risultati delle partite possono essere inseriti o corretti solo mentre il torneo è </w:t>
-      </w:r>
-      <w:r>
-        <w:rPr>
-          <w:rFonts w:ascii="Consolas" w:hAnsi="Consolas"/>
-          <w:color w:val="C0392B"/>
-          <w:sz w:val="20"/>
-        </w:rPr>
-        <w:t>ACTIVE</w:t>
-      </w:r>
-      <w:r>
-        <w:t>.</w:t>
+        <w:t>La stessa squadra non può iscriversi due volte allo stesso torneo.</w:t>
       </w:r>
     </w:p>
     <w:p>
@@ -5211,7 +5247,7 @@
         <w:spacing w:after="80" w:line="264" w:lineRule="auto"/>
       </w:pPr>
       <w:r>
-        <w:t xml:space="preserve">Un torneo passa a </w:t>
+        <w:t xml:space="preserve">I risultati delle partite possono essere inseriti o corretti solo mentre il torneo è </w:t>
       </w:r>
       <w:r>
         <w:rPr>
@@ -5219,10 +5255,10 @@
           <w:color w:val="C0392B"/>
           <w:sz w:val="20"/>
         </w:rPr>
-        <w:t>COMPLETED</w:t>
-      </w:r>
-      <w:r>
-        <w:t xml:space="preserve"> solo quando tutte le partite sono state giocate; da quel momento i risultati sono bloccati.</w:t>
+        <w:t>ACTIVE</w:t>
+      </w:r>
+      <w:r>
+        <w:t>.</w:t>
       </w:r>
     </w:p>
     <w:p>
@@ -5235,7 +5271,18 @@
         <w:spacing w:after="80" w:line="264" w:lineRule="auto"/>
       </w:pPr>
       <w:r>
-        <w:t>Un membro può essere rimosso da una squadra solo indicando la squadra a cui appartiene realmente.</w:t>
+        <w:t xml:space="preserve">Un torneo passa a </w:t>
+      </w:r>
+      <w:r>
+        <w:rPr>
+          <w:rFonts w:ascii="Consolas" w:hAnsi="Consolas"/>
+          <w:color w:val="C0392B"/>
+          <w:sz w:val="20"/>
+        </w:rPr>
+        <w:t>COMPLETED</w:t>
+      </w:r>
+      <w:r>
+        <w:t xml:space="preserve"> solo quando tutte le partite sono state giocate; da quel momento i risultati sono bloccati.</w:t>
       </w:r>
     </w:p>
     <w:p>
@@ -5248,19 +5295,7 @@
         <w:spacing w:after="80" w:line="264" w:lineRule="auto"/>
       </w:pPr>
       <w:r>
-        <w:t xml:space="preserve">Non è possibile declassare l'ultimo </w:t>
-      </w:r>
-      <w:r>
-        <w:rPr>
-          <w:rFonts w:ascii="Consolas" w:eastAsia="Consolas" w:hAnsi="Consolas" w:cs="Consolas"/>
-          <w:color w:val="C0392B"/>
-          <w:sz w:val="20"/>
-          <w:szCs w:val="20"/>
-        </w:rPr>
-        <w:t>ADMIN</w:t>
-      </w:r>
-      <w:r>
-        <w:t xml:space="preserve"> rimasto nel sistema.</w:t>
+        <w:t>Un membro può essere rimosso da una squadra solo indicando la squadra a cui appartiene realmente.</w:t>
       </w:r>
     </w:p>
     <w:p>
@@ -5273,16 +5308,7 @@
         <w:spacing w:after="80" w:line="264" w:lineRule="auto"/>
       </w:pPr>
       <w:r>
-        <w:t>Un utente può modificare solo il proprio profilo; un ADMIN qualsiasi profilo.</w:t>
-      </w:r>
-    </w:p>
-    <w:p>
-      <w:pPr>
-        <w:spacing w:after="120" w:line="276" w:lineRule="auto"/>
-        <w:jc w:val="both"/>
-      </w:pPr>
-      <w:r>
-        <w:t xml:space="preserve">Nel loro insieme queste regole descrivono il ciclo di vita di un torneo: </w:t>
+        <w:t xml:space="preserve">Solo un utente con ruolo </w:t>
       </w:r>
       <w:r>
         <w:rPr>
@@ -5290,10 +5316,10 @@
           <w:color w:val="C0392B"/>
           <w:sz w:val="20"/>
         </w:rPr>
-        <w:t>DRAFT</w:t>
-      </w:r>
-      <w:r>
-        <w:t xml:space="preserve"> (iscrizioni aperte), </w:t>
+        <w:t>ORGANIZER</w:t>
+      </w:r>
+      <w:r>
+        <w:t xml:space="preserve"> o </w:t>
       </w:r>
       <w:r>
         <w:rPr>
@@ -5301,171 +5327,10 @@
           <w:color w:val="C0392B"/>
           <w:sz w:val="20"/>
         </w:rPr>
-        <w:t>ACTIVE</w:t>
-      </w:r>
-      <w:r>
-        <w:t xml:space="preserve"> (calendario generato, risultati in corso) e </w:t>
-      </w:r>
-      <w:r>
-        <w:rPr>
-          <w:rFonts w:ascii="Consolas" w:hAnsi="Consolas"/>
-          <w:color w:val="C0392B"/>
-          <w:sz w:val="20"/>
-        </w:rPr>
-        <w:t>COMPLETED</w:t>
-      </w:r>
-      <w:r>
-        <w:t xml:space="preserve"> (torneo chiuso, dati consolidati). Ogni violazione produce una risposta </w:t>
-      </w:r>
-      <w:r>
-        <w:rPr>
-          <w:rFonts w:ascii="Consolas" w:hAnsi="Consolas"/>
-          <w:color w:val="C0392B"/>
-          <w:sz w:val="20"/>
-        </w:rPr>
-        <w:t>409 Conflict</w:t>
-      </w:r>
-      <w:r>
-        <w:t xml:space="preserve"> con un messaggio esplicito.</w:t>
-      </w:r>
-    </w:p>
-    <w:p>
-      <w:r>
-        <w:br w:type="page"/>
-      </w:r>
-    </w:p>
-    <w:p>
-      <w:pPr>
-        <w:pStyle w:val="Titolo1"/>
-        <w:keepNext/>
-        <w:spacing w:before="320" w:after="160"/>
-      </w:pPr>
-      <w:bookmarkStart w:id="15" w:name="_Toc241332076"/>
-      <w:r>
-        <w:rPr>
-          <w:b/>
-          <w:bCs/>
-          <w:color w:val="1F4E79"/>
-          <w:sz w:val="30"/>
-          <w:szCs w:val="30"/>
-        </w:rPr>
-        <w:lastRenderedPageBreak/>
-        <w:t>5. Sicurezza</w:t>
-      </w:r>
-      <w:bookmarkEnd w:id="15"/>
-    </w:p>
-    <w:p>
-      <w:pPr>
-        <w:spacing w:after="120" w:line="276" w:lineRule="auto"/>
-        <w:jc w:val="both"/>
-      </w:pPr>
-      <w:r>
-        <w:t xml:space="preserve">L'accesso agli endpoint è protetto tramite </w:t>
-      </w:r>
-      <w:r>
-        <w:rPr>
-          <w:b/>
-          <w:bCs/>
-        </w:rPr>
-        <w:t>Spring Security</w:t>
-      </w:r>
-      <w:r>
-        <w:t xml:space="preserve"> con autenticazione </w:t>
-      </w:r>
-      <w:r>
-        <w:rPr>
-          <w:b/>
-          <w:bCs/>
-        </w:rPr>
-        <w:t>stateless basata su JWT</w:t>
-      </w:r>
-      <w:r>
-        <w:t xml:space="preserve">. Il server non mantiene alcuna sessione: ogni richiesta trasporta il proprio token nell'header </w:t>
-      </w:r>
-      <w:r>
-        <w:rPr>
-          <w:rFonts w:ascii="Consolas" w:eastAsia="Consolas" w:hAnsi="Consolas" w:cs="Consolas"/>
-          <w:color w:val="C0392B"/>
-          <w:sz w:val="20"/>
-          <w:szCs w:val="20"/>
-        </w:rPr>
-        <w:t>Authorization</w:t>
-      </w:r>
-      <w:r>
-        <w:rPr>
-          <w:rFonts w:ascii="Consolas" w:eastAsia="Consolas" w:hAnsi="Consolas" w:cs="Consolas"/>
-          <w:color w:val="C0392B"/>
-          <w:sz w:val="20"/>
-          <w:szCs w:val="20"/>
-        </w:rPr>
-        <w:t>: Bearer &lt;token&gt;</w:t>
-      </w:r>
-      <w:r>
-        <w:t>.</w:t>
-      </w:r>
-    </w:p>
-    <w:p>
-      <w:pPr>
-        <w:spacing w:after="120" w:line="276" w:lineRule="auto"/>
-        <w:jc w:val="both"/>
-      </w:pPr>
-      <w:r>
-        <w:t xml:space="preserve">Il flusso: al login, verificate le credenziali, il </w:t>
-      </w:r>
-      <w:r>
-        <w:rPr>
-          <w:rFonts w:ascii="Consolas" w:eastAsia="Consolas" w:hAnsi="Consolas" w:cs="Consolas"/>
-          <w:color w:val="C0392B"/>
-          <w:sz w:val="20"/>
-          <w:szCs w:val="20"/>
-        </w:rPr>
-        <w:t>JwtService</w:t>
-      </w:r>
-      <w:r>
-        <w:t xml:space="preserve"> genera un token firmato con algoritmo HS256 contenente lo username e la scadenza. A ogni richiesta successiva il </w:t>
-      </w:r>
-      <w:r>
-        <w:rPr>
-          <w:rFonts w:ascii="Consolas" w:eastAsia="Consolas" w:hAnsi="Consolas" w:cs="Consolas"/>
-          <w:color w:val="C0392B"/>
-          <w:sz w:val="20"/>
-          <w:szCs w:val="20"/>
-        </w:rPr>
-        <w:t>JwtAuthFilter</w:t>
-      </w:r>
-      <w:r>
-        <w:t xml:space="preserve"> — un filtro che si esegue una volta per richiesta — estrae e valida il token, e in caso positivo popola il </w:t>
-      </w:r>
-      <w:r>
-        <w:rPr>
-          <w:rFonts w:ascii="Consolas" w:eastAsia="Consolas" w:hAnsi="Consolas" w:cs="Consolas"/>
-          <w:color w:val="C0392B"/>
-          <w:sz w:val="20"/>
-          <w:szCs w:val="20"/>
-        </w:rPr>
-        <w:t>SecurityContext</w:t>
-      </w:r>
-      <w:r>
-        <w:t xml:space="preserve"> con l'utente autenticato e i suoi ruoli.</w:t>
-      </w:r>
-    </w:p>
-    <w:p>
-      <w:pPr>
-        <w:spacing w:after="120" w:line="276" w:lineRule="auto"/>
-        <w:jc w:val="both"/>
-      </w:pPr>
-      <w:r>
-        <w:t xml:space="preserve">La protezione opera su </w:t>
-      </w:r>
-      <w:r>
-        <w:rPr>
-          <w:b/>
-          <w:bCs/>
-        </w:rPr>
-        <w:t>quattro livelli di accesso</w:t>
-      </w:r>
-      <w:r>
-        <w:t>:</w:t>
+        <w:t>ADMIN</w:t>
+      </w:r>
+      <w:r>
+        <w:t xml:space="preserve"> può diventare co-organizzatore di un torneo.</w:t>
       </w:r>
     </w:p>
     <w:p>
@@ -5478,14 +5343,19 @@
         <w:spacing w:after="80" w:line="264" w:lineRule="auto"/>
       </w:pPr>
       <w:r>
-        <w:rPr>
-          <w:b/>
-          <w:bCs/>
-        </w:rPr>
-        <w:t>pubblico</w:t>
-      </w:r>
-      <w:r>
-        <w:t xml:space="preserve"> — registrazione e login, accessibili senza token;</w:t>
+        <w:t xml:space="preserve">Non è possibile declassare l'ultimo </w:t>
+      </w:r>
+      <w:r>
+        <w:rPr>
+          <w:rFonts w:ascii="Consolas" w:eastAsia="Consolas" w:hAnsi="Consolas" w:cs="Consolas"/>
+          <w:color w:val="C0392B"/>
+          <w:sz w:val="20"/>
+          <w:szCs w:val="20"/>
+        </w:rPr>
+        <w:t>ADMIN</w:t>
+      </w:r>
+      <w:r>
+        <w:t xml:space="preserve"> rimasto nel sistema.</w:t>
       </w:r>
     </w:p>
     <w:p>
@@ -5498,14 +5368,395 @@
         <w:spacing w:after="80" w:line="264" w:lineRule="auto"/>
       </w:pPr>
       <w:r>
+        <w:t>Un utente può modificare solo il proprio profilo; un ADMIN qualsiasi profilo.</w:t>
+      </w:r>
+    </w:p>
+    <w:p>
+      <w:pPr>
+        <w:spacing w:after="120" w:line="276" w:lineRule="auto"/>
+        <w:jc w:val="both"/>
+      </w:pPr>
+      <w:r>
+        <w:t xml:space="preserve">Nel loro insieme queste regole descrivono il ciclo di vita di un torneo: </w:t>
+      </w:r>
+      <w:r>
+        <w:rPr>
+          <w:rFonts w:ascii="Consolas" w:hAnsi="Consolas"/>
+          <w:color w:val="C0392B"/>
+          <w:sz w:val="20"/>
+        </w:rPr>
+        <w:t>DRAFT</w:t>
+      </w:r>
+      <w:r>
+        <w:t xml:space="preserve"> (iscrizioni aperte), </w:t>
+      </w:r>
+      <w:r>
+        <w:rPr>
+          <w:rFonts w:ascii="Consolas" w:hAnsi="Consolas"/>
+          <w:color w:val="C0392B"/>
+          <w:sz w:val="20"/>
+        </w:rPr>
+        <w:t>ACTIVE</w:t>
+      </w:r>
+      <w:r>
+        <w:t xml:space="preserve"> (calendario generato, risultati in corso) e </w:t>
+      </w:r>
+      <w:r>
+        <w:rPr>
+          <w:rFonts w:ascii="Consolas" w:hAnsi="Consolas"/>
+          <w:color w:val="C0392B"/>
+          <w:sz w:val="20"/>
+        </w:rPr>
+        <w:t>COMPLETED</w:t>
+      </w:r>
+      <w:r>
+        <w:t xml:space="preserve"> (torneo chiuso, dati consolidati). Ogni violazione produce una risposta </w:t>
+      </w:r>
+      <w:r>
+        <w:rPr>
+          <w:rFonts w:ascii="Consolas" w:hAnsi="Consolas"/>
+          <w:color w:val="C0392B"/>
+          <w:sz w:val="20"/>
+        </w:rPr>
+        <w:t>409 Conflict</w:t>
+      </w:r>
+      <w:r>
+        <w:t xml:space="preserve"> con un messaggio esplicito.</w:t>
+      </w:r>
+    </w:p>
+    <w:p>
+      <w:r>
+        <w:br w:type="page"/>
+      </w:r>
+    </w:p>
+    <w:p>
+      <w:pPr>
+        <w:pStyle w:val="Titolo1"/>
+        <w:keepNext/>
+        <w:spacing w:before="320" w:after="160"/>
+      </w:pPr>
+      <w:bookmarkStart w:id="15" w:name="_Toc241397559"/>
+      <w:r>
         <w:rPr>
           <w:b/>
           <w:bCs/>
-        </w:rPr>
-        <w:t>autenticato</w:t>
-      </w:r>
-      <w:r>
-        <w:t xml:space="preserve"> — la maggior parte delle letture, accessibili a qualunque utente con token valido;</w:t>
+          <w:color w:val="1F4E79"/>
+          <w:sz w:val="30"/>
+          <w:szCs w:val="30"/>
+        </w:rPr>
+        <w:lastRenderedPageBreak/>
+        <w:t>5. Sicurezza</w:t>
+      </w:r>
+      <w:bookmarkEnd w:id="15"/>
+    </w:p>
+    <w:p>
+      <w:pPr>
+        <w:spacing w:after="120" w:line="276" w:lineRule="auto"/>
+        <w:jc w:val="both"/>
+      </w:pPr>
+      <w:r>
+        <w:t xml:space="preserve">L'autenticazione è realizzata con </w:t>
+      </w:r>
+      <w:r>
+        <w:rPr>
+          <w:b/>
+        </w:rPr>
+        <w:t>Spring Security</w:t>
+      </w:r>
+      <w:r>
+        <w:t xml:space="preserve"> e </w:t>
+      </w:r>
+      <w:r>
+        <w:rPr>
+          <w:b/>
+        </w:rPr>
+        <w:t>Spring Authorization Server</w:t>
+      </w:r>
+      <w:r>
+        <w:t xml:space="preserve">, il modulo ufficiale di Spring per emettere e gestire token OAuth2. Al login, verificate le credenziali, il server emette due token: un </w:t>
+      </w:r>
+      <w:r>
+        <w:rPr>
+          <w:b/>
+        </w:rPr>
+        <w:t>access token opaco</w:t>
+      </w:r>
+      <w:r>
+        <w:t xml:space="preserve"> — una stringa casuale che non contiene alcun dato — valido 15 minuti, e un </w:t>
+      </w:r>
+      <w:r>
+        <w:rPr>
+          <w:b/>
+        </w:rPr>
+        <w:t>refresh token</w:t>
+      </w:r>
+      <w:r>
+        <w:t xml:space="preserve"> valido 7 giorni. Il client invia l'access token in ogni richiesta, nell'header </w:t>
+      </w:r>
+      <w:r>
+        <w:rPr>
+          <w:rFonts w:ascii="Consolas" w:hAnsi="Consolas"/>
+          <w:color w:val="C0392B"/>
+          <w:sz w:val="20"/>
+        </w:rPr>
+        <w:t>Authorization: Bearer &lt;token&gt;</w:t>
+      </w:r>
+      <w:r>
+        <w:t>; quando scade, lo rinnova con il refresh token senza dover ripetere il login.</w:t>
+      </w:r>
+    </w:p>
+    <w:p>
+      <w:pPr>
+        <w:spacing w:after="120" w:line="276" w:lineRule="auto"/>
+        <w:jc w:val="both"/>
+      </w:pPr>
+      <w:r>
+        <w:t xml:space="preserve">Le durate e la politica di rinnovo sono definite nelle </w:t>
+      </w:r>
+      <w:r>
+        <w:rPr>
+          <w:rFonts w:ascii="Consolas" w:hAnsi="Consolas"/>
+          <w:color w:val="C0392B"/>
+          <w:sz w:val="20"/>
+        </w:rPr>
+        <w:t>TokenSettings</w:t>
+      </w:r>
+      <w:r>
+        <w:t xml:space="preserve"> del client registrato (</w:t>
+      </w:r>
+      <w:r>
+        <w:rPr>
+          <w:rFonts w:ascii="Consolas" w:hAnsi="Consolas"/>
+          <w:color w:val="C0392B"/>
+          <w:sz w:val="20"/>
+        </w:rPr>
+        <w:t>RegisteredClient</w:t>
+      </w:r>
+      <w:r>
+        <w:t xml:space="preserve">) e sono configurabili da variabili d'ambiente. La </w:t>
+      </w:r>
+      <w:r>
+        <w:rPr>
+          <w:b/>
+        </w:rPr>
+        <w:t>rotazione dei refresh token</w:t>
+      </w:r>
+      <w:r>
+        <w:t xml:space="preserve"> è attiva: ogni rinnovo emette una nuova coppia e invalida la precedente, per cui un refresh token già usato non ha più alcun valore, anche se intercettato. I token sono generati dai componenti dell'Authorization Server, </w:t>
+      </w:r>
+      <w:r>
+        <w:rPr>
+          <w:rFonts w:ascii="Consolas" w:hAnsi="Consolas"/>
+          <w:color w:val="C0392B"/>
+          <w:sz w:val="20"/>
+        </w:rPr>
+        <w:t>OAuth2AccessTokenGenerator</w:t>
+      </w:r>
+      <w:r>
+        <w:t xml:space="preserve"> e </w:t>
+      </w:r>
+      <w:r>
+        <w:rPr>
+          <w:rFonts w:ascii="Consolas" w:hAnsi="Consolas"/>
+          <w:color w:val="C0392B"/>
+          <w:sz w:val="20"/>
+        </w:rPr>
+        <w:t>OAuth2RefreshTokenGenerator</w:t>
+      </w:r>
+      <w:r>
+        <w:t>.</w:t>
+      </w:r>
+    </w:p>
+    <w:p>
+      <w:pPr>
+        <w:spacing w:after="120" w:line="276" w:lineRule="auto"/>
+        <w:jc w:val="both"/>
+      </w:pPr>
+      <w:r>
+        <w:t xml:space="preserve">Sul modello di </w:t>
+      </w:r>
+      <w:r>
+        <w:rPr>
+          <w:b/>
+        </w:rPr>
+        <w:t>Django Knox</w:t>
+      </w:r>
+      <w:r>
+        <w:t xml:space="preserve">, nel database non viene mai salvato un token in chiaro. Il componente </w:t>
+      </w:r>
+      <w:r>
+        <w:rPr>
+          <w:rFonts w:ascii="Consolas" w:hAnsi="Consolas"/>
+          <w:color w:val="C0392B"/>
+          <w:sz w:val="20"/>
+        </w:rPr>
+        <w:t>HashedOAuth2AuthorizationService</w:t>
+      </w:r>
+      <w:r>
+        <w:t xml:space="preserve"> implementa l'interfaccia </w:t>
+      </w:r>
+      <w:r>
+        <w:rPr>
+          <w:rFonts w:ascii="Consolas" w:hAnsi="Consolas"/>
+          <w:color w:val="C0392B"/>
+          <w:sz w:val="20"/>
+        </w:rPr>
+        <w:t>OAuth2AuthorizationService</w:t>
+      </w:r>
+      <w:r>
+        <w:t xml:space="preserve"> dell'Authorization Server e scrive nella tabella </w:t>
+      </w:r>
+      <w:r>
+        <w:rPr>
+          <w:rFonts w:ascii="Consolas" w:hAnsi="Consolas"/>
+          <w:color w:val="C0392B"/>
+          <w:sz w:val="20"/>
+        </w:rPr>
+        <w:t>oauth2_authorizations</w:t>
+      </w:r>
+      <w:r>
+        <w:t xml:space="preserve"> solo l'</w:t>
+      </w:r>
+      <w:r>
+        <w:rPr>
+          <w:b/>
+        </w:rPr>
+        <w:t>hash SHA-512</w:t>
+      </w:r>
+      <w:r>
+        <w:t xml:space="preserve"> di ciascun token; la ricerca avviene calcolando l'hash del token ricevuto. Chi ottenesse una copia del database non potrebbe quindi usare alcun token. Poiché lo stato è conservato sul server, la </w:t>
+      </w:r>
+      <w:r>
+        <w:rPr>
+          <w:b/>
+        </w:rPr>
+        <w:t>revoca è immediata</w:t>
+      </w:r>
+      <w:r>
+        <w:t xml:space="preserve">: il </w:t>
+      </w:r>
+      <w:r>
+        <w:rPr>
+          <w:rFonts w:ascii="Consolas" w:hAnsi="Consolas"/>
+          <w:color w:val="C0392B"/>
+          <w:sz w:val="20"/>
+        </w:rPr>
+        <w:t>logout</w:t>
+      </w:r>
+      <w:r>
+        <w:t xml:space="preserve"> elimina la sessione corrente e il </w:t>
+      </w:r>
+      <w:r>
+        <w:rPr>
+          <w:rFonts w:ascii="Consolas" w:hAnsi="Consolas"/>
+          <w:color w:val="C0392B"/>
+          <w:sz w:val="20"/>
+        </w:rPr>
+        <w:t>logout-all</w:t>
+      </w:r>
+      <w:r>
+        <w:t xml:space="preserve"> tutte le sessioni dell'utente, su ogni dispositivo. Un task programmato (</w:t>
+      </w:r>
+      <w:r>
+        <w:rPr>
+          <w:rFonts w:ascii="Consolas" w:hAnsi="Consolas"/>
+          <w:color w:val="C0392B"/>
+          <w:sz w:val="20"/>
+        </w:rPr>
+        <w:t>ExpiredTokenCleanup</w:t>
+      </w:r>
+      <w:r>
+        <w:t>) elimina ogni ora le autorizzazioni scadute.</w:t>
+      </w:r>
+    </w:p>
+    <w:p>
+      <w:pPr>
+        <w:spacing w:after="120" w:line="276" w:lineRule="auto"/>
+        <w:jc w:val="both"/>
+      </w:pPr>
+      <w:r>
+        <w:t xml:space="preserve">Il backend svolge anche il ruolo di </w:t>
+      </w:r>
+      <w:r>
+        <w:rPr>
+          <w:b/>
+        </w:rPr>
+        <w:t>Resource Server</w:t>
+      </w:r>
+      <w:r>
+        <w:t xml:space="preserve">: il filtro standard di Spring Security estrae il token dall'header e lo passa a </w:t>
+      </w:r>
+      <w:r>
+        <w:rPr>
+          <w:rFonts w:ascii="Consolas" w:hAnsi="Consolas"/>
+          <w:color w:val="C0392B"/>
+          <w:sz w:val="20"/>
+        </w:rPr>
+        <w:t>StoredTokenIntrospector</w:t>
+      </w:r>
+      <w:r>
+        <w:t>, che lo verifica leggendo direttamente il database, senza chiamate HTTP, controlla che non sia scaduto e che l'utente esista ancora, e popola il SecurityContext con l'utente autenticato e i suoi ruoli.</w:t>
+      </w:r>
+    </w:p>
+    <w:p>
+      <w:pPr>
+        <w:spacing w:after="120" w:line="276" w:lineRule="auto"/>
+        <w:jc w:val="both"/>
+      </w:pPr>
+      <w:r>
+        <w:t>Il login e il rinnovo sono esposti come endpoint dell'API (</w:t>
+      </w:r>
+      <w:r>
+        <w:rPr>
+          <w:rFonts w:ascii="Consolas" w:hAnsi="Consolas"/>
+          <w:color w:val="C0392B"/>
+          <w:sz w:val="20"/>
+        </w:rPr>
+        <w:t>/api/auth/login</w:t>
+      </w:r>
+      <w:r>
+        <w:t xml:space="preserve"> e </w:t>
+      </w:r>
+      <w:r>
+        <w:rPr>
+          <w:rFonts w:ascii="Consolas" w:hAnsi="Consolas"/>
+          <w:color w:val="C0392B"/>
+          <w:sz w:val="20"/>
+        </w:rPr>
+        <w:t>/api/auth/refresh</w:t>
+      </w:r>
+      <w:r>
+        <w:t xml:space="preserve">) invece che tramite l'endpoint standard </w:t>
+      </w:r>
+      <w:r>
+        <w:rPr>
+          <w:rFonts w:ascii="Consolas" w:hAnsi="Consolas"/>
+          <w:color w:val="C0392B"/>
+          <w:sz w:val="20"/>
+        </w:rPr>
+        <w:t>/oauth2/token</w:t>
+      </w:r>
+      <w:r>
+        <w:t xml:space="preserve"> dell'Authorization Server. L'endpoint standard richiede infatti l'autenticazione del client con un segreto, che un'applicazione web eseguita nel browser non può custodire; la soluzione adottata usa comunque il modello dei token, i generatori e le impostazioni dell'Authorization Server, e mantiene semplice l'integrazione con il frontend.</w:t>
+      </w:r>
+    </w:p>
+    <w:p>
+      <w:pPr>
+        <w:spacing w:after="120" w:line="276" w:lineRule="auto"/>
+        <w:jc w:val="both"/>
+      </w:pPr>
+      <w:r>
+        <w:t xml:space="preserve">La protezione opera su </w:t>
+      </w:r>
+      <w:r>
+        <w:rPr>
+          <w:b/>
+          <w:bCs/>
+        </w:rPr>
+        <w:t>quattro livelli di accesso</w:t>
+      </w:r>
+      <w:r>
+        <w:t>:</w:t>
       </w:r>
     </w:p>
     <w:p>
@@ -5520,24 +5771,11 @@
       <w:r>
         <w:rPr>
           <w:b/>
-          <w:bCs/>
-        </w:rPr>
-        <w:t>basato su ruolo</w:t>
-      </w:r>
-      <w:r>
-        <w:t xml:space="preserve"> — operazioni sensibili riservate a ADMIN o ORGANIZER tramite l'annotazione </w:t>
-      </w:r>
-      <w:r>
-        <w:rPr>
-          <w:rFonts w:ascii="Consolas" w:eastAsia="Consolas" w:hAnsi="Consolas" w:cs="Consolas"/>
-          <w:color w:val="C0392B"/>
-          <w:sz w:val="20"/>
-          <w:szCs w:val="20"/>
-        </w:rPr>
-        <w:t>@PreAuthorize</w:t>
-      </w:r>
-      <w:r>
-        <w:t>.</w:t>
+        </w:rPr>
+        <w:t>pubblico</w:t>
+      </w:r>
+      <w:r>
+        <w:t xml:space="preserve"> — registrazione, login e rinnovo del token, accessibili senza access token;</w:t>
       </w:r>
     </w:p>
     <w:p>
@@ -5552,6 +5790,58 @@
       <w:r>
         <w:rPr>
           <w:b/>
+          <w:bCs/>
+        </w:rPr>
+        <w:t>autenticato</w:t>
+      </w:r>
+      <w:r>
+        <w:t xml:space="preserve"> — la maggior parte delle letture, accessibili a qualunque utente con token valido;</w:t>
+      </w:r>
+    </w:p>
+    <w:p>
+      <w:pPr>
+        <w:pStyle w:val="Paragrafoelenco"/>
+        <w:numPr>
+          <w:ilvl w:val="0"/>
+          <w:numId w:val="1"/>
+        </w:numPr>
+        <w:spacing w:after="80" w:line="264" w:lineRule="auto"/>
+      </w:pPr>
+      <w:r>
+        <w:rPr>
+          <w:b/>
+          <w:bCs/>
+        </w:rPr>
+        <w:t>basato su ruolo</w:t>
+      </w:r>
+      <w:r>
+        <w:t xml:space="preserve"> — operazioni sensibili riservate a ADMIN o ORGANIZER tramite l'annotazione </w:t>
+      </w:r>
+      <w:r>
+        <w:rPr>
+          <w:rFonts w:ascii="Consolas" w:eastAsia="Consolas" w:hAnsi="Consolas" w:cs="Consolas"/>
+          <w:color w:val="C0392B"/>
+          <w:sz w:val="20"/>
+          <w:szCs w:val="20"/>
+        </w:rPr>
+        <w:t>@PreAuthorize</w:t>
+      </w:r>
+      <w:r>
+        <w:t>.</w:t>
+      </w:r>
+    </w:p>
+    <w:p>
+      <w:pPr>
+        <w:pStyle w:val="Paragrafoelenco"/>
+        <w:numPr>
+          <w:ilvl w:val="0"/>
+          <w:numId w:val="1"/>
+        </w:numPr>
+        <w:spacing w:after="80" w:line="264" w:lineRule="auto"/>
+      </w:pPr>
+      <w:r>
+        <w:rPr>
+          <w:b/>
         </w:rPr>
         <w:t>basato sulla risorsa</w:t>
       </w:r>
@@ -5625,7 +5915,11 @@
         <w:t>ORGANIZER</w:t>
       </w:r>
       <w:r>
-        <w:t xml:space="preserve"> che figuri tra gli organizzatori di quel torneo. La verifica è affidata al componente </w:t>
+        <w:t xml:space="preserve"> che figuri tra gli organizzatori di quel torneo. La verifica è affidata al </w:t>
+      </w:r>
+      <w:r>
+        <w:lastRenderedPageBreak/>
+        <w:t xml:space="preserve">componente </w:t>
       </w:r>
       <w:r>
         <w:rPr>
@@ -5830,22 +6124,16 @@
         <w:jc w:val="both"/>
       </w:pPr>
       <w:r>
-        <w:t xml:space="preserve">La chiave di firma dei token non compare mai nel codice né nella configurazione versionata: viene letta dalla variabile d'ambiente </w:t>
-      </w:r>
-      <w:r>
-        <w:rPr>
-          <w:rFonts w:ascii="Consolas" w:hAnsi="Consolas"/>
-          <w:color w:val="C0392B"/>
-          <w:sz w:val="20"/>
-        </w:rPr>
-        <w:t>JWT_SECRET</w:t>
-      </w:r>
-      <w:r>
-        <w:t xml:space="preserve"> e, se manca o è più corta dei 256 bit richiesti da HS256, </w:t>
-      </w:r>
-      <w:r>
-        <w:lastRenderedPageBreak/>
-        <w:t>l'applicazione si rifiuta di partire. Infine il parametro di ordinamento delle liste paginate accetta solo un elenco esplicito di campi: senza questo controllo un client potrebbe ordinare per proprietà non esposte, come la password degli organizzatori, e dedurne informazioni dall'ordine dei risultati.</w:t>
+        <w:t xml:space="preserve">Il parametro di ordinamento delle liste paginate accetta solo un elenco esplicito di campi: senza questo controllo un client potrebbe ordinare per proprietà non esposte, come la password degli organizzatori, e dedurne informazioni dall'ordine dei risultati. Infine il </w:t>
+      </w:r>
+      <w:r>
+        <w:rPr>
+          <w:b/>
+        </w:rPr>
+        <w:t>CORS</w:t>
+      </w:r>
+      <w:r>
+        <w:t xml:space="preserve"> consente le chiamate dal browser solo alle origini del frontend configurate.</w:t>
       </w:r>
     </w:p>
     <w:p>
@@ -5854,7 +6142,7 @@
         <w:keepNext/>
         <w:spacing w:before="320" w:after="160"/>
       </w:pPr>
-      <w:bookmarkStart w:id="16" w:name="_Toc241332077"/>
+      <w:bookmarkStart w:id="16" w:name="_Toc241397560"/>
       <w:r>
         <w:rPr>
           <w:b/>
@@ -5916,7 +6204,7 @@
         </w:trPr>
         <w:tc>
           <w:tcPr>
-            <w:tcW w:w="3200" w:type="dxa"/>
+            <w:tcW w:w="3389" w:type="dxa"/>
             <w:tcBorders>
               <w:bottom w:val="single" w:sz="2" w:space="0" w:color="D9D9D9"/>
             </w:tcBorders>
@@ -5943,7 +6231,7 @@
         </w:tc>
         <w:tc>
           <w:tcPr>
-            <w:tcW w:w="1500" w:type="dxa"/>
+            <w:tcW w:w="1465" w:type="dxa"/>
             <w:tcBorders>
               <w:bottom w:val="single" w:sz="2" w:space="0" w:color="D9D9D9"/>
             </w:tcBorders>
@@ -5970,7 +6258,7 @@
         </w:tc>
         <w:tc>
           <w:tcPr>
-            <w:tcW w:w="4660" w:type="dxa"/>
+            <w:tcW w:w="4506" w:type="dxa"/>
             <w:tcBorders>
               <w:bottom w:val="single" w:sz="2" w:space="0" w:color="D9D9D9"/>
             </w:tcBorders>
@@ -5999,7 +6287,7 @@
       <w:tr>
         <w:tc>
           <w:tcPr>
-            <w:tcW w:w="3200" w:type="dxa"/>
+            <w:tcW w:w="3389" w:type="dxa"/>
             <w:tcBorders>
               <w:top w:val="single" w:sz="2" w:space="0" w:color="D9D9D9"/>
               <w:bottom w:val="single" w:sz="2" w:space="0" w:color="D9D9D9"/>
@@ -6024,7 +6312,7 @@
         </w:tc>
         <w:tc>
           <w:tcPr>
-            <w:tcW w:w="1500" w:type="dxa"/>
+            <w:tcW w:w="1465" w:type="dxa"/>
             <w:tcBorders>
               <w:top w:val="single" w:sz="2" w:space="0" w:color="D9D9D9"/>
               <w:bottom w:val="single" w:sz="2" w:space="0" w:color="D9D9D9"/>
@@ -6048,7 +6336,7 @@
         </w:tc>
         <w:tc>
           <w:tcPr>
-            <w:tcW w:w="4660" w:type="dxa"/>
+            <w:tcW w:w="4506" w:type="dxa"/>
             <w:tcBorders>
               <w:top w:val="single" w:sz="2" w:space="0" w:color="D9D9D9"/>
               <w:bottom w:val="single" w:sz="2" w:space="0" w:color="D9D9D9"/>
@@ -6074,7 +6362,7 @@
       <w:tr>
         <w:tc>
           <w:tcPr>
-            <w:tcW w:w="3200" w:type="dxa"/>
+            <w:tcW w:w="3389" w:type="dxa"/>
             <w:tcBorders>
               <w:top w:val="single" w:sz="2" w:space="0" w:color="D9D9D9"/>
               <w:bottom w:val="single" w:sz="2" w:space="0" w:color="D9D9D9"/>
@@ -6107,7 +6395,7 @@
         </w:tc>
         <w:tc>
           <w:tcPr>
-            <w:tcW w:w="1500" w:type="dxa"/>
+            <w:tcW w:w="1465" w:type="dxa"/>
             <w:tcBorders>
               <w:top w:val="single" w:sz="2" w:space="0" w:color="D9D9D9"/>
               <w:bottom w:val="single" w:sz="2" w:space="0" w:color="D9D9D9"/>
@@ -6138,7 +6426,7 @@
         </w:tc>
         <w:tc>
           <w:tcPr>
-            <w:tcW w:w="4660" w:type="dxa"/>
+            <w:tcW w:w="4506" w:type="dxa"/>
             <w:tcBorders>
               <w:top w:val="single" w:sz="2" w:space="0" w:color="D9D9D9"/>
               <w:bottom w:val="single" w:sz="2" w:space="0" w:color="D9D9D9"/>
@@ -6171,7 +6459,7 @@
       <w:tr>
         <w:tc>
           <w:tcPr>
-            <w:tcW w:w="3200" w:type="dxa"/>
+            <w:tcW w:w="3389" w:type="dxa"/>
             <w:tcBorders>
               <w:top w:val="single" w:sz="2" w:space="0" w:color="D9D9D9"/>
               <w:bottom w:val="single" w:sz="2" w:space="0" w:color="D9D9D9"/>
@@ -6196,7 +6484,7 @@
         </w:tc>
         <w:tc>
           <w:tcPr>
-            <w:tcW w:w="1500" w:type="dxa"/>
+            <w:tcW w:w="1465" w:type="dxa"/>
             <w:tcBorders>
               <w:top w:val="single" w:sz="2" w:space="0" w:color="D9D9D9"/>
               <w:bottom w:val="single" w:sz="2" w:space="0" w:color="D9D9D9"/>
@@ -6220,7 +6508,7 @@
         </w:tc>
         <w:tc>
           <w:tcPr>
-            <w:tcW w:w="4660" w:type="dxa"/>
+            <w:tcW w:w="4506" w:type="dxa"/>
             <w:tcBorders>
               <w:top w:val="single" w:sz="2" w:space="0" w:color="D9D9D9"/>
               <w:bottom w:val="single" w:sz="2" w:space="0" w:color="D9D9D9"/>
@@ -6246,7 +6534,7 @@
       <w:tr>
         <w:tc>
           <w:tcPr>
-            <w:tcW w:w="3200" w:type="dxa"/>
+            <w:tcW w:w="3389" w:type="dxa"/>
             <w:tcBorders>
               <w:top w:val="single" w:sz="2" w:space="0" w:color="D9D9D9"/>
               <w:bottom w:val="single" w:sz="2" w:space="0" w:color="D9D9D9"/>
@@ -6260,19 +6548,26 @@
             </w:tcMar>
           </w:tcPr>
           <w:p>
-            <w:r>
+            <w:pPr>
               <w:rPr>
                 <w:rFonts w:ascii="Consolas" w:eastAsia="Consolas" w:hAnsi="Consolas" w:cs="Consolas"/>
                 <w:sz w:val="20"/>
                 <w:szCs w:val="20"/>
               </w:rPr>
-              <w:t>AccessDeniedException</w:t>
-            </w:r>
-          </w:p>
-        </w:tc>
-        <w:tc>
-          <w:tcPr>
-            <w:tcW w:w="1500" w:type="dxa"/>
+            </w:pPr>
+            <w:r>
+              <w:rPr>
+                <w:rFonts w:ascii="Consolas" w:eastAsia="Consolas" w:hAnsi="Consolas" w:cs="Consolas"/>
+                <w:sz w:val="20"/>
+                <w:szCs w:val="20"/>
+              </w:rPr>
+              <w:t>InvalidTokenException</w:t>
+            </w:r>
+          </w:p>
+        </w:tc>
+        <w:tc>
+          <w:tcPr>
+            <w:tcW w:w="1465" w:type="dxa"/>
             <w:tcBorders>
               <w:top w:val="single" w:sz="2" w:space="0" w:color="D9D9D9"/>
               <w:bottom w:val="single" w:sz="2" w:space="0" w:color="D9D9D9"/>
@@ -6286,18 +6581,24 @@
             </w:tcMar>
           </w:tcPr>
           <w:p>
-            <w:r>
-              <w:rPr>
-                <w:sz w:val="20"/>
-                <w:szCs w:val="20"/>
-              </w:rPr>
-              <w:t>403</w:t>
-            </w:r>
-          </w:p>
-        </w:tc>
-        <w:tc>
-          <w:tcPr>
-            <w:tcW w:w="4660" w:type="dxa"/>
+            <w:pPr>
+              <w:rPr>
+                <w:sz w:val="20"/>
+                <w:szCs w:val="20"/>
+              </w:rPr>
+            </w:pPr>
+            <w:r>
+              <w:rPr>
+                <w:sz w:val="20"/>
+                <w:szCs w:val="20"/>
+              </w:rPr>
+              <w:t>401</w:t>
+            </w:r>
+          </w:p>
+        </w:tc>
+        <w:tc>
+          <w:tcPr>
+            <w:tcW w:w="4506" w:type="dxa"/>
             <w:tcBorders>
               <w:top w:val="single" w:sz="2" w:space="0" w:color="D9D9D9"/>
               <w:bottom w:val="single" w:sz="2" w:space="0" w:color="D9D9D9"/>
@@ -6311,12 +6612,18 @@
             </w:tcMar>
           </w:tcPr>
           <w:p>
-            <w:r>
-              <w:rPr>
-                <w:sz w:val="20"/>
-                <w:szCs w:val="20"/>
-              </w:rPr>
-              <w:t>Permessi insufficienti per la risorsa</w:t>
+            <w:pPr>
+              <w:rPr>
+                <w:sz w:val="20"/>
+                <w:szCs w:val="20"/>
+              </w:rPr>
+            </w:pPr>
+            <w:r>
+              <w:rPr>
+                <w:sz w:val="20"/>
+                <w:szCs w:val="20"/>
+              </w:rPr>
+              <w:t>Refresh token sconosciuto, scaduto o già usato</w:t>
             </w:r>
           </w:p>
         </w:tc>
@@ -6324,7 +6631,7 @@
       <w:tr>
         <w:tc>
           <w:tcPr>
-            <w:tcW w:w="3200" w:type="dxa"/>
+            <w:tcW w:w="3389" w:type="dxa"/>
             <w:tcBorders>
               <w:top w:val="single" w:sz="2" w:space="0" w:color="D9D9D9"/>
               <w:bottom w:val="single" w:sz="2" w:space="0" w:color="D9D9D9"/>
@@ -6343,55 +6650,55 @@
                 <w:sz w:val="20"/>
                 <w:szCs w:val="20"/>
               </w:rPr>
-              <w:t>ResourceNotFound</w:t>
-            </w:r>
-          </w:p>
-        </w:tc>
-        <w:tc>
-          <w:tcPr>
-            <w:tcW w:w="1500" w:type="dxa"/>
-            <w:tcBorders>
-              <w:top w:val="single" w:sz="2" w:space="0" w:color="D9D9D9"/>
-              <w:bottom w:val="single" w:sz="2" w:space="0" w:color="D9D9D9"/>
-            </w:tcBorders>
-            <w:tcMar>
-              <w:top w:w="60" w:type="dxa"/>
-              <w:left w:w="100" w:type="dxa"/>
-              <w:bottom w:w="60" w:type="dxa"/>
-              <w:right w:w="100" w:type="dxa"/>
-            </w:tcMar>
-          </w:tcPr>
-          <w:p>
-            <w:r>
-              <w:rPr>
-                <w:sz w:val="20"/>
-                <w:szCs w:val="20"/>
-              </w:rPr>
-              <w:t>404</w:t>
-            </w:r>
-          </w:p>
-        </w:tc>
-        <w:tc>
-          <w:tcPr>
-            <w:tcW w:w="4660" w:type="dxa"/>
-            <w:tcBorders>
-              <w:top w:val="single" w:sz="2" w:space="0" w:color="D9D9D9"/>
-              <w:bottom w:val="single" w:sz="2" w:space="0" w:color="D9D9D9"/>
-            </w:tcBorders>
-            <w:tcMar>
-              <w:top w:w="60" w:type="dxa"/>
-              <w:left w:w="100" w:type="dxa"/>
-              <w:bottom w:w="60" w:type="dxa"/>
-              <w:right w:w="100" w:type="dxa"/>
-            </w:tcMar>
-          </w:tcPr>
-          <w:p>
-            <w:r>
-              <w:rPr>
-                <w:sz w:val="20"/>
-                <w:szCs w:val="20"/>
-              </w:rPr>
-              <w:t>Risorsa inesistente</w:t>
+              <w:t>AccessDeniedException</w:t>
+            </w:r>
+          </w:p>
+        </w:tc>
+        <w:tc>
+          <w:tcPr>
+            <w:tcW w:w="1465" w:type="dxa"/>
+            <w:tcBorders>
+              <w:top w:val="single" w:sz="2" w:space="0" w:color="D9D9D9"/>
+              <w:bottom w:val="single" w:sz="2" w:space="0" w:color="D9D9D9"/>
+            </w:tcBorders>
+            <w:tcMar>
+              <w:top w:w="60" w:type="dxa"/>
+              <w:left w:w="100" w:type="dxa"/>
+              <w:bottom w:w="60" w:type="dxa"/>
+              <w:right w:w="100" w:type="dxa"/>
+            </w:tcMar>
+          </w:tcPr>
+          <w:p>
+            <w:r>
+              <w:rPr>
+                <w:sz w:val="20"/>
+                <w:szCs w:val="20"/>
+              </w:rPr>
+              <w:t>403</w:t>
+            </w:r>
+          </w:p>
+        </w:tc>
+        <w:tc>
+          <w:tcPr>
+            <w:tcW w:w="4506" w:type="dxa"/>
+            <w:tcBorders>
+              <w:top w:val="single" w:sz="2" w:space="0" w:color="D9D9D9"/>
+              <w:bottom w:val="single" w:sz="2" w:space="0" w:color="D9D9D9"/>
+            </w:tcBorders>
+            <w:tcMar>
+              <w:top w:w="60" w:type="dxa"/>
+              <w:left w:w="100" w:type="dxa"/>
+              <w:bottom w:w="60" w:type="dxa"/>
+              <w:right w:w="100" w:type="dxa"/>
+            </w:tcMar>
+          </w:tcPr>
+          <w:p>
+            <w:r>
+              <w:rPr>
+                <w:sz w:val="20"/>
+                <w:szCs w:val="20"/>
+              </w:rPr>
+              <w:t>Permessi insufficienti per la risorsa</w:t>
             </w:r>
           </w:p>
         </w:tc>
@@ -6399,7 +6706,7 @@
       <w:tr>
         <w:tc>
           <w:tcPr>
-            <w:tcW w:w="3200" w:type="dxa"/>
+            <w:tcW w:w="3389" w:type="dxa"/>
             <w:tcBorders>
               <w:top w:val="single" w:sz="2" w:space="0" w:color="D9D9D9"/>
               <w:bottom w:val="single" w:sz="2" w:space="0" w:color="D9D9D9"/>
@@ -6413,26 +6720,19 @@
             </w:tcMar>
           </w:tcPr>
           <w:p>
-            <w:pPr>
+            <w:r>
               <w:rPr>
                 <w:rFonts w:ascii="Consolas" w:eastAsia="Consolas" w:hAnsi="Consolas" w:cs="Consolas"/>
                 <w:sz w:val="20"/>
                 <w:szCs w:val="20"/>
               </w:rPr>
-            </w:pPr>
-            <w:r>
-              <w:rPr>
-                <w:rFonts w:ascii="Consolas" w:eastAsia="Consolas" w:hAnsi="Consolas" w:cs="Consolas"/>
-                <w:sz w:val="20"/>
-                <w:szCs w:val="20"/>
-              </w:rPr>
-              <w:t>NoResourceFound</w:t>
-            </w:r>
-          </w:p>
-        </w:tc>
-        <w:tc>
-          <w:tcPr>
-            <w:tcW w:w="1500" w:type="dxa"/>
+              <w:t>ResourceNotFound</w:t>
+            </w:r>
+          </w:p>
+        </w:tc>
+        <w:tc>
+          <w:tcPr>
+            <w:tcW w:w="1465" w:type="dxa"/>
             <w:tcBorders>
               <w:top w:val="single" w:sz="2" w:space="0" w:color="D9D9D9"/>
               <w:bottom w:val="single" w:sz="2" w:space="0" w:color="D9D9D9"/>
@@ -6446,12 +6746,6 @@
             </w:tcMar>
           </w:tcPr>
           <w:p>
-            <w:pPr>
-              <w:rPr>
-                <w:sz w:val="20"/>
-                <w:szCs w:val="20"/>
-              </w:rPr>
-            </w:pPr>
             <w:r>
               <w:rPr>
                 <w:sz w:val="20"/>
@@ -6463,7 +6757,7 @@
         </w:tc>
         <w:tc>
           <w:tcPr>
-            <w:tcW w:w="4660" w:type="dxa"/>
+            <w:tcW w:w="4506" w:type="dxa"/>
             <w:tcBorders>
               <w:top w:val="single" w:sz="2" w:space="0" w:color="D9D9D9"/>
               <w:bottom w:val="single" w:sz="2" w:space="0" w:color="D9D9D9"/>
@@ -6477,18 +6771,12 @@
             </w:tcMar>
           </w:tcPr>
           <w:p>
-            <w:pPr>
-              <w:rPr>
-                <w:sz w:val="20"/>
-                <w:szCs w:val="20"/>
-              </w:rPr>
-            </w:pPr>
-            <w:r>
-              <w:rPr>
-                <w:sz w:val="20"/>
-                <w:szCs w:val="20"/>
-              </w:rPr>
-              <w:t>Endpoint inesistente</w:t>
+            <w:r>
+              <w:rPr>
+                <w:sz w:val="20"/>
+                <w:szCs w:val="20"/>
+              </w:rPr>
+              <w:t>Risorsa inesistente</w:t>
             </w:r>
           </w:p>
         </w:tc>
@@ -6496,7 +6784,7 @@
       <w:tr>
         <w:tc>
           <w:tcPr>
-            <w:tcW w:w="3200" w:type="dxa"/>
+            <w:tcW w:w="3389" w:type="dxa"/>
             <w:tcBorders>
               <w:top w:val="single" w:sz="2" w:space="0" w:color="D9D9D9"/>
               <w:bottom w:val="single" w:sz="2" w:space="0" w:color="D9D9D9"/>
@@ -6522,13 +6810,13 @@
                 <w:sz w:val="20"/>
                 <w:szCs w:val="20"/>
               </w:rPr>
-              <w:t>HttpRequestMethodNotSupported</w:t>
-            </w:r>
-          </w:p>
-        </w:tc>
-        <w:tc>
-          <w:tcPr>
-            <w:tcW w:w="1500" w:type="dxa"/>
+              <w:t>NoResourceFound</w:t>
+            </w:r>
+          </w:p>
+        </w:tc>
+        <w:tc>
+          <w:tcPr>
+            <w:tcW w:w="1465" w:type="dxa"/>
             <w:tcBorders>
               <w:top w:val="single" w:sz="2" w:space="0" w:color="D9D9D9"/>
               <w:bottom w:val="single" w:sz="2" w:space="0" w:color="D9D9D9"/>
@@ -6552,13 +6840,13 @@
                 <w:sz w:val="20"/>
                 <w:szCs w:val="20"/>
               </w:rPr>
-              <w:t>405</w:t>
-            </w:r>
-          </w:p>
-        </w:tc>
-        <w:tc>
-          <w:tcPr>
-            <w:tcW w:w="4660" w:type="dxa"/>
+              <w:t>404</w:t>
+            </w:r>
+          </w:p>
+        </w:tc>
+        <w:tc>
+          <w:tcPr>
+            <w:tcW w:w="4506" w:type="dxa"/>
             <w:tcBorders>
               <w:top w:val="single" w:sz="2" w:space="0" w:color="D9D9D9"/>
               <w:bottom w:val="single" w:sz="2" w:space="0" w:color="D9D9D9"/>
@@ -6582,7 +6870,7 @@
                 <w:sz w:val="20"/>
                 <w:szCs w:val="20"/>
               </w:rPr>
-              <w:t>Metodo HTTP non previsto per l'endpoint</w:t>
+              <w:t>Endpoint inesistente</w:t>
             </w:r>
           </w:p>
         </w:tc>
@@ -6590,7 +6878,7 @@
       <w:tr>
         <w:tc>
           <w:tcPr>
-            <w:tcW w:w="3200" w:type="dxa"/>
+            <w:tcW w:w="3389" w:type="dxa"/>
             <w:tcBorders>
               <w:top w:val="single" w:sz="2" w:space="0" w:color="D9D9D9"/>
               <w:bottom w:val="single" w:sz="2" w:space="0" w:color="D9D9D9"/>
@@ -6604,19 +6892,26 @@
             </w:tcMar>
           </w:tcPr>
           <w:p>
-            <w:r>
+            <w:pPr>
               <w:rPr>
                 <w:rFonts w:ascii="Consolas" w:eastAsia="Consolas" w:hAnsi="Consolas" w:cs="Consolas"/>
                 <w:sz w:val="20"/>
                 <w:szCs w:val="20"/>
               </w:rPr>
-              <w:t>ResourceConflict</w:t>
-            </w:r>
-          </w:p>
-        </w:tc>
-        <w:tc>
-          <w:tcPr>
-            <w:tcW w:w="1500" w:type="dxa"/>
+            </w:pPr>
+            <w:r>
+              <w:rPr>
+                <w:rFonts w:ascii="Consolas" w:eastAsia="Consolas" w:hAnsi="Consolas" w:cs="Consolas"/>
+                <w:sz w:val="20"/>
+                <w:szCs w:val="20"/>
+              </w:rPr>
+              <w:t>HttpRequestMethodNotSupported</w:t>
+            </w:r>
+          </w:p>
+        </w:tc>
+        <w:tc>
+          <w:tcPr>
+            <w:tcW w:w="1465" w:type="dxa"/>
             <w:tcBorders>
               <w:top w:val="single" w:sz="2" w:space="0" w:color="D9D9D9"/>
               <w:bottom w:val="single" w:sz="2" w:space="0" w:color="D9D9D9"/>
@@ -6630,18 +6925,24 @@
             </w:tcMar>
           </w:tcPr>
           <w:p>
-            <w:r>
-              <w:rPr>
-                <w:sz w:val="20"/>
-                <w:szCs w:val="20"/>
-              </w:rPr>
-              <w:t>409</w:t>
-            </w:r>
-          </w:p>
-        </w:tc>
-        <w:tc>
-          <w:tcPr>
-            <w:tcW w:w="4660" w:type="dxa"/>
+            <w:pPr>
+              <w:rPr>
+                <w:sz w:val="20"/>
+                <w:szCs w:val="20"/>
+              </w:rPr>
+            </w:pPr>
+            <w:r>
+              <w:rPr>
+                <w:sz w:val="20"/>
+                <w:szCs w:val="20"/>
+              </w:rPr>
+              <w:t>405</w:t>
+            </w:r>
+          </w:p>
+        </w:tc>
+        <w:tc>
+          <w:tcPr>
+            <w:tcW w:w="4506" w:type="dxa"/>
             <w:tcBorders>
               <w:top w:val="single" w:sz="2" w:space="0" w:color="D9D9D9"/>
               <w:bottom w:val="single" w:sz="2" w:space="0" w:color="D9D9D9"/>
@@ -6655,12 +6956,18 @@
             </w:tcMar>
           </w:tcPr>
           <w:p>
-            <w:r>
-              <w:rPr>
-                <w:sz w:val="20"/>
-                <w:szCs w:val="20"/>
-              </w:rPr>
-              <w:t>Violazione di una regola di dominio</w:t>
+            <w:pPr>
+              <w:rPr>
+                <w:sz w:val="20"/>
+                <w:szCs w:val="20"/>
+              </w:rPr>
+            </w:pPr>
+            <w:r>
+              <w:rPr>
+                <w:sz w:val="20"/>
+                <w:szCs w:val="20"/>
+              </w:rPr>
+              <w:t>Metodo HTTP non previsto per l'endpoint</w:t>
             </w:r>
           </w:p>
         </w:tc>
@@ -6668,57 +6975,44 @@
       <w:tr>
         <w:tc>
           <w:tcPr>
-            <w:tcW w:w="3200" w:type="dxa"/>
-            <w:tcBorders>
-              <w:top w:val="single" w:sz="2" w:space="0" w:color="D9D9D9"/>
-              <w:bottom w:val="single" w:sz="2" w:space="0" w:color="D9D9D9"/>
-            </w:tcBorders>
-            <w:tcMar>
-              <w:top w:w="60" w:type="dxa"/>
-              <w:left w:w="100" w:type="dxa"/>
-              <w:bottom w:w="60" w:type="dxa"/>
-              <w:right w:w="100" w:type="dxa"/>
-            </w:tcMar>
-          </w:tcPr>
-          <w:p>
-            <w:pPr>
+            <w:tcW w:w="3389" w:type="dxa"/>
+            <w:tcBorders>
+              <w:top w:val="single" w:sz="2" w:space="0" w:color="D9D9D9"/>
+              <w:bottom w:val="single" w:sz="2" w:space="0" w:color="D9D9D9"/>
+            </w:tcBorders>
+            <w:tcMar>
+              <w:top w:w="60" w:type="dxa"/>
+              <w:left w:w="100" w:type="dxa"/>
+              <w:bottom w:w="60" w:type="dxa"/>
+              <w:right w:w="100" w:type="dxa"/>
+            </w:tcMar>
+          </w:tcPr>
+          <w:p>
+            <w:r>
               <w:rPr>
                 <w:rFonts w:ascii="Consolas" w:eastAsia="Consolas" w:hAnsi="Consolas" w:cs="Consolas"/>
                 <w:sz w:val="20"/>
                 <w:szCs w:val="20"/>
               </w:rPr>
-            </w:pPr>
-            <w:r>
-              <w:rPr>
-                <w:rFonts w:ascii="Consolas" w:eastAsia="Consolas" w:hAnsi="Consolas" w:cs="Consolas"/>
-                <w:sz w:val="20"/>
-                <w:szCs w:val="20"/>
-              </w:rPr>
-              <w:t>DataIntegrityViolation</w:t>
-            </w:r>
-          </w:p>
-        </w:tc>
-        <w:tc>
-          <w:tcPr>
-            <w:tcW w:w="1500" w:type="dxa"/>
-            <w:tcBorders>
-              <w:top w:val="single" w:sz="2" w:space="0" w:color="D9D9D9"/>
-              <w:bottom w:val="single" w:sz="2" w:space="0" w:color="D9D9D9"/>
-            </w:tcBorders>
-            <w:tcMar>
-              <w:top w:w="60" w:type="dxa"/>
-              <w:left w:w="100" w:type="dxa"/>
-              <w:bottom w:w="60" w:type="dxa"/>
-              <w:right w:w="100" w:type="dxa"/>
-            </w:tcMar>
-          </w:tcPr>
-          <w:p>
-            <w:pPr>
-              <w:rPr>
-                <w:sz w:val="20"/>
-                <w:szCs w:val="20"/>
-              </w:rPr>
-            </w:pPr>
+              <w:t>ResourceConflict</w:t>
+            </w:r>
+          </w:p>
+        </w:tc>
+        <w:tc>
+          <w:tcPr>
+            <w:tcW w:w="1465" w:type="dxa"/>
+            <w:tcBorders>
+              <w:top w:val="single" w:sz="2" w:space="0" w:color="D9D9D9"/>
+              <w:bottom w:val="single" w:sz="2" w:space="0" w:color="D9D9D9"/>
+            </w:tcBorders>
+            <w:tcMar>
+              <w:top w:w="60" w:type="dxa"/>
+              <w:left w:w="100" w:type="dxa"/>
+              <w:bottom w:w="60" w:type="dxa"/>
+              <w:right w:w="100" w:type="dxa"/>
+            </w:tcMar>
+          </w:tcPr>
+          <w:p>
             <w:r>
               <w:rPr>
                 <w:sz w:val="20"/>
@@ -6730,31 +7024,25 @@
         </w:tc>
         <w:tc>
           <w:tcPr>
-            <w:tcW w:w="4660" w:type="dxa"/>
-            <w:tcBorders>
-              <w:top w:val="single" w:sz="2" w:space="0" w:color="D9D9D9"/>
-              <w:bottom w:val="single" w:sz="2" w:space="0" w:color="D9D9D9"/>
-            </w:tcBorders>
-            <w:tcMar>
-              <w:top w:w="60" w:type="dxa"/>
-              <w:left w:w="100" w:type="dxa"/>
-              <w:bottom w:w="60" w:type="dxa"/>
-              <w:right w:w="100" w:type="dxa"/>
-            </w:tcMar>
-          </w:tcPr>
-          <w:p>
-            <w:pPr>
-              <w:rPr>
-                <w:sz w:val="20"/>
-                <w:szCs w:val="20"/>
-              </w:rPr>
-            </w:pPr>
-            <w:r>
-              <w:rPr>
-                <w:sz w:val="20"/>
-                <w:szCs w:val="20"/>
-              </w:rPr>
-              <w:t>Vincolo del database violato, ad esempio da richieste concorrenti</w:t>
+            <w:tcW w:w="4506" w:type="dxa"/>
+            <w:tcBorders>
+              <w:top w:val="single" w:sz="2" w:space="0" w:color="D9D9D9"/>
+              <w:bottom w:val="single" w:sz="2" w:space="0" w:color="D9D9D9"/>
+            </w:tcBorders>
+            <w:tcMar>
+              <w:top w:w="60" w:type="dxa"/>
+              <w:left w:w="100" w:type="dxa"/>
+              <w:bottom w:w="60" w:type="dxa"/>
+              <w:right w:w="100" w:type="dxa"/>
+            </w:tcMar>
+          </w:tcPr>
+          <w:p>
+            <w:r>
+              <w:rPr>
+                <w:sz w:val="20"/>
+                <w:szCs w:val="20"/>
+              </w:rPr>
+              <w:t>Violazione di una regola di dominio</w:t>
             </w:r>
           </w:p>
         </w:tc>
@@ -6762,7 +7050,7 @@
       <w:tr>
         <w:tc>
           <w:tcPr>
-            <w:tcW w:w="3200" w:type="dxa"/>
+            <w:tcW w:w="3389" w:type="dxa"/>
             <w:tcBorders>
               <w:top w:val="single" w:sz="2" w:space="0" w:color="D9D9D9"/>
               <w:bottom w:val="single" w:sz="2" w:space="0" w:color="D9D9D9"/>
@@ -6789,13 +7077,14 @@
                 <w:sz w:val="20"/>
                 <w:szCs w:val="20"/>
               </w:rPr>
-              <w:t>HttpMediaTypeNotSupported</w:t>
-            </w:r>
-          </w:p>
-        </w:tc>
-        <w:tc>
-          <w:tcPr>
-            <w:tcW w:w="1500" w:type="dxa"/>
+              <w:lastRenderedPageBreak/>
+              <w:t>DataIntegrityViolation</w:t>
+            </w:r>
+          </w:p>
+        </w:tc>
+        <w:tc>
+          <w:tcPr>
+            <w:tcW w:w="1465" w:type="dxa"/>
             <w:tcBorders>
               <w:top w:val="single" w:sz="2" w:space="0" w:color="D9D9D9"/>
               <w:bottom w:val="single" w:sz="2" w:space="0" w:color="D9D9D9"/>
@@ -6820,13 +7109,13 @@
                 <w:sz w:val="20"/>
                 <w:szCs w:val="20"/>
               </w:rPr>
-              <w:t>415</w:t>
-            </w:r>
-          </w:p>
-        </w:tc>
-        <w:tc>
-          <w:tcPr>
-            <w:tcW w:w="4660" w:type="dxa"/>
+              <w:t>409</w:t>
+            </w:r>
+          </w:p>
+        </w:tc>
+        <w:tc>
+          <w:tcPr>
+            <w:tcW w:w="4506" w:type="dxa"/>
             <w:tcBorders>
               <w:top w:val="single" w:sz="2" w:space="0" w:color="D9D9D9"/>
               <w:bottom w:val="single" w:sz="2" w:space="0" w:color="D9D9D9"/>
@@ -6851,7 +7140,7 @@
                 <w:sz w:val="20"/>
                 <w:szCs w:val="20"/>
               </w:rPr>
-              <w:t>Formato del corpo della richiesta non supportato</w:t>
+              <w:t>Vincolo del database violato, ad esempio da richieste concorrenti</w:t>
             </w:r>
           </w:p>
         </w:tc>
@@ -6859,11 +7148,106 @@
       <w:tr>
         <w:tc>
           <w:tcPr>
-            <w:tcW w:w="3200" w:type="dxa"/>
+            <w:tcW w:w="3389" w:type="dxa"/>
+            <w:tcBorders>
+              <w:top w:val="single" w:sz="2" w:space="0" w:color="D9D9D9"/>
+              <w:bottom w:val="single" w:sz="2" w:space="0" w:color="D9D9D9"/>
+            </w:tcBorders>
+            <w:tcMar>
+              <w:top w:w="60" w:type="dxa"/>
+              <w:left w:w="100" w:type="dxa"/>
+              <w:bottom w:w="60" w:type="dxa"/>
+              <w:right w:w="100" w:type="dxa"/>
+            </w:tcMar>
+          </w:tcPr>
+          <w:p>
+            <w:pPr>
+              <w:rPr>
+                <w:rFonts w:ascii="Consolas" w:eastAsia="Consolas" w:hAnsi="Consolas" w:cs="Consolas"/>
+                <w:sz w:val="20"/>
+                <w:szCs w:val="20"/>
+              </w:rPr>
+            </w:pPr>
+            <w:r>
+              <w:rPr>
+                <w:rFonts w:ascii="Consolas" w:eastAsia="Consolas" w:hAnsi="Consolas" w:cs="Consolas"/>
+                <w:sz w:val="20"/>
+                <w:szCs w:val="20"/>
+              </w:rPr>
+              <w:t>HttpMediaTypeNotSupported</w:t>
+            </w:r>
+          </w:p>
+        </w:tc>
+        <w:tc>
+          <w:tcPr>
+            <w:tcW w:w="1465" w:type="dxa"/>
+            <w:tcBorders>
+              <w:top w:val="single" w:sz="2" w:space="0" w:color="D9D9D9"/>
+              <w:bottom w:val="single" w:sz="2" w:space="0" w:color="D9D9D9"/>
+            </w:tcBorders>
+            <w:tcMar>
+              <w:top w:w="60" w:type="dxa"/>
+              <w:left w:w="100" w:type="dxa"/>
+              <w:bottom w:w="60" w:type="dxa"/>
+              <w:right w:w="100" w:type="dxa"/>
+            </w:tcMar>
+          </w:tcPr>
+          <w:p>
+            <w:pPr>
+              <w:rPr>
+                <w:sz w:val="20"/>
+                <w:szCs w:val="20"/>
+              </w:rPr>
+            </w:pPr>
+            <w:r>
+              <w:rPr>
+                <w:sz w:val="20"/>
+                <w:szCs w:val="20"/>
+              </w:rPr>
+              <w:t>415</w:t>
+            </w:r>
+          </w:p>
+        </w:tc>
+        <w:tc>
+          <w:tcPr>
+            <w:tcW w:w="4506" w:type="dxa"/>
+            <w:tcBorders>
+              <w:top w:val="single" w:sz="2" w:space="0" w:color="D9D9D9"/>
+              <w:bottom w:val="single" w:sz="2" w:space="0" w:color="D9D9D9"/>
+            </w:tcBorders>
+            <w:tcMar>
+              <w:top w:w="60" w:type="dxa"/>
+              <w:left w:w="100" w:type="dxa"/>
+              <w:bottom w:w="60" w:type="dxa"/>
+              <w:right w:w="100" w:type="dxa"/>
+            </w:tcMar>
+          </w:tcPr>
+          <w:p>
+            <w:pPr>
+              <w:rPr>
+                <w:sz w:val="20"/>
+                <w:szCs w:val="20"/>
+              </w:rPr>
+            </w:pPr>
+            <w:r>
+              <w:rPr>
+                <w:sz w:val="20"/>
+                <w:szCs w:val="20"/>
+              </w:rPr>
+              <w:t>Formato del corpo della richiesta non supportato</w:t>
+            </w:r>
+          </w:p>
+        </w:tc>
+      </w:tr>
+      <w:tr>
+        <w:tc>
+          <w:tcPr>
+            <w:tcW w:w="3389" w:type="dxa"/>
             <w:tcBorders>
               <w:top w:val="single" w:sz="2" w:space="0" w:color="D9D9D9"/>
               <w:bottom w:val="single" w:sz="4" w:space="0" w:color="BFBFBF"/>
             </w:tcBorders>
+            <w:shd w:val="clear" w:color="auto" w:fill="F2F2F2"/>
             <w:tcMar>
               <w:top w:w="60" w:type="dxa"/>
               <w:left w:w="100" w:type="dxa"/>
@@ -6884,11 +7268,12 @@
         </w:tc>
         <w:tc>
           <w:tcPr>
-            <w:tcW w:w="1500" w:type="dxa"/>
+            <w:tcW w:w="1465" w:type="dxa"/>
             <w:tcBorders>
               <w:top w:val="single" w:sz="2" w:space="0" w:color="D9D9D9"/>
               <w:bottom w:val="single" w:sz="4" w:space="0" w:color="BFBFBF"/>
             </w:tcBorders>
+            <w:shd w:val="clear" w:color="auto" w:fill="F2F2F2"/>
             <w:tcMar>
               <w:top w:w="60" w:type="dxa"/>
               <w:left w:w="100" w:type="dxa"/>
@@ -6908,11 +7293,12 @@
         </w:tc>
         <w:tc>
           <w:tcPr>
-            <w:tcW w:w="4660" w:type="dxa"/>
+            <w:tcW w:w="4506" w:type="dxa"/>
             <w:tcBorders>
               <w:top w:val="single" w:sz="2" w:space="0" w:color="D9D9D9"/>
               <w:bottom w:val="single" w:sz="4" w:space="0" w:color="BFBFBF"/>
             </w:tcBorders>
+            <w:shd w:val="clear" w:color="auto" w:fill="F2F2F2"/>
             <w:tcMar>
               <w:top w:w="60" w:type="dxa"/>
               <w:left w:w="100" w:type="dxa"/>
@@ -6981,7 +7367,7 @@
       <w:r>
         <w:br w:type="page"/>
       </w:r>
-      <w:bookmarkStart w:id="17" w:name="_Toc241332078"/>
+      <w:bookmarkStart w:id="17" w:name="_Toc241397561"/>
       <w:r>
         <w:rPr>
           <w:b/>
@@ -7005,7 +7391,7 @@
         <w:rPr>
           <w:b/>
         </w:rPr>
-        <w:t>139 test</w:t>
+        <w:t>157 test</w:t>
       </w:r>
       <w:r>
         <w:t>, tutti superati, con una copertura del codice (</w:t>
@@ -7094,7 +7480,7 @@
         <w:t>test di integrazione</w:t>
       </w:r>
       <w:r>
-        <w:t xml:space="preserve"> verificano il funzionamento end-to-end dell'intera catena REST — dal filtro JWT fino al database — usando </w:t>
+        <w:t xml:space="preserve"> verificano il funzionamento end-to-end dell'intera catena REST — dalla verifica del token fino al database — usando </w:t>
       </w:r>
       <w:r>
         <w:rPr>
@@ -7114,7 +7500,7 @@
         <w:t>H2 in memoria</w:t>
       </w:r>
       <w:r>
-        <w:t>, sul quale Flyway applica le stesse migrazioni usate in produzione: i test girano quindi sullo schema reale, e a ogni esecuzione Hibernate verifica che le entità vi corrispondano. Grazie a H2 la suite può essere eseguita senza un server MySQL attivo, rendendo i test riproducibili su qualsiasi macchina. Coprono l'intero ciclo di vita di un torneo — registrazione, login, creazione, iscrizione delle squadre, generazione del calendario, inserimento dei risultati, classifica e chiusura — oltre alle regole di autorizzazione, alla paginazione e al rate limit sul login.</w:t>
+        <w:t>, sul quale Flyway applica le stesse migrazioni usate in produzione: i test girano quindi sullo schema reale, e a ogni esecuzione Hibernate verifica che le entità vi corrispondano. Grazie a H2 la suite può essere eseguita senza un server MySQL attivo, rendendo i test riproducibili su qualsiasi macchina. Coprono l'intero ciclo di vita di un torneo — registrazione, login, creazione, iscrizione delle squadre, generazione del calendario, inserimento dei risultati, classifica e chiusura — oltre alle regole di autorizzazione, alla paginazione, al CORS e al rate limit sul login. Una classe dedicata verifica il ciclo di vita dei token: emissione, salvataggio come hash, rotazione, logout, logout-all, scadenze e pulizia automatica.</w:t>
       </w:r>
     </w:p>
     <w:p>
@@ -7150,7 +7536,7 @@
         <w:keepNext/>
         <w:spacing w:before="240" w:after="120"/>
       </w:pPr>
-      <w:bookmarkStart w:id="18" w:name="_Toc241332079"/>
+      <w:bookmarkStart w:id="18" w:name="_Toc241397562"/>
       <w:r>
         <w:rPr>
           <w:b/>
@@ -7288,7 +7674,7 @@
                 <w:sz w:val="20"/>
                 <w:szCs w:val="20"/>
               </w:rPr>
-              <w:t>97%</w:t>
+              <w:t>92%</w:t>
             </w:r>
           </w:p>
         </w:tc>
@@ -7340,7 +7726,7 @@
                 <w:sz w:val="20"/>
                 <w:szCs w:val="20"/>
               </w:rPr>
-              <w:t>82%</w:t>
+              <w:t>83%</w:t>
             </w:r>
           </w:p>
         </w:tc>
@@ -7454,7 +7840,7 @@
                 <w:sz w:val="20"/>
                 <w:szCs w:val="20"/>
               </w:rPr>
-              <w:t>99%</w:t>
+              <w:t>100%</w:t>
             </w:r>
           </w:p>
         </w:tc>
@@ -7568,7 +7954,7 @@
                 <w:sz w:val="20"/>
                 <w:szCs w:val="20"/>
               </w:rPr>
-              <w:t>73%</w:t>
+              <w:t>79%</w:t>
             </w:r>
           </w:p>
         </w:tc>
@@ -7635,7 +8021,7 @@
           <w:sz w:val="25"/>
         </w:rPr>
       </w:pPr>
-      <w:bookmarkStart w:id="19" w:name="_Toc241332080"/>
+      <w:bookmarkStart w:id="19" w:name="_Toc241397563"/>
       <w:r>
         <w:rPr>
           <w:b/>
@@ -7681,7 +8067,7 @@
         <w:keepNext/>
         <w:spacing w:before="320" w:after="160"/>
       </w:pPr>
-      <w:bookmarkStart w:id="20" w:name="_Toc241332081"/>
+      <w:bookmarkStart w:id="20" w:name="_Toc241397564"/>
       <w:r>
         <w:rPr>
           <w:b/>
@@ -7691,17 +8077,7 @@
           <w:szCs w:val="30"/>
         </w:rPr>
         <w:lastRenderedPageBreak/>
-        <w:t>8</w:t>
-      </w:r>
-      <w:r>
-        <w:rPr>
-          <w:b/>
-          <w:bCs/>
-          <w:color w:val="1F4E79"/>
-          <w:sz w:val="30"/>
-          <w:szCs w:val="30"/>
-        </w:rPr>
-        <w:t>. Containerizzazione (Docker)</w:t>
+        <w:t>8. Containerizzazione (Docker)</w:t>
       </w:r>
       <w:bookmarkEnd w:id="20"/>
     </w:p>
@@ -7853,7 +8229,18 @@
         <w:t>.env.example</w:t>
       </w:r>
       <w:r>
-        <w:t>, con i nomi delle variabili e senza valori sensibili. Anche le porte esposte sono configurabili, così da evitare conflitti con altri servizi già attivi sulla macchina.</w:t>
+        <w:t xml:space="preserve">, con i nomi delle variabili e senza valori sensibili. Nessuna variabile è obbligatoria: ognuna ha un valore predefinito, per cui l'ambiente si avvia anche senza file </w:t>
+      </w:r>
+      <w:r>
+        <w:rPr>
+          <w:rFonts w:ascii="Consolas" w:hAnsi="Consolas"/>
+          <w:color w:val="C0392B"/>
+          <w:sz w:val="20"/>
+        </w:rPr>
+        <w:t>.env</w:t>
+      </w:r>
+      <w:r>
+        <w:t>. Anche le porte esposte sono configurabili, così da evitare conflitti con altri servizi già attivi sulla macchina.</w:t>
       </w:r>
     </w:p>
     <w:p>
@@ -7862,7 +8249,7 @@
         <w:keepNext/>
         <w:spacing w:before="320" w:after="160"/>
       </w:pPr>
-      <w:bookmarkStart w:id="21" w:name="_Toc241332082"/>
+      <w:bookmarkStart w:id="21" w:name="_Toc241397565"/>
       <w:r>
         <w:rPr>
           <w:b/>
@@ -7890,7 +8277,7 @@
         <w:t>test di integrazione</w:t>
       </w:r>
       <w:r>
-        <w:t>. Il dominio scelto è stato implementato con coerenza, dalle entità agli endpoint, e arricchito con funzionalità non banali come la generazione automatica del calendario, anche con andata e ritorno, e il calcolo dinamico della classifica. A questo si aggiungono gli elementi che avvicinano il progetto a un servizio reale: migrazioni del database versionate, documentazione interattiva dell'API, protezione del login dai tentativi ripetuti, test su un database reale e integrazione continua.</w:t>
+        <w:t>. Il dominio scelto è stato implementato con coerenza, dalle entità agli endpoint, e arricchito con funzionalità non banali come la generazione automatica del calendario, anche con andata e ritorno, e il calcolo dinamico della classifica. A questo si aggiungono gli elementi che avvicinano il progetto a un servizio reale: autenticazione con Spring Authorization Server e token opachi revocabili, migrazioni del database versionate, documentazione interattiva dell'API, protezione del login dai tentativi ripetuti, test su un database reale e integrazione continua. L'API è pronta per essere utilizzata da un frontend web.</w:t>
       </w:r>
     </w:p>
     <w:p>
@@ -7910,7 +8297,7 @@
         <w:t>@PreAuthorize</w:t>
       </w:r>
       <w:r>
-        <w:t xml:space="preserve"> — e la gestione dello schema come codice versionato con Flyway. Sono concetti che ho scelto di affrontare consapevolmente, e che costituiscono la parte più significativa dell'esperienza.</w:t>
+        <w:t xml:space="preserve"> —, la gestione dello schema come codice versionato con Flyway e l'emissione di token opachi con Spring Authorization Server, salvati solo come hash sul modello di Django Knox. Sono concetti che ho scelto di affrontare consapevolmente, e che costituiscono la parte più significativa dell'esperienza.</w:t>
       </w:r>
     </w:p>
     <w:sectPr>

</xml_diff>

<commit_message>
fix: input validation, password limit, points, last organizer and top scorer; remove comments and dead code; forward Docker config; update docs - 166 tests
</commit_message>
<xml_diff>
--- a/Relazione Tecnica LeagueMate.docx
+++ b/Relazione Tecnica LeagueMate.docx
@@ -106,17 +106,13 @@
       </w:r>
     </w:p>
     <w:p>
-      <w:r>
-        <w:br w:type="page"/>
-      </w:r>
-    </w:p>
-    <w:p>
       <w:pPr>
         <w:pStyle w:val="Titolo1"/>
         <w:keepNext/>
+        <w:pageBreakBefore/>
         <w:spacing w:before="320" w:after="160"/>
       </w:pPr>
-      <w:bookmarkStart w:id="0" w:name="_Toc241397544"/>
+      <w:bookmarkStart w:id="0" w:name="_Toc241399580"/>
       <w:r>
         <w:rPr>
           <w:b/>
@@ -162,7 +158,7 @@
           <w:r>
             <w:fldChar w:fldCharType="separate"/>
           </w:r>
-          <w:hyperlink w:anchor="_Toc241397544" w:history="1">
+          <w:hyperlink w:anchor="_Toc241399580" w:history="1">
             <w:r>
               <w:rPr>
                 <w:rStyle w:val="Collegamentoipertestuale"/>
@@ -188,7 +184,7 @@
               <w:rPr>
                 <w:noProof/>
               </w:rPr>
-              <w:instrText xml:space="preserve"> PAGEREF _Toc241397544 \h </w:instrText>
+              <w:instrText xml:space="preserve"> PAGEREF _Toc241399580 \h </w:instrText>
             </w:r>
             <w:r>
               <w:rPr>
@@ -231,7 +227,7 @@
               <w14:ligatures w14:val="standardContextual"/>
             </w:rPr>
           </w:pPr>
-          <w:hyperlink w:anchor="_Toc241397545" w:history="1">
+          <w:hyperlink w:anchor="_Toc241399581" w:history="1">
             <w:r>
               <w:rPr>
                 <w:rStyle w:val="Collegamentoipertestuale"/>
@@ -257,7 +253,7 @@
               <w:rPr>
                 <w:noProof/>
               </w:rPr>
-              <w:instrText xml:space="preserve"> PAGEREF _Toc241397545 \h </w:instrText>
+              <w:instrText xml:space="preserve"> PAGEREF _Toc241399581 \h </w:instrText>
             </w:r>
             <w:r>
               <w:rPr>
@@ -300,7 +296,7 @@
               <w14:ligatures w14:val="standardContextual"/>
             </w:rPr>
           </w:pPr>
-          <w:hyperlink w:anchor="_Toc241397546" w:history="1">
+          <w:hyperlink w:anchor="_Toc241399582" w:history="1">
             <w:r>
               <w:rPr>
                 <w:rStyle w:val="Collegamentoipertestuale"/>
@@ -326,7 +322,7 @@
               <w:rPr>
                 <w:noProof/>
               </w:rPr>
-              <w:instrText xml:space="preserve"> PAGEREF _Toc241397546 \h </w:instrText>
+              <w:instrText xml:space="preserve"> PAGEREF _Toc241399582 \h </w:instrText>
             </w:r>
             <w:r>
               <w:rPr>
@@ -369,7 +365,7 @@
               <w14:ligatures w14:val="standardContextual"/>
             </w:rPr>
           </w:pPr>
-          <w:hyperlink w:anchor="_Toc241397547" w:history="1">
+          <w:hyperlink w:anchor="_Toc241399583" w:history="1">
             <w:r>
               <w:rPr>
                 <w:rStyle w:val="Collegamentoipertestuale"/>
@@ -395,7 +391,7 @@
               <w:rPr>
                 <w:noProof/>
               </w:rPr>
-              <w:instrText xml:space="preserve"> PAGEREF _Toc241397547 \h </w:instrText>
+              <w:instrText xml:space="preserve"> PAGEREF _Toc241399583 \h </w:instrText>
             </w:r>
             <w:r>
               <w:rPr>
@@ -438,7 +434,7 @@
               <w14:ligatures w14:val="standardContextual"/>
             </w:rPr>
           </w:pPr>
-          <w:hyperlink w:anchor="_Toc241397548" w:history="1">
+          <w:hyperlink w:anchor="_Toc241399584" w:history="1">
             <w:r>
               <w:rPr>
                 <w:rStyle w:val="Collegamentoipertestuale"/>
@@ -464,7 +460,7 @@
               <w:rPr>
                 <w:noProof/>
               </w:rPr>
-              <w:instrText xml:space="preserve"> PAGEREF _Toc241397548 \h </w:instrText>
+              <w:instrText xml:space="preserve"> PAGEREF _Toc241399584 \h </w:instrText>
             </w:r>
             <w:r>
               <w:rPr>
@@ -507,7 +503,7 @@
               <w14:ligatures w14:val="standardContextual"/>
             </w:rPr>
           </w:pPr>
-          <w:hyperlink w:anchor="_Toc241397549" w:history="1">
+          <w:hyperlink w:anchor="_Toc241399585" w:history="1">
             <w:r>
               <w:rPr>
                 <w:rStyle w:val="Collegamentoipertestuale"/>
@@ -532,7 +528,7 @@
               <w:rPr>
                 <w:noProof/>
               </w:rPr>
-              <w:instrText xml:space="preserve"> PAGEREF _Toc241397549 \h </w:instrText>
+              <w:instrText xml:space="preserve"> PAGEREF _Toc241399585 \h </w:instrText>
             </w:r>
             <w:r>
               <w:rPr>
@@ -575,7 +571,7 @@
               <w14:ligatures w14:val="standardContextual"/>
             </w:rPr>
           </w:pPr>
-          <w:hyperlink w:anchor="_Toc241397550" w:history="1">
+          <w:hyperlink w:anchor="_Toc241399586" w:history="1">
             <w:r>
               <w:rPr>
                 <w:rStyle w:val="Collegamentoipertestuale"/>
@@ -601,7 +597,7 @@
               <w:rPr>
                 <w:noProof/>
               </w:rPr>
-              <w:instrText xml:space="preserve"> PAGEREF _Toc241397550 \h </w:instrText>
+              <w:instrText xml:space="preserve"> PAGEREF _Toc241399586 \h </w:instrText>
             </w:r>
             <w:r>
               <w:rPr>
@@ -644,7 +640,7 @@
               <w14:ligatures w14:val="standardContextual"/>
             </w:rPr>
           </w:pPr>
-          <w:hyperlink w:anchor="_Toc241397551" w:history="1">
+          <w:hyperlink w:anchor="_Toc241399587" w:history="1">
             <w:r>
               <w:rPr>
                 <w:rStyle w:val="Collegamentoipertestuale"/>
@@ -670,7 +666,7 @@
               <w:rPr>
                 <w:noProof/>
               </w:rPr>
-              <w:instrText xml:space="preserve"> PAGEREF _Toc241397551 \h </w:instrText>
+              <w:instrText xml:space="preserve"> PAGEREF _Toc241399587 \h </w:instrText>
             </w:r>
             <w:r>
               <w:rPr>
@@ -713,7 +709,7 @@
               <w14:ligatures w14:val="standardContextual"/>
             </w:rPr>
           </w:pPr>
-          <w:hyperlink w:anchor="_Toc241397552" w:history="1">
+          <w:hyperlink w:anchor="_Toc241399588" w:history="1">
             <w:r>
               <w:rPr>
                 <w:rStyle w:val="Collegamentoipertestuale"/>
@@ -739,7 +735,7 @@
               <w:rPr>
                 <w:noProof/>
               </w:rPr>
-              <w:instrText xml:space="preserve"> PAGEREF _Toc241397552 \h </w:instrText>
+              <w:instrText xml:space="preserve"> PAGEREF _Toc241399588 \h </w:instrText>
             </w:r>
             <w:r>
               <w:rPr>
@@ -782,7 +778,7 @@
               <w14:ligatures w14:val="standardContextual"/>
             </w:rPr>
           </w:pPr>
-          <w:hyperlink w:anchor="_Toc241397553" w:history="1">
+          <w:hyperlink w:anchor="_Toc241399589" w:history="1">
             <w:r>
               <w:rPr>
                 <w:rStyle w:val="Collegamentoipertestuale"/>
@@ -807,7 +803,7 @@
               <w:rPr>
                 <w:noProof/>
               </w:rPr>
-              <w:instrText xml:space="preserve"> PAGEREF _Toc241397553 \h </w:instrText>
+              <w:instrText xml:space="preserve"> PAGEREF _Toc241399589 \h </w:instrText>
             </w:r>
             <w:r>
               <w:rPr>
@@ -850,7 +846,7 @@
               <w14:ligatures w14:val="standardContextual"/>
             </w:rPr>
           </w:pPr>
-          <w:hyperlink w:anchor="_Toc241397554" w:history="1">
+          <w:hyperlink w:anchor="_Toc241399590" w:history="1">
             <w:r>
               <w:rPr>
                 <w:rStyle w:val="Collegamentoipertestuale"/>
@@ -876,7 +872,7 @@
               <w:rPr>
                 <w:noProof/>
               </w:rPr>
-              <w:instrText xml:space="preserve"> PAGEREF _Toc241397554 \h </w:instrText>
+              <w:instrText xml:space="preserve"> PAGEREF _Toc241399590 \h </w:instrText>
             </w:r>
             <w:r>
               <w:rPr>
@@ -919,7 +915,7 @@
               <w14:ligatures w14:val="standardContextual"/>
             </w:rPr>
           </w:pPr>
-          <w:hyperlink w:anchor="_Toc241397555" w:history="1">
+          <w:hyperlink w:anchor="_Toc241399591" w:history="1">
             <w:r>
               <w:rPr>
                 <w:rStyle w:val="Collegamentoipertestuale"/>
@@ -945,7 +941,7 @@
               <w:rPr>
                 <w:noProof/>
               </w:rPr>
-              <w:instrText xml:space="preserve"> PAGEREF _Toc241397555 \h </w:instrText>
+              <w:instrText xml:space="preserve"> PAGEREF _Toc241399591 \h </w:instrText>
             </w:r>
             <w:r>
               <w:rPr>
@@ -988,7 +984,7 @@
               <w14:ligatures w14:val="standardContextual"/>
             </w:rPr>
           </w:pPr>
-          <w:hyperlink w:anchor="_Toc241397556" w:history="1">
+          <w:hyperlink w:anchor="_Toc241399592" w:history="1">
             <w:r>
               <w:rPr>
                 <w:rStyle w:val="Collegamentoipertestuale"/>
@@ -1014,7 +1010,7 @@
               <w:rPr>
                 <w:noProof/>
               </w:rPr>
-              <w:instrText xml:space="preserve"> PAGEREF _Toc241397556 \h </w:instrText>
+              <w:instrText xml:space="preserve"> PAGEREF _Toc241399592 \h </w:instrText>
             </w:r>
             <w:r>
               <w:rPr>
@@ -1057,7 +1053,7 @@
               <w14:ligatures w14:val="standardContextual"/>
             </w:rPr>
           </w:pPr>
-          <w:hyperlink w:anchor="_Toc241397557" w:history="1">
+          <w:hyperlink w:anchor="_Toc241399593" w:history="1">
             <w:r>
               <w:rPr>
                 <w:rStyle w:val="Collegamentoipertestuale"/>
@@ -1083,7 +1079,7 @@
               <w:rPr>
                 <w:noProof/>
               </w:rPr>
-              <w:instrText xml:space="preserve"> PAGEREF _Toc241397557 \h </w:instrText>
+              <w:instrText xml:space="preserve"> PAGEREF _Toc241399593 \h </w:instrText>
             </w:r>
             <w:r>
               <w:rPr>
@@ -1126,7 +1122,7 @@
               <w14:ligatures w14:val="standardContextual"/>
             </w:rPr>
           </w:pPr>
-          <w:hyperlink w:anchor="_Toc241397558" w:history="1">
+          <w:hyperlink w:anchor="_Toc241399594" w:history="1">
             <w:r>
               <w:rPr>
                 <w:rStyle w:val="Collegamentoipertestuale"/>
@@ -1152,7 +1148,7 @@
               <w:rPr>
                 <w:noProof/>
               </w:rPr>
-              <w:instrText xml:space="preserve"> PAGEREF _Toc241397558 \h </w:instrText>
+              <w:instrText xml:space="preserve"> PAGEREF _Toc241399594 \h </w:instrText>
             </w:r>
             <w:r>
               <w:rPr>
@@ -1195,7 +1191,7 @@
               <w14:ligatures w14:val="standardContextual"/>
             </w:rPr>
           </w:pPr>
-          <w:hyperlink w:anchor="_Toc241397559" w:history="1">
+          <w:hyperlink w:anchor="_Toc241399595" w:history="1">
             <w:r>
               <w:rPr>
                 <w:rStyle w:val="Collegamentoipertestuale"/>
@@ -1221,7 +1217,7 @@
               <w:rPr>
                 <w:noProof/>
               </w:rPr>
-              <w:instrText xml:space="preserve"> PAGEREF _Toc241397559 \h </w:instrText>
+              <w:instrText xml:space="preserve"> PAGEREF _Toc241399595 \h </w:instrText>
             </w:r>
             <w:r>
               <w:rPr>
@@ -1264,7 +1260,7 @@
               <w14:ligatures w14:val="standardContextual"/>
             </w:rPr>
           </w:pPr>
-          <w:hyperlink w:anchor="_Toc241397560" w:history="1">
+          <w:hyperlink w:anchor="_Toc241399596" w:history="1">
             <w:r>
               <w:rPr>
                 <w:rStyle w:val="Collegamentoipertestuale"/>
@@ -1290,7 +1286,7 @@
               <w:rPr>
                 <w:noProof/>
               </w:rPr>
-              <w:instrText xml:space="preserve"> PAGEREF _Toc241397560 \h </w:instrText>
+              <w:instrText xml:space="preserve"> PAGEREF _Toc241399596 \h </w:instrText>
             </w:r>
             <w:r>
               <w:rPr>
@@ -1333,7 +1329,7 @@
               <w14:ligatures w14:val="standardContextual"/>
             </w:rPr>
           </w:pPr>
-          <w:hyperlink w:anchor="_Toc241397561" w:history="1">
+          <w:hyperlink w:anchor="_Toc241399597" w:history="1">
             <w:r>
               <w:rPr>
                 <w:rStyle w:val="Collegamentoipertestuale"/>
@@ -1358,7 +1354,7 @@
               <w:rPr>
                 <w:noProof/>
               </w:rPr>
-              <w:instrText xml:space="preserve"> PAGEREF _Toc241397561 \h </w:instrText>
+              <w:instrText xml:space="preserve"> PAGEREF _Toc241399597 \h </w:instrText>
             </w:r>
             <w:r>
               <w:rPr>
@@ -1401,7 +1397,7 @@
               <w14:ligatures w14:val="standardContextual"/>
             </w:rPr>
           </w:pPr>
-          <w:hyperlink w:anchor="_Toc241397562" w:history="1">
+          <w:hyperlink w:anchor="_Toc241399598" w:history="1">
             <w:r>
               <w:rPr>
                 <w:rStyle w:val="Collegamentoipertestuale"/>
@@ -1427,7 +1423,7 @@
               <w:rPr>
                 <w:noProof/>
               </w:rPr>
-              <w:instrText xml:space="preserve"> PAGEREF _Toc241397562 \h </w:instrText>
+              <w:instrText xml:space="preserve"> PAGEREF _Toc241399598 \h </w:instrText>
             </w:r>
             <w:r>
               <w:rPr>
@@ -1470,7 +1466,7 @@
               <w14:ligatures w14:val="standardContextual"/>
             </w:rPr>
           </w:pPr>
-          <w:hyperlink w:anchor="_Toc241397563" w:history="1">
+          <w:hyperlink w:anchor="_Toc241399599" w:history="1">
             <w:r>
               <w:rPr>
                 <w:rStyle w:val="Collegamentoipertestuale"/>
@@ -1495,7 +1491,7 @@
               <w:rPr>
                 <w:noProof/>
               </w:rPr>
-              <w:instrText xml:space="preserve"> PAGEREF _Toc241397563 \h </w:instrText>
+              <w:instrText xml:space="preserve"> PAGEREF _Toc241399599 \h </w:instrText>
             </w:r>
             <w:r>
               <w:rPr>
@@ -1538,7 +1534,7 @@
               <w14:ligatures w14:val="standardContextual"/>
             </w:rPr>
           </w:pPr>
-          <w:hyperlink w:anchor="_Toc241397564" w:history="1">
+          <w:hyperlink w:anchor="_Toc241399600" w:history="1">
             <w:r>
               <w:rPr>
                 <w:rStyle w:val="Collegamentoipertestuale"/>
@@ -1564,7 +1560,7 @@
               <w:rPr>
                 <w:noProof/>
               </w:rPr>
-              <w:instrText xml:space="preserve"> PAGEREF _Toc241397564 \h </w:instrText>
+              <w:instrText xml:space="preserve"> PAGEREF _Toc241399600 \h </w:instrText>
             </w:r>
             <w:r>
               <w:rPr>
@@ -1607,7 +1603,7 @@
               <w14:ligatures w14:val="standardContextual"/>
             </w:rPr>
           </w:pPr>
-          <w:hyperlink w:anchor="_Toc241397565" w:history="1">
+          <w:hyperlink w:anchor="_Toc241399601" w:history="1">
             <w:r>
               <w:rPr>
                 <w:rStyle w:val="Collegamentoipertestuale"/>
@@ -1633,7 +1629,7 @@
               <w:rPr>
                 <w:noProof/>
               </w:rPr>
-              <w:instrText xml:space="preserve"> PAGEREF _Toc241397565 \h </w:instrText>
+              <w:instrText xml:space="preserve"> PAGEREF _Toc241399601 \h </w:instrText>
             </w:r>
             <w:r>
               <w:rPr>
@@ -1668,17 +1664,13 @@
       </w:sdtContent>
     </w:sdt>
     <w:p>
-      <w:r>
-        <w:br w:type="page"/>
-      </w:r>
-    </w:p>
-    <w:p>
       <w:pPr>
         <w:pStyle w:val="Titolo1"/>
         <w:keepNext/>
+        <w:pageBreakBefore/>
         <w:spacing w:before="320" w:after="160"/>
       </w:pPr>
-      <w:bookmarkStart w:id="1" w:name="_Toc241397545"/>
+      <w:bookmarkStart w:id="1" w:name="_Toc241399581"/>
       <w:r>
         <w:rPr>
           <w:b/>
@@ -1825,7 +1817,7 @@
         <w:keepNext/>
         <w:spacing w:before="320" w:after="160"/>
       </w:pPr>
-      <w:bookmarkStart w:id="2" w:name="_Toc241397546"/>
+      <w:bookmarkStart w:id="2" w:name="_Toc241399582"/>
       <w:r>
         <w:rPr>
           <w:b/>
@@ -1913,7 +1905,7 @@
         <w:keepNext/>
         <w:spacing w:before="240" w:after="120"/>
       </w:pPr>
-      <w:bookmarkStart w:id="3" w:name="_Toc241397547"/>
+      <w:bookmarkStart w:id="3" w:name="_Toc241399583"/>
       <w:r>
         <w:rPr>
           <w:b/>
@@ -2561,7 +2553,7 @@
         <w:keepNext/>
         <w:spacing w:before="240" w:after="120"/>
       </w:pPr>
-      <w:bookmarkStart w:id="4" w:name="_Toc241397548"/>
+      <w:bookmarkStart w:id="4" w:name="_Toc241399584"/>
       <w:r>
         <w:rPr>
           <w:b/>
@@ -2996,7 +2988,7 @@
           <w:sz w:val="25"/>
         </w:rPr>
       </w:pPr>
-      <w:bookmarkStart w:id="5" w:name="_Toc241397549"/>
+      <w:bookmarkStart w:id="5" w:name="_Toc241399585"/>
       <w:r>
         <w:rPr>
           <w:b/>
@@ -3171,7 +3163,7 @@
         <w:keepNext/>
         <w:spacing w:before="320" w:after="160"/>
       </w:pPr>
-      <w:bookmarkStart w:id="6" w:name="_Toc241397550"/>
+      <w:bookmarkStart w:id="6" w:name="_Toc241399586"/>
       <w:r>
         <w:rPr>
           <w:b/>
@@ -3209,7 +3201,7 @@
         <w:keepNext/>
         <w:spacing w:before="240" w:after="120"/>
       </w:pPr>
-      <w:bookmarkStart w:id="7" w:name="_Toc241397551"/>
+      <w:bookmarkStart w:id="7" w:name="_Toc241399587"/>
       <w:r>
         <w:rPr>
           <w:b/>
@@ -3792,7 +3784,7 @@
         <w:keepNext/>
         <w:spacing w:before="240" w:after="120"/>
       </w:pPr>
-      <w:bookmarkStart w:id="8" w:name="_Toc241397552"/>
+      <w:bookmarkStart w:id="8" w:name="_Toc241399588"/>
       <w:r>
         <w:rPr>
           <w:b/>
@@ -4480,7 +4472,7 @@
           <w:sz w:val="25"/>
         </w:rPr>
       </w:pPr>
-      <w:bookmarkStart w:id="9" w:name="_Toc241397553"/>
+      <w:bookmarkStart w:id="9" w:name="_Toc241399589"/>
       <w:r>
         <w:rPr>
           <w:b/>
@@ -4622,7 +4614,7 @@
         <w:keepNext/>
         <w:spacing w:before="320" w:after="160"/>
       </w:pPr>
-      <w:bookmarkStart w:id="10" w:name="_Toc241397554"/>
+      <w:bookmarkStart w:id="10" w:name="_Toc241399590"/>
       <w:r>
         <w:rPr>
           <w:b/>
@@ -4641,7 +4633,7 @@
         <w:keepNext/>
         <w:spacing w:before="240" w:after="120"/>
       </w:pPr>
-      <w:bookmarkStart w:id="11" w:name="_Toc241397555"/>
+      <w:bookmarkStart w:id="11" w:name="_Toc241399591"/>
       <w:r>
         <w:rPr>
           <w:b/>
@@ -4811,7 +4803,7 @@
         <w:keepNext/>
         <w:spacing w:before="240" w:after="120"/>
       </w:pPr>
-      <w:bookmarkStart w:id="12" w:name="_Toc241397556"/>
+      <w:bookmarkStart w:id="12" w:name="_Toc241399592"/>
       <w:r>
         <w:rPr>
           <w:b/>
@@ -5050,7 +5042,7 @@
         <w:keepNext/>
         <w:spacing w:before="240" w:after="120"/>
       </w:pPr>
-      <w:bookmarkStart w:id="13" w:name="_Toc241397557"/>
+      <w:bookmarkStart w:id="13" w:name="_Toc241399593"/>
       <w:r>
         <w:rPr>
           <w:b/>
@@ -5091,7 +5083,7 @@
         <w:t>GROUP BY</w:t>
       </w:r>
       <w:r>
-        <w:t xml:space="preserve"> sullo stato), mappata su una proiezione a interfaccia; gol e miglior attacco derivano invece dalla classifica, calcolata una sola volta e riutilizzata. L'intero riepilogo richiede così quattro interrogazioni, indipendentemente dal numero di squadre e di partite.</w:t>
+        <w:t xml:space="preserve"> sullo stato), mappata su una proiezione a interfaccia; gol e miglior attacco derivano invece dalla classifica, calcolata una sola volta e riutilizzata. L'intero riepilogo richiede così quattro interrogazioni, indipendentemente dal numero di squadre e di partite. Il miglior attacco viene indicato solo quando è stato segnato almeno un gol, per non presentare come tale una squadra a zero reti.</w:t>
       </w:r>
     </w:p>
     <w:p>
@@ -5103,7 +5095,7 @@
           <w:u w:val="single"/>
         </w:rPr>
       </w:pPr>
-      <w:bookmarkStart w:id="14" w:name="_Toc241397558"/>
+      <w:bookmarkStart w:id="14" w:name="_Toc241399594"/>
       <w:r>
         <w:rPr>
           <w:b/>
@@ -5234,7 +5226,7 @@
         <w:spacing w:after="80" w:line="264" w:lineRule="auto"/>
       </w:pPr>
       <w:r>
-        <w:t>La stessa squadra non può iscriversi due volte allo stesso torneo.</w:t>
+        <w:t>Un pareggio non può valere più punti di una vittoria.</w:t>
       </w:r>
     </w:p>
     <w:p>
@@ -5247,18 +5239,7 @@
         <w:spacing w:after="80" w:line="264" w:lineRule="auto"/>
       </w:pPr>
       <w:r>
-        <w:t xml:space="preserve">I risultati delle partite possono essere inseriti o corretti solo mentre il torneo è </w:t>
-      </w:r>
-      <w:r>
-        <w:rPr>
-          <w:rFonts w:ascii="Consolas" w:hAnsi="Consolas"/>
-          <w:color w:val="C0392B"/>
-          <w:sz w:val="20"/>
-        </w:rPr>
-        <w:t>ACTIVE</w:t>
-      </w:r>
-      <w:r>
-        <w:t>.</w:t>
+        <w:t>La stessa squadra non può iscriversi due volte allo stesso torneo.</w:t>
       </w:r>
     </w:p>
     <w:p>
@@ -5271,7 +5252,7 @@
         <w:spacing w:after="80" w:line="264" w:lineRule="auto"/>
       </w:pPr>
       <w:r>
-        <w:t xml:space="preserve">Un torneo passa a </w:t>
+        <w:t xml:space="preserve">I risultati delle partite possono essere inseriti o corretti solo mentre il torneo è </w:t>
       </w:r>
       <w:r>
         <w:rPr>
@@ -5279,10 +5260,10 @@
           <w:color w:val="C0392B"/>
           <w:sz w:val="20"/>
         </w:rPr>
-        <w:t>COMPLETED</w:t>
-      </w:r>
-      <w:r>
-        <w:t xml:space="preserve"> solo quando tutte le partite sono state giocate; da quel momento i risultati sono bloccati.</w:t>
+        <w:t>ACTIVE</w:t>
+      </w:r>
+      <w:r>
+        <w:t>.</w:t>
       </w:r>
     </w:p>
     <w:p>
@@ -5295,7 +5276,18 @@
         <w:spacing w:after="80" w:line="264" w:lineRule="auto"/>
       </w:pPr>
       <w:r>
-        <w:t>Un membro può essere rimosso da una squadra solo indicando la squadra a cui appartiene realmente.</w:t>
+        <w:t xml:space="preserve">Un torneo passa a </w:t>
+      </w:r>
+      <w:r>
+        <w:rPr>
+          <w:rFonts w:ascii="Consolas" w:hAnsi="Consolas"/>
+          <w:color w:val="C0392B"/>
+          <w:sz w:val="20"/>
+        </w:rPr>
+        <w:t>COMPLETED</w:t>
+      </w:r>
+      <w:r>
+        <w:t xml:space="preserve"> solo quando tutte le partite sono state giocate; da quel momento i risultati sono bloccati.</w:t>
       </w:r>
     </w:p>
     <w:p>
@@ -5308,29 +5300,7 @@
         <w:spacing w:after="80" w:line="264" w:lineRule="auto"/>
       </w:pPr>
       <w:r>
-        <w:t xml:space="preserve">Solo un utente con ruolo </w:t>
-      </w:r>
-      <w:r>
-        <w:rPr>
-          <w:rFonts w:ascii="Consolas" w:hAnsi="Consolas"/>
-          <w:color w:val="C0392B"/>
-          <w:sz w:val="20"/>
-        </w:rPr>
-        <w:t>ORGANIZER</w:t>
-      </w:r>
-      <w:r>
-        <w:t xml:space="preserve"> o </w:t>
-      </w:r>
-      <w:r>
-        <w:rPr>
-          <w:rFonts w:ascii="Consolas" w:hAnsi="Consolas"/>
-          <w:color w:val="C0392B"/>
-          <w:sz w:val="20"/>
-        </w:rPr>
-        <w:t>ADMIN</w:t>
-      </w:r>
-      <w:r>
-        <w:t xml:space="preserve"> può diventare co-organizzatore di un torneo.</w:t>
+        <w:t>Un membro può essere rimosso da una squadra solo indicando la squadra a cui appartiene realmente.</w:t>
       </w:r>
     </w:p>
     <w:p>
@@ -5343,19 +5313,29 @@
         <w:spacing w:after="80" w:line="264" w:lineRule="auto"/>
       </w:pPr>
       <w:r>
-        <w:t xml:space="preserve">Non è possibile declassare l'ultimo </w:t>
-      </w:r>
-      <w:r>
-        <w:rPr>
-          <w:rFonts w:ascii="Consolas" w:eastAsia="Consolas" w:hAnsi="Consolas" w:cs="Consolas"/>
+        <w:t xml:space="preserve">Solo un utente con ruolo </w:t>
+      </w:r>
+      <w:r>
+        <w:rPr>
+          <w:rFonts w:ascii="Consolas" w:hAnsi="Consolas"/>
           <w:color w:val="C0392B"/>
           <w:sz w:val="20"/>
-          <w:szCs w:val="20"/>
+        </w:rPr>
+        <w:t>ORGANIZER</w:t>
+      </w:r>
+      <w:r>
+        <w:t xml:space="preserve"> o </w:t>
+      </w:r>
+      <w:r>
+        <w:rPr>
+          <w:rFonts w:ascii="Consolas" w:hAnsi="Consolas"/>
+          <w:color w:val="C0392B"/>
+          <w:sz w:val="20"/>
         </w:rPr>
         <w:t>ADMIN</w:t>
       </w:r>
       <w:r>
-        <w:t xml:space="preserve"> rimasto nel sistema.</w:t>
+        <w:t xml:space="preserve"> può diventare co-organizzatore di un torneo, e l'ultimo organizzatore rimasto non può essere rimosso.</w:t>
       </w:r>
     </w:p>
     <w:p>
@@ -5368,395 +5348,19 @@
         <w:spacing w:after="80" w:line="264" w:lineRule="auto"/>
       </w:pPr>
       <w:r>
-        <w:t>Un utente può modificare solo il proprio profilo; un ADMIN qualsiasi profilo.</w:t>
-      </w:r>
-    </w:p>
-    <w:p>
-      <w:pPr>
-        <w:spacing w:after="120" w:line="276" w:lineRule="auto"/>
-        <w:jc w:val="both"/>
-      </w:pPr>
-      <w:r>
-        <w:t xml:space="preserve">Nel loro insieme queste regole descrivono il ciclo di vita di un torneo: </w:t>
-      </w:r>
-      <w:r>
-        <w:rPr>
-          <w:rFonts w:ascii="Consolas" w:hAnsi="Consolas"/>
+        <w:t xml:space="preserve">Non è possibile declassare l'ultimo </w:t>
+      </w:r>
+      <w:r>
+        <w:rPr>
+          <w:rFonts w:ascii="Consolas" w:eastAsia="Consolas" w:hAnsi="Consolas" w:cs="Consolas"/>
           <w:color w:val="C0392B"/>
           <w:sz w:val="20"/>
-        </w:rPr>
-        <w:t>DRAFT</w:t>
-      </w:r>
-      <w:r>
-        <w:t xml:space="preserve"> (iscrizioni aperte), </w:t>
-      </w:r>
-      <w:r>
-        <w:rPr>
-          <w:rFonts w:ascii="Consolas" w:hAnsi="Consolas"/>
-          <w:color w:val="C0392B"/>
-          <w:sz w:val="20"/>
-        </w:rPr>
-        <w:t>ACTIVE</w:t>
-      </w:r>
-      <w:r>
-        <w:t xml:space="preserve"> (calendario generato, risultati in corso) e </w:t>
-      </w:r>
-      <w:r>
-        <w:rPr>
-          <w:rFonts w:ascii="Consolas" w:hAnsi="Consolas"/>
-          <w:color w:val="C0392B"/>
-          <w:sz w:val="20"/>
-        </w:rPr>
-        <w:t>COMPLETED</w:t>
-      </w:r>
-      <w:r>
-        <w:t xml:space="preserve"> (torneo chiuso, dati consolidati). Ogni violazione produce una risposta </w:t>
-      </w:r>
-      <w:r>
-        <w:rPr>
-          <w:rFonts w:ascii="Consolas" w:hAnsi="Consolas"/>
-          <w:color w:val="C0392B"/>
-          <w:sz w:val="20"/>
-        </w:rPr>
-        <w:t>409 Conflict</w:t>
-      </w:r>
-      <w:r>
-        <w:t xml:space="preserve"> con un messaggio esplicito.</w:t>
-      </w:r>
-    </w:p>
-    <w:p>
-      <w:r>
-        <w:br w:type="page"/>
-      </w:r>
-    </w:p>
-    <w:p>
-      <w:pPr>
-        <w:pStyle w:val="Titolo1"/>
-        <w:keepNext/>
-        <w:spacing w:before="320" w:after="160"/>
-      </w:pPr>
-      <w:bookmarkStart w:id="15" w:name="_Toc241397559"/>
-      <w:r>
-        <w:rPr>
-          <w:b/>
-          <w:bCs/>
-          <w:color w:val="1F4E79"/>
-          <w:sz w:val="30"/>
-          <w:szCs w:val="30"/>
-        </w:rPr>
-        <w:lastRenderedPageBreak/>
-        <w:t>5. Sicurezza</w:t>
-      </w:r>
-      <w:bookmarkEnd w:id="15"/>
-    </w:p>
-    <w:p>
-      <w:pPr>
-        <w:spacing w:after="120" w:line="276" w:lineRule="auto"/>
-        <w:jc w:val="both"/>
-      </w:pPr>
-      <w:r>
-        <w:t xml:space="preserve">L'autenticazione è realizzata con </w:t>
-      </w:r>
-      <w:r>
-        <w:rPr>
-          <w:b/>
-        </w:rPr>
-        <w:t>Spring Security</w:t>
-      </w:r>
-      <w:r>
-        <w:t xml:space="preserve"> e </w:t>
-      </w:r>
-      <w:r>
-        <w:rPr>
-          <w:b/>
-        </w:rPr>
-        <w:t>Spring Authorization Server</w:t>
-      </w:r>
-      <w:r>
-        <w:t xml:space="preserve">, il modulo ufficiale di Spring per emettere e gestire token OAuth2. Al login, verificate le credenziali, il server emette due token: un </w:t>
-      </w:r>
-      <w:r>
-        <w:rPr>
-          <w:b/>
-        </w:rPr>
-        <w:t>access token opaco</w:t>
-      </w:r>
-      <w:r>
-        <w:t xml:space="preserve"> — una stringa casuale che non contiene alcun dato — valido 15 minuti, e un </w:t>
-      </w:r>
-      <w:r>
-        <w:rPr>
-          <w:b/>
-        </w:rPr>
-        <w:t>refresh token</w:t>
-      </w:r>
-      <w:r>
-        <w:t xml:space="preserve"> valido 7 giorni. Il client invia l'access token in ogni richiesta, nell'header </w:t>
-      </w:r>
-      <w:r>
-        <w:rPr>
-          <w:rFonts w:ascii="Consolas" w:hAnsi="Consolas"/>
-          <w:color w:val="C0392B"/>
-          <w:sz w:val="20"/>
-        </w:rPr>
-        <w:t>Authorization: Bearer &lt;token&gt;</w:t>
-      </w:r>
-      <w:r>
-        <w:t>; quando scade, lo rinnova con il refresh token senza dover ripetere il login.</w:t>
-      </w:r>
-    </w:p>
-    <w:p>
-      <w:pPr>
-        <w:spacing w:after="120" w:line="276" w:lineRule="auto"/>
-        <w:jc w:val="both"/>
-      </w:pPr>
-      <w:r>
-        <w:t xml:space="preserve">Le durate e la politica di rinnovo sono definite nelle </w:t>
-      </w:r>
-      <w:r>
-        <w:rPr>
-          <w:rFonts w:ascii="Consolas" w:hAnsi="Consolas"/>
-          <w:color w:val="C0392B"/>
-          <w:sz w:val="20"/>
-        </w:rPr>
-        <w:t>TokenSettings</w:t>
-      </w:r>
-      <w:r>
-        <w:t xml:space="preserve"> del client registrato (</w:t>
-      </w:r>
-      <w:r>
-        <w:rPr>
-          <w:rFonts w:ascii="Consolas" w:hAnsi="Consolas"/>
-          <w:color w:val="C0392B"/>
-          <w:sz w:val="20"/>
-        </w:rPr>
-        <w:t>RegisteredClient</w:t>
-      </w:r>
-      <w:r>
-        <w:t xml:space="preserve">) e sono configurabili da variabili d'ambiente. La </w:t>
-      </w:r>
-      <w:r>
-        <w:rPr>
-          <w:b/>
-        </w:rPr>
-        <w:t>rotazione dei refresh token</w:t>
-      </w:r>
-      <w:r>
-        <w:t xml:space="preserve"> è attiva: ogni rinnovo emette una nuova coppia e invalida la precedente, per cui un refresh token già usato non ha più alcun valore, anche se intercettato. I token sono generati dai componenti dell'Authorization Server, </w:t>
-      </w:r>
-      <w:r>
-        <w:rPr>
-          <w:rFonts w:ascii="Consolas" w:hAnsi="Consolas"/>
-          <w:color w:val="C0392B"/>
-          <w:sz w:val="20"/>
-        </w:rPr>
-        <w:t>OAuth2AccessTokenGenerator</w:t>
-      </w:r>
-      <w:r>
-        <w:t xml:space="preserve"> e </w:t>
-      </w:r>
-      <w:r>
-        <w:rPr>
-          <w:rFonts w:ascii="Consolas" w:hAnsi="Consolas"/>
-          <w:color w:val="C0392B"/>
-          <w:sz w:val="20"/>
-        </w:rPr>
-        <w:t>OAuth2RefreshTokenGenerator</w:t>
-      </w:r>
-      <w:r>
-        <w:t>.</w:t>
-      </w:r>
-    </w:p>
-    <w:p>
-      <w:pPr>
-        <w:spacing w:after="120" w:line="276" w:lineRule="auto"/>
-        <w:jc w:val="both"/>
-      </w:pPr>
-      <w:r>
-        <w:t xml:space="preserve">Sul modello di </w:t>
-      </w:r>
-      <w:r>
-        <w:rPr>
-          <w:b/>
-        </w:rPr>
-        <w:t>Django Knox</w:t>
-      </w:r>
-      <w:r>
-        <w:t xml:space="preserve">, nel database non viene mai salvato un token in chiaro. Il componente </w:t>
-      </w:r>
-      <w:r>
-        <w:rPr>
-          <w:rFonts w:ascii="Consolas" w:hAnsi="Consolas"/>
-          <w:color w:val="C0392B"/>
-          <w:sz w:val="20"/>
-        </w:rPr>
-        <w:t>HashedOAuth2AuthorizationService</w:t>
-      </w:r>
-      <w:r>
-        <w:t xml:space="preserve"> implementa l'interfaccia </w:t>
-      </w:r>
-      <w:r>
-        <w:rPr>
-          <w:rFonts w:ascii="Consolas" w:hAnsi="Consolas"/>
-          <w:color w:val="C0392B"/>
-          <w:sz w:val="20"/>
-        </w:rPr>
-        <w:t>OAuth2AuthorizationService</w:t>
-      </w:r>
-      <w:r>
-        <w:t xml:space="preserve"> dell'Authorization Server e scrive nella tabella </w:t>
-      </w:r>
-      <w:r>
-        <w:rPr>
-          <w:rFonts w:ascii="Consolas" w:hAnsi="Consolas"/>
-          <w:color w:val="C0392B"/>
-          <w:sz w:val="20"/>
-        </w:rPr>
-        <w:t>oauth2_authorizations</w:t>
-      </w:r>
-      <w:r>
-        <w:t xml:space="preserve"> solo l'</w:t>
-      </w:r>
-      <w:r>
-        <w:rPr>
-          <w:b/>
-        </w:rPr>
-        <w:t>hash SHA-512</w:t>
-      </w:r>
-      <w:r>
-        <w:t xml:space="preserve"> di ciascun token; la ricerca avviene calcolando l'hash del token ricevuto. Chi ottenesse una copia del database non potrebbe quindi usare alcun token. Poiché lo stato è conservato sul server, la </w:t>
-      </w:r>
-      <w:r>
-        <w:rPr>
-          <w:b/>
-        </w:rPr>
-        <w:t>revoca è immediata</w:t>
-      </w:r>
-      <w:r>
-        <w:t xml:space="preserve">: il </w:t>
-      </w:r>
-      <w:r>
-        <w:rPr>
-          <w:rFonts w:ascii="Consolas" w:hAnsi="Consolas"/>
-          <w:color w:val="C0392B"/>
-          <w:sz w:val="20"/>
-        </w:rPr>
-        <w:t>logout</w:t>
-      </w:r>
-      <w:r>
-        <w:t xml:space="preserve"> elimina la sessione corrente e il </w:t>
-      </w:r>
-      <w:r>
-        <w:rPr>
-          <w:rFonts w:ascii="Consolas" w:hAnsi="Consolas"/>
-          <w:color w:val="C0392B"/>
-          <w:sz w:val="20"/>
-        </w:rPr>
-        <w:t>logout-all</w:t>
-      </w:r>
-      <w:r>
-        <w:t xml:space="preserve"> tutte le sessioni dell'utente, su ogni dispositivo. Un task programmato (</w:t>
-      </w:r>
-      <w:r>
-        <w:rPr>
-          <w:rFonts w:ascii="Consolas" w:hAnsi="Consolas"/>
-          <w:color w:val="C0392B"/>
-          <w:sz w:val="20"/>
-        </w:rPr>
-        <w:t>ExpiredTokenCleanup</w:t>
-      </w:r>
-      <w:r>
-        <w:t>) elimina ogni ora le autorizzazioni scadute.</w:t>
-      </w:r>
-    </w:p>
-    <w:p>
-      <w:pPr>
-        <w:spacing w:after="120" w:line="276" w:lineRule="auto"/>
-        <w:jc w:val="both"/>
-      </w:pPr>
-      <w:r>
-        <w:t xml:space="preserve">Il backend svolge anche il ruolo di </w:t>
-      </w:r>
-      <w:r>
-        <w:rPr>
-          <w:b/>
-        </w:rPr>
-        <w:t>Resource Server</w:t>
-      </w:r>
-      <w:r>
-        <w:t xml:space="preserve">: il filtro standard di Spring Security estrae il token dall'header e lo passa a </w:t>
-      </w:r>
-      <w:r>
-        <w:rPr>
-          <w:rFonts w:ascii="Consolas" w:hAnsi="Consolas"/>
-          <w:color w:val="C0392B"/>
-          <w:sz w:val="20"/>
-        </w:rPr>
-        <w:t>StoredTokenIntrospector</w:t>
-      </w:r>
-      <w:r>
-        <w:t>, che lo verifica leggendo direttamente il database, senza chiamate HTTP, controlla che non sia scaduto e che l'utente esista ancora, e popola il SecurityContext con l'utente autenticato e i suoi ruoli.</w:t>
-      </w:r>
-    </w:p>
-    <w:p>
-      <w:pPr>
-        <w:spacing w:after="120" w:line="276" w:lineRule="auto"/>
-        <w:jc w:val="both"/>
-      </w:pPr>
-      <w:r>
-        <w:t>Il login e il rinnovo sono esposti come endpoint dell'API (</w:t>
-      </w:r>
-      <w:r>
-        <w:rPr>
-          <w:rFonts w:ascii="Consolas" w:hAnsi="Consolas"/>
-          <w:color w:val="C0392B"/>
-          <w:sz w:val="20"/>
-        </w:rPr>
-        <w:t>/api/auth/login</w:t>
-      </w:r>
-      <w:r>
-        <w:t xml:space="preserve"> e </w:t>
-      </w:r>
-      <w:r>
-        <w:rPr>
-          <w:rFonts w:ascii="Consolas" w:hAnsi="Consolas"/>
-          <w:color w:val="C0392B"/>
-          <w:sz w:val="20"/>
-        </w:rPr>
-        <w:t>/api/auth/refresh</w:t>
-      </w:r>
-      <w:r>
-        <w:t xml:space="preserve">) invece che tramite l'endpoint standard </w:t>
-      </w:r>
-      <w:r>
-        <w:rPr>
-          <w:rFonts w:ascii="Consolas" w:hAnsi="Consolas"/>
-          <w:color w:val="C0392B"/>
-          <w:sz w:val="20"/>
-        </w:rPr>
-        <w:t>/oauth2/token</w:t>
-      </w:r>
-      <w:r>
-        <w:t xml:space="preserve"> dell'Authorization Server. L'endpoint standard richiede infatti l'autenticazione del client con un segreto, che un'applicazione web eseguita nel browser non può custodire; la soluzione adottata usa comunque il modello dei token, i generatori e le impostazioni dell'Authorization Server, e mantiene semplice l'integrazione con il frontend.</w:t>
-      </w:r>
-    </w:p>
-    <w:p>
-      <w:pPr>
-        <w:spacing w:after="120" w:line="276" w:lineRule="auto"/>
-        <w:jc w:val="both"/>
-      </w:pPr>
-      <w:r>
-        <w:t xml:space="preserve">La protezione opera su </w:t>
-      </w:r>
-      <w:r>
-        <w:rPr>
-          <w:b/>
-          <w:bCs/>
-        </w:rPr>
-        <w:t>quattro livelli di accesso</w:t>
-      </w:r>
-      <w:r>
-        <w:t>:</w:t>
+          <w:szCs w:val="20"/>
+        </w:rPr>
+        <w:t>ADMIN</w:t>
+      </w:r>
+      <w:r>
+        <w:t xml:space="preserve"> rimasto nel sistema.</w:t>
       </w:r>
     </w:p>
     <w:p>
@@ -5769,13 +5373,391 @@
         <w:spacing w:after="80" w:line="264" w:lineRule="auto"/>
       </w:pPr>
       <w:r>
+        <w:t>Un utente può modificare solo il proprio profilo; un ADMIN qualsiasi profilo.</w:t>
+      </w:r>
+    </w:p>
+    <w:p>
+      <w:pPr>
+        <w:spacing w:after="120" w:line="276" w:lineRule="auto"/>
+        <w:jc w:val="both"/>
+      </w:pPr>
+      <w:r>
+        <w:t xml:space="preserve">Nel loro insieme queste regole descrivono il ciclo di vita di un torneo: </w:t>
+      </w:r>
+      <w:r>
+        <w:rPr>
+          <w:rFonts w:ascii="Consolas" w:hAnsi="Consolas"/>
+          <w:color w:val="C0392B"/>
+          <w:sz w:val="20"/>
+        </w:rPr>
+        <w:t>DRAFT</w:t>
+      </w:r>
+      <w:r>
+        <w:t xml:space="preserve"> (iscrizioni aperte), </w:t>
+      </w:r>
+      <w:r>
+        <w:rPr>
+          <w:rFonts w:ascii="Consolas" w:hAnsi="Consolas"/>
+          <w:color w:val="C0392B"/>
+          <w:sz w:val="20"/>
+        </w:rPr>
+        <w:t>ACTIVE</w:t>
+      </w:r>
+      <w:r>
+        <w:t xml:space="preserve"> (calendario generato, risultati in corso) e </w:t>
+      </w:r>
+      <w:r>
+        <w:rPr>
+          <w:rFonts w:ascii="Consolas" w:hAnsi="Consolas"/>
+          <w:color w:val="C0392B"/>
+          <w:sz w:val="20"/>
+        </w:rPr>
+        <w:t>COMPLETED</w:t>
+      </w:r>
+      <w:r>
+        <w:t xml:space="preserve"> (torneo chiuso, dati consolidati). Ogni violazione produce una risposta </w:t>
+      </w:r>
+      <w:r>
+        <w:rPr>
+          <w:rFonts w:ascii="Consolas" w:hAnsi="Consolas"/>
+          <w:color w:val="C0392B"/>
+          <w:sz w:val="20"/>
+        </w:rPr>
+        <w:t>409 Conflict</w:t>
+      </w:r>
+      <w:r>
+        <w:t xml:space="preserve"> con un messaggio esplicito.</w:t>
+      </w:r>
+    </w:p>
+    <w:p>
+      <w:pPr>
+        <w:pStyle w:val="Titolo1"/>
+        <w:keepNext/>
+        <w:pageBreakBefore/>
+        <w:spacing w:before="320" w:after="160"/>
+      </w:pPr>
+      <w:bookmarkStart w:id="15" w:name="_Toc241399595"/>
+      <w:r>
         <w:rPr>
           <w:b/>
-        </w:rPr>
-        <w:t>pubblico</w:t>
-      </w:r>
-      <w:r>
-        <w:t xml:space="preserve"> — registrazione, login e rinnovo del token, accessibili senza access token;</w:t>
+          <w:bCs/>
+          <w:color w:val="1F4E79"/>
+          <w:sz w:val="30"/>
+          <w:szCs w:val="30"/>
+        </w:rPr>
+        <w:lastRenderedPageBreak/>
+        <w:t>5. Sicurezza</w:t>
+      </w:r>
+      <w:bookmarkEnd w:id="15"/>
+    </w:p>
+    <w:p>
+      <w:pPr>
+        <w:spacing w:after="120" w:line="276" w:lineRule="auto"/>
+        <w:jc w:val="both"/>
+      </w:pPr>
+      <w:r>
+        <w:t xml:space="preserve">L'autenticazione è realizzata con </w:t>
+      </w:r>
+      <w:r>
+        <w:rPr>
+          <w:b/>
+        </w:rPr>
+        <w:t>Spring Security</w:t>
+      </w:r>
+      <w:r>
+        <w:t xml:space="preserve"> e </w:t>
+      </w:r>
+      <w:r>
+        <w:rPr>
+          <w:b/>
+        </w:rPr>
+        <w:t>Spring Authorization Server</w:t>
+      </w:r>
+      <w:r>
+        <w:t xml:space="preserve">, il modulo ufficiale di Spring per emettere e gestire token OAuth2. Al login, verificate le credenziali, il server emette due token: un </w:t>
+      </w:r>
+      <w:r>
+        <w:rPr>
+          <w:b/>
+        </w:rPr>
+        <w:t>access token opaco</w:t>
+      </w:r>
+      <w:r>
+        <w:t xml:space="preserve"> — una stringa casuale che non contiene alcun dato — valido 15 minuti, e un </w:t>
+      </w:r>
+      <w:r>
+        <w:rPr>
+          <w:b/>
+        </w:rPr>
+        <w:t>refresh token</w:t>
+      </w:r>
+      <w:r>
+        <w:t xml:space="preserve"> valido 7 giorni. Il client invia l'access token in ogni richiesta, nell'header </w:t>
+      </w:r>
+      <w:r>
+        <w:rPr>
+          <w:rFonts w:ascii="Consolas" w:hAnsi="Consolas"/>
+          <w:color w:val="C0392B"/>
+          <w:sz w:val="20"/>
+        </w:rPr>
+        <w:t>Authorization: Bearer &lt;token&gt;</w:t>
+      </w:r>
+      <w:r>
+        <w:t>; quando scade, lo rinnova con il refresh token senza dover ripetere il login.</w:t>
+      </w:r>
+    </w:p>
+    <w:p>
+      <w:pPr>
+        <w:spacing w:after="120" w:line="276" w:lineRule="auto"/>
+        <w:jc w:val="both"/>
+      </w:pPr>
+      <w:r>
+        <w:t xml:space="preserve">Le durate e la politica di rinnovo sono definite nelle </w:t>
+      </w:r>
+      <w:r>
+        <w:rPr>
+          <w:rFonts w:ascii="Consolas" w:hAnsi="Consolas"/>
+          <w:color w:val="C0392B"/>
+          <w:sz w:val="20"/>
+        </w:rPr>
+        <w:t>TokenSettings</w:t>
+      </w:r>
+      <w:r>
+        <w:t xml:space="preserve"> del client registrato (</w:t>
+      </w:r>
+      <w:r>
+        <w:rPr>
+          <w:rFonts w:ascii="Consolas" w:hAnsi="Consolas"/>
+          <w:color w:val="C0392B"/>
+          <w:sz w:val="20"/>
+        </w:rPr>
+        <w:t>RegisteredClient</w:t>
+      </w:r>
+      <w:r>
+        <w:t xml:space="preserve">) e sono configurabili da variabili d'ambiente. La </w:t>
+      </w:r>
+      <w:r>
+        <w:rPr>
+          <w:b/>
+        </w:rPr>
+        <w:t>rotazione dei refresh token</w:t>
+      </w:r>
+      <w:r>
+        <w:t xml:space="preserve"> è attiva: ogni rinnovo emette una nuova coppia e invalida la precedente, per cui un refresh token già usato non ha più alcun valore, anche se intercettato. I token sono generati dai componenti dell'Authorization Server, </w:t>
+      </w:r>
+      <w:r>
+        <w:rPr>
+          <w:rFonts w:ascii="Consolas" w:hAnsi="Consolas"/>
+          <w:color w:val="C0392B"/>
+          <w:sz w:val="20"/>
+        </w:rPr>
+        <w:t>OAuth2AccessTokenGenerator</w:t>
+      </w:r>
+      <w:r>
+        <w:t xml:space="preserve"> e </w:t>
+      </w:r>
+      <w:r>
+        <w:rPr>
+          <w:rFonts w:ascii="Consolas" w:hAnsi="Consolas"/>
+          <w:color w:val="C0392B"/>
+          <w:sz w:val="20"/>
+        </w:rPr>
+        <w:t>OAuth2RefreshTokenGenerator</w:t>
+      </w:r>
+      <w:r>
+        <w:t>.</w:t>
+      </w:r>
+    </w:p>
+    <w:p>
+      <w:pPr>
+        <w:spacing w:after="120" w:line="276" w:lineRule="auto"/>
+        <w:jc w:val="both"/>
+      </w:pPr>
+      <w:r>
+        <w:t xml:space="preserve">Sul modello di </w:t>
+      </w:r>
+      <w:r>
+        <w:rPr>
+          <w:b/>
+        </w:rPr>
+        <w:t>Django Knox</w:t>
+      </w:r>
+      <w:r>
+        <w:t xml:space="preserve">, nel database non viene mai salvato un token in chiaro. Il componente </w:t>
+      </w:r>
+      <w:r>
+        <w:rPr>
+          <w:rFonts w:ascii="Consolas" w:hAnsi="Consolas"/>
+          <w:color w:val="C0392B"/>
+          <w:sz w:val="20"/>
+        </w:rPr>
+        <w:t>HashedOAuth2AuthorizationService</w:t>
+      </w:r>
+      <w:r>
+        <w:t xml:space="preserve"> implementa l'interfaccia </w:t>
+      </w:r>
+      <w:r>
+        <w:rPr>
+          <w:rFonts w:ascii="Consolas" w:hAnsi="Consolas"/>
+          <w:color w:val="C0392B"/>
+          <w:sz w:val="20"/>
+        </w:rPr>
+        <w:t>OAuth2AuthorizationService</w:t>
+      </w:r>
+      <w:r>
+        <w:t xml:space="preserve"> dell'Authorization Server e scrive nella tabella </w:t>
+      </w:r>
+      <w:r>
+        <w:rPr>
+          <w:rFonts w:ascii="Consolas" w:hAnsi="Consolas"/>
+          <w:color w:val="C0392B"/>
+          <w:sz w:val="20"/>
+        </w:rPr>
+        <w:t>oauth2_authorizations</w:t>
+      </w:r>
+      <w:r>
+        <w:t xml:space="preserve"> solo l'</w:t>
+      </w:r>
+      <w:r>
+        <w:rPr>
+          <w:b/>
+        </w:rPr>
+        <w:t>hash SHA-512</w:t>
+      </w:r>
+      <w:r>
+        <w:t xml:space="preserve"> di ciascun token; la ricerca avviene calcolando l'hash del token ricevuto. Chi ottenesse una copia del database non potrebbe quindi usare alcun token. Poiché lo stato è conservato sul server, la </w:t>
+      </w:r>
+      <w:r>
+        <w:rPr>
+          <w:b/>
+        </w:rPr>
+        <w:t>revoca è immediata</w:t>
+      </w:r>
+      <w:r>
+        <w:t xml:space="preserve">: il </w:t>
+      </w:r>
+      <w:r>
+        <w:rPr>
+          <w:rFonts w:ascii="Consolas" w:hAnsi="Consolas"/>
+          <w:color w:val="C0392B"/>
+          <w:sz w:val="20"/>
+        </w:rPr>
+        <w:t>logout</w:t>
+      </w:r>
+      <w:r>
+        <w:t xml:space="preserve"> elimina la sessione corrente e il </w:t>
+      </w:r>
+      <w:r>
+        <w:rPr>
+          <w:rFonts w:ascii="Consolas" w:hAnsi="Consolas"/>
+          <w:color w:val="C0392B"/>
+          <w:sz w:val="20"/>
+        </w:rPr>
+        <w:t>logout-all</w:t>
+      </w:r>
+      <w:r>
+        <w:t xml:space="preserve"> tutte le sessioni dell'utente, su ogni dispositivo. Un task programmato (</w:t>
+      </w:r>
+      <w:r>
+        <w:rPr>
+          <w:rFonts w:ascii="Consolas" w:hAnsi="Consolas"/>
+          <w:color w:val="C0392B"/>
+          <w:sz w:val="20"/>
+        </w:rPr>
+        <w:t>ExpiredTokenCleanup</w:t>
+      </w:r>
+      <w:r>
+        <w:t>) elimina ogni ora le autorizzazioni scadute.</w:t>
+      </w:r>
+    </w:p>
+    <w:p>
+      <w:pPr>
+        <w:spacing w:after="120" w:line="276" w:lineRule="auto"/>
+        <w:jc w:val="both"/>
+      </w:pPr>
+      <w:r>
+        <w:t xml:space="preserve">Il backend svolge anche il ruolo di </w:t>
+      </w:r>
+      <w:r>
+        <w:rPr>
+          <w:b/>
+        </w:rPr>
+        <w:t>Resource Server</w:t>
+      </w:r>
+      <w:r>
+        <w:t xml:space="preserve">: il filtro standard di Spring Security estrae il token dall'header e lo passa a </w:t>
+      </w:r>
+      <w:r>
+        <w:rPr>
+          <w:rFonts w:ascii="Consolas" w:hAnsi="Consolas"/>
+          <w:color w:val="C0392B"/>
+          <w:sz w:val="20"/>
+        </w:rPr>
+        <w:t>StoredTokenIntrospector</w:t>
+      </w:r>
+      <w:r>
+        <w:t>, che lo verifica leggendo direttamente il database, senza chiamate HTTP, controlla che non sia scaduto e che l'utente esista ancora, e popola il SecurityContext con l'utente autenticato e i suoi ruoli.</w:t>
+      </w:r>
+    </w:p>
+    <w:p>
+      <w:pPr>
+        <w:spacing w:after="120" w:line="276" w:lineRule="auto"/>
+        <w:jc w:val="both"/>
+      </w:pPr>
+      <w:r>
+        <w:t>Il login e il rinnovo sono esposti come endpoint dell'API (</w:t>
+      </w:r>
+      <w:r>
+        <w:rPr>
+          <w:rFonts w:ascii="Consolas" w:hAnsi="Consolas"/>
+          <w:color w:val="C0392B"/>
+          <w:sz w:val="20"/>
+        </w:rPr>
+        <w:t>/api/auth/login</w:t>
+      </w:r>
+      <w:r>
+        <w:t xml:space="preserve"> e </w:t>
+      </w:r>
+      <w:r>
+        <w:rPr>
+          <w:rFonts w:ascii="Consolas" w:hAnsi="Consolas"/>
+          <w:color w:val="C0392B"/>
+          <w:sz w:val="20"/>
+        </w:rPr>
+        <w:t>/api/auth/refresh</w:t>
+      </w:r>
+      <w:r>
+        <w:t xml:space="preserve">) invece che tramite l'endpoint standard </w:t>
+      </w:r>
+      <w:r>
+        <w:rPr>
+          <w:rFonts w:ascii="Consolas" w:hAnsi="Consolas"/>
+          <w:color w:val="C0392B"/>
+          <w:sz w:val="20"/>
+        </w:rPr>
+        <w:t>/oauth2/token</w:t>
+      </w:r>
+      <w:r>
+        <w:t xml:space="preserve"> dell'Authorization Server. L'endpoint standard richiede infatti l'autenticazione del client con un segreto, che un'applicazione web eseguita nel browser non può custodire; la soluzione adottata usa comunque il modello dei token, i generatori e le impostazioni dell'Authorization Server, e mantiene semplice l'integrazione con il frontend.</w:t>
+      </w:r>
+    </w:p>
+    <w:p>
+      <w:pPr>
+        <w:spacing w:after="120" w:line="276" w:lineRule="auto"/>
+        <w:jc w:val="both"/>
+      </w:pPr>
+      <w:r>
+        <w:t xml:space="preserve">La protezione opera su </w:t>
+      </w:r>
+      <w:r>
+        <w:rPr>
+          <w:b/>
+          <w:bCs/>
+        </w:rPr>
+        <w:t>quattro livelli di accesso</w:t>
+      </w:r>
+      <w:r>
+        <w:t>:</w:t>
       </w:r>
     </w:p>
     <w:p>
@@ -5790,12 +5772,11 @@
       <w:r>
         <w:rPr>
           <w:b/>
-          <w:bCs/>
-        </w:rPr>
-        <w:t>autenticato</w:t>
-      </w:r>
-      <w:r>
-        <w:t xml:space="preserve"> — la maggior parte delle letture, accessibili a qualunque utente con token valido;</w:t>
+        </w:rPr>
+        <w:t>pubblico</w:t>
+      </w:r>
+      <w:r>
+        <w:t xml:space="preserve"> — registrazione, login e rinnovo del token, accessibili senza access token;</w:t>
       </w:r>
     </w:p>
     <w:p>
@@ -5812,22 +5793,10 @@
           <w:b/>
           <w:bCs/>
         </w:rPr>
-        <w:t>basato su ruolo</w:t>
-      </w:r>
-      <w:r>
-        <w:t xml:space="preserve"> — operazioni sensibili riservate a ADMIN o ORGANIZER tramite l'annotazione </w:t>
-      </w:r>
-      <w:r>
-        <w:rPr>
-          <w:rFonts w:ascii="Consolas" w:eastAsia="Consolas" w:hAnsi="Consolas" w:cs="Consolas"/>
-          <w:color w:val="C0392B"/>
-          <w:sz w:val="20"/>
-          <w:szCs w:val="20"/>
-        </w:rPr>
-        <w:t>@PreAuthorize</w:t>
-      </w:r>
-      <w:r>
-        <w:t>.</w:t>
+        <w:t>autenticato</w:t>
+      </w:r>
+      <w:r>
+        <w:t xml:space="preserve"> — la maggior parte delle letture, accessibili a qualunque utente con token valido;</w:t>
       </w:r>
     </w:p>
     <w:p>
@@ -5842,6 +5811,38 @@
       <w:r>
         <w:rPr>
           <w:b/>
+          <w:bCs/>
+        </w:rPr>
+        <w:t>basato su ruolo</w:t>
+      </w:r>
+      <w:r>
+        <w:t xml:space="preserve"> — operazioni sensibili riservate a ADMIN o ORGANIZER tramite l'annotazione </w:t>
+      </w:r>
+      <w:r>
+        <w:rPr>
+          <w:rFonts w:ascii="Consolas" w:eastAsia="Consolas" w:hAnsi="Consolas" w:cs="Consolas"/>
+          <w:color w:val="C0392B"/>
+          <w:sz w:val="20"/>
+          <w:szCs w:val="20"/>
+        </w:rPr>
+        <w:t>@PreAuthorize</w:t>
+      </w:r>
+      <w:r>
+        <w:t>.</w:t>
+      </w:r>
+    </w:p>
+    <w:p>
+      <w:pPr>
+        <w:pStyle w:val="Paragrafoelenco"/>
+        <w:numPr>
+          <w:ilvl w:val="0"/>
+          <w:numId w:val="1"/>
+        </w:numPr>
+        <w:spacing w:after="80" w:line="264" w:lineRule="auto"/>
+      </w:pPr>
+      <w:r>
+        <w:rPr>
+          <w:b/>
         </w:rPr>
         <w:t>basato sulla risorsa</w:t>
       </w:r>
@@ -6142,7 +6143,7 @@
         <w:keepNext/>
         <w:spacing w:before="320" w:after="160"/>
       </w:pPr>
-      <w:bookmarkStart w:id="16" w:name="_Toc241397560"/>
+      <w:bookmarkStart w:id="16" w:name="_Toc241399596"/>
       <w:r>
         <w:rPr>
           <w:b/>
@@ -7362,12 +7363,10 @@
       <w:pPr>
         <w:pStyle w:val="Titolo1"/>
         <w:keepNext/>
+        <w:pageBreakBefore/>
         <w:spacing w:before="320" w:after="160"/>
       </w:pPr>
-      <w:r>
-        <w:br w:type="page"/>
-      </w:r>
-      <w:bookmarkStart w:id="17" w:name="_Toc241397561"/>
+      <w:bookmarkStart w:id="17" w:name="_Toc241399597"/>
       <w:r>
         <w:rPr>
           <w:b/>
@@ -7391,7 +7390,7 @@
         <w:rPr>
           <w:b/>
         </w:rPr>
-        <w:t>157 test</w:t>
+        <w:t>166 test</w:t>
       </w:r>
       <w:r>
         <w:t>, tutti superati, con una copertura del codice (</w:t>
@@ -7409,7 +7408,7 @@
         <w:rPr>
           <w:b/>
         </w:rPr>
-        <w:t>92%</w:t>
+        <w:t>93%</w:t>
       </w:r>
       <w:r>
         <w:t xml:space="preserve"> — ampiamente superiore al minimo del 35% richiesto. Sono esclusi dalla misurazione solo i package </w:t>
@@ -7536,7 +7535,7 @@
         <w:keepNext/>
         <w:spacing w:before="240" w:after="120"/>
       </w:pPr>
-      <w:bookmarkStart w:id="18" w:name="_Toc241397562"/>
+      <w:bookmarkStart w:id="18" w:name="_Toc241399598"/>
       <w:r>
         <w:rPr>
           <w:b/>
@@ -7954,7 +7953,7 @@
                 <w:sz w:val="20"/>
                 <w:szCs w:val="20"/>
               </w:rPr>
-              <w:t>79%</w:t>
+              <w:t>81%</w:t>
             </w:r>
           </w:p>
         </w:tc>
@@ -8004,7 +8003,7 @@
                 <w:sz w:val="20"/>
                 <w:szCs w:val="20"/>
               </w:rPr>
-              <w:t>92%</w:t>
+              <w:t>93%</w:t>
             </w:r>
           </w:p>
         </w:tc>
@@ -8021,7 +8020,7 @@
           <w:sz w:val="25"/>
         </w:rPr>
       </w:pPr>
-      <w:bookmarkStart w:id="19" w:name="_Toc241397563"/>
+      <w:bookmarkStart w:id="19" w:name="_Toc241399599"/>
       <w:r>
         <w:rPr>
           <w:b/>
@@ -8067,7 +8066,7 @@
         <w:keepNext/>
         <w:spacing w:before="320" w:after="160"/>
       </w:pPr>
-      <w:bookmarkStart w:id="20" w:name="_Toc241397564"/>
+      <w:bookmarkStart w:id="20" w:name="_Toc241399600"/>
       <w:r>
         <w:rPr>
           <w:b/>
@@ -8240,7 +8239,18 @@
         <w:t>.env</w:t>
       </w:r>
       <w:r>
-        <w:t>. Anche le porte esposte sono configurabili, così da evitare conflitti con altri servizi già attivi sulla macchina.</w:t>
+        <w:t xml:space="preserve">. Il </w:t>
+      </w:r>
+      <w:r>
+        <w:rPr>
+          <w:rFonts w:ascii="Consolas" w:hAnsi="Consolas"/>
+          <w:color w:val="C0392B"/>
+          <w:sz w:val="20"/>
+        </w:rPr>
+        <w:t>docker-compose.yml</w:t>
+      </w:r>
+      <w:r>
+        <w:t xml:space="preserve"> inoltra al container tutte le impostazioni configurabili — credenziali del database, durata dei token, origini CORS del frontend, limiti del rate limit e attivazione di Swagger — e anche le porte esposte sono configurabili, così da evitare conflitti con altri servizi già attivi sulla macchina.</w:t>
       </w:r>
     </w:p>
     <w:p>
@@ -8249,7 +8259,7 @@
         <w:keepNext/>
         <w:spacing w:before="320" w:after="160"/>
       </w:pPr>
-      <w:bookmarkStart w:id="21" w:name="_Toc241397565"/>
+      <w:bookmarkStart w:id="21" w:name="_Toc241399601"/>
       <w:r>
         <w:rPr>
           <w:b/>

</xml_diff>

<commit_message>
feat: team ownership, profile phone privacy and proxy-aware rate limit - 171 tests
</commit_message>
<xml_diff>
--- a/Relazione Tecnica LeagueMate.docx
+++ b/Relazione Tecnica LeagueMate.docx
@@ -112,7 +112,7 @@
         <w:pageBreakBefore/>
         <w:spacing w:before="320" w:after="160"/>
       </w:pPr>
-      <w:bookmarkStart w:id="0" w:name="_Toc241399580"/>
+      <w:bookmarkStart w:id="0" w:name="_Toc241438808"/>
       <w:r>
         <w:rPr>
           <w:b/>
@@ -158,7 +158,7 @@
           <w:r>
             <w:fldChar w:fldCharType="separate"/>
           </w:r>
-          <w:hyperlink w:anchor="_Toc241399580" w:history="1">
+          <w:hyperlink w:anchor="_Toc241438808" w:history="1">
             <w:r>
               <w:rPr>
                 <w:rStyle w:val="Collegamentoipertestuale"/>
@@ -184,7 +184,7 @@
               <w:rPr>
                 <w:noProof/>
               </w:rPr>
-              <w:instrText xml:space="preserve"> PAGEREF _Toc241399580 \h </w:instrText>
+              <w:instrText xml:space="preserve"> PAGEREF _Toc241438808 \h </w:instrText>
             </w:r>
             <w:r>
               <w:rPr>
@@ -227,7 +227,7 @@
               <w14:ligatures w14:val="standardContextual"/>
             </w:rPr>
           </w:pPr>
-          <w:hyperlink w:anchor="_Toc241399581" w:history="1">
+          <w:hyperlink w:anchor="_Toc241438809" w:history="1">
             <w:r>
               <w:rPr>
                 <w:rStyle w:val="Collegamentoipertestuale"/>
@@ -253,7 +253,7 @@
               <w:rPr>
                 <w:noProof/>
               </w:rPr>
-              <w:instrText xml:space="preserve"> PAGEREF _Toc241399581 \h </w:instrText>
+              <w:instrText xml:space="preserve"> PAGEREF _Toc241438809 \h </w:instrText>
             </w:r>
             <w:r>
               <w:rPr>
@@ -296,7 +296,7 @@
               <w14:ligatures w14:val="standardContextual"/>
             </w:rPr>
           </w:pPr>
-          <w:hyperlink w:anchor="_Toc241399582" w:history="1">
+          <w:hyperlink w:anchor="_Toc241438810" w:history="1">
             <w:r>
               <w:rPr>
                 <w:rStyle w:val="Collegamentoipertestuale"/>
@@ -322,7 +322,7 @@
               <w:rPr>
                 <w:noProof/>
               </w:rPr>
-              <w:instrText xml:space="preserve"> PAGEREF _Toc241399582 \h </w:instrText>
+              <w:instrText xml:space="preserve"> PAGEREF _Toc241438810 \h </w:instrText>
             </w:r>
             <w:r>
               <w:rPr>
@@ -365,7 +365,7 @@
               <w14:ligatures w14:val="standardContextual"/>
             </w:rPr>
           </w:pPr>
-          <w:hyperlink w:anchor="_Toc241399583" w:history="1">
+          <w:hyperlink w:anchor="_Toc241438811" w:history="1">
             <w:r>
               <w:rPr>
                 <w:rStyle w:val="Collegamentoipertestuale"/>
@@ -391,7 +391,7 @@
               <w:rPr>
                 <w:noProof/>
               </w:rPr>
-              <w:instrText xml:space="preserve"> PAGEREF _Toc241399583 \h </w:instrText>
+              <w:instrText xml:space="preserve"> PAGEREF _Toc241438811 \h </w:instrText>
             </w:r>
             <w:r>
               <w:rPr>
@@ -434,7 +434,7 @@
               <w14:ligatures w14:val="standardContextual"/>
             </w:rPr>
           </w:pPr>
-          <w:hyperlink w:anchor="_Toc241399584" w:history="1">
+          <w:hyperlink w:anchor="_Toc241438812" w:history="1">
             <w:r>
               <w:rPr>
                 <w:rStyle w:val="Collegamentoipertestuale"/>
@@ -460,7 +460,7 @@
               <w:rPr>
                 <w:noProof/>
               </w:rPr>
-              <w:instrText xml:space="preserve"> PAGEREF _Toc241399584 \h </w:instrText>
+              <w:instrText xml:space="preserve"> PAGEREF _Toc241438812 \h </w:instrText>
             </w:r>
             <w:r>
               <w:rPr>
@@ -503,7 +503,7 @@
               <w14:ligatures w14:val="standardContextual"/>
             </w:rPr>
           </w:pPr>
-          <w:hyperlink w:anchor="_Toc241399585" w:history="1">
+          <w:hyperlink w:anchor="_Toc241438813" w:history="1">
             <w:r>
               <w:rPr>
                 <w:rStyle w:val="Collegamentoipertestuale"/>
@@ -528,7 +528,7 @@
               <w:rPr>
                 <w:noProof/>
               </w:rPr>
-              <w:instrText xml:space="preserve"> PAGEREF _Toc241399585 \h </w:instrText>
+              <w:instrText xml:space="preserve"> PAGEREF _Toc241438813 \h </w:instrText>
             </w:r>
             <w:r>
               <w:rPr>
@@ -571,7 +571,7 @@
               <w14:ligatures w14:val="standardContextual"/>
             </w:rPr>
           </w:pPr>
-          <w:hyperlink w:anchor="_Toc241399586" w:history="1">
+          <w:hyperlink w:anchor="_Toc241438814" w:history="1">
             <w:r>
               <w:rPr>
                 <w:rStyle w:val="Collegamentoipertestuale"/>
@@ -597,7 +597,7 @@
               <w:rPr>
                 <w:noProof/>
               </w:rPr>
-              <w:instrText xml:space="preserve"> PAGEREF _Toc241399586 \h </w:instrText>
+              <w:instrText xml:space="preserve"> PAGEREF _Toc241438814 \h </w:instrText>
             </w:r>
             <w:r>
               <w:rPr>
@@ -640,7 +640,7 @@
               <w14:ligatures w14:val="standardContextual"/>
             </w:rPr>
           </w:pPr>
-          <w:hyperlink w:anchor="_Toc241399587" w:history="1">
+          <w:hyperlink w:anchor="_Toc241438815" w:history="1">
             <w:r>
               <w:rPr>
                 <w:rStyle w:val="Collegamentoipertestuale"/>
@@ -666,7 +666,7 @@
               <w:rPr>
                 <w:noProof/>
               </w:rPr>
-              <w:instrText xml:space="preserve"> PAGEREF _Toc241399587 \h </w:instrText>
+              <w:instrText xml:space="preserve"> PAGEREF _Toc241438815 \h </w:instrText>
             </w:r>
             <w:r>
               <w:rPr>
@@ -709,7 +709,7 @@
               <w14:ligatures w14:val="standardContextual"/>
             </w:rPr>
           </w:pPr>
-          <w:hyperlink w:anchor="_Toc241399588" w:history="1">
+          <w:hyperlink w:anchor="_Toc241438816" w:history="1">
             <w:r>
               <w:rPr>
                 <w:rStyle w:val="Collegamentoipertestuale"/>
@@ -735,7 +735,7 @@
               <w:rPr>
                 <w:noProof/>
               </w:rPr>
-              <w:instrText xml:space="preserve"> PAGEREF _Toc241399588 \h </w:instrText>
+              <w:instrText xml:space="preserve"> PAGEREF _Toc241438816 \h </w:instrText>
             </w:r>
             <w:r>
               <w:rPr>
@@ -778,7 +778,7 @@
               <w14:ligatures w14:val="standardContextual"/>
             </w:rPr>
           </w:pPr>
-          <w:hyperlink w:anchor="_Toc241399589" w:history="1">
+          <w:hyperlink w:anchor="_Toc241438817" w:history="1">
             <w:r>
               <w:rPr>
                 <w:rStyle w:val="Collegamentoipertestuale"/>
@@ -803,7 +803,7 @@
               <w:rPr>
                 <w:noProof/>
               </w:rPr>
-              <w:instrText xml:space="preserve"> PAGEREF _Toc241399589 \h </w:instrText>
+              <w:instrText xml:space="preserve"> PAGEREF _Toc241438817 \h </w:instrText>
             </w:r>
             <w:r>
               <w:rPr>
@@ -846,7 +846,7 @@
               <w14:ligatures w14:val="standardContextual"/>
             </w:rPr>
           </w:pPr>
-          <w:hyperlink w:anchor="_Toc241399590" w:history="1">
+          <w:hyperlink w:anchor="_Toc241438818" w:history="1">
             <w:r>
               <w:rPr>
                 <w:rStyle w:val="Collegamentoipertestuale"/>
@@ -872,7 +872,7 @@
               <w:rPr>
                 <w:noProof/>
               </w:rPr>
-              <w:instrText xml:space="preserve"> PAGEREF _Toc241399590 \h </w:instrText>
+              <w:instrText xml:space="preserve"> PAGEREF _Toc241438818 \h </w:instrText>
             </w:r>
             <w:r>
               <w:rPr>
@@ -915,7 +915,7 @@
               <w14:ligatures w14:val="standardContextual"/>
             </w:rPr>
           </w:pPr>
-          <w:hyperlink w:anchor="_Toc241399591" w:history="1">
+          <w:hyperlink w:anchor="_Toc241438819" w:history="1">
             <w:r>
               <w:rPr>
                 <w:rStyle w:val="Collegamentoipertestuale"/>
@@ -941,7 +941,7 @@
               <w:rPr>
                 <w:noProof/>
               </w:rPr>
-              <w:instrText xml:space="preserve"> PAGEREF _Toc241399591 \h </w:instrText>
+              <w:instrText xml:space="preserve"> PAGEREF _Toc241438819 \h </w:instrText>
             </w:r>
             <w:r>
               <w:rPr>
@@ -984,7 +984,7 @@
               <w14:ligatures w14:val="standardContextual"/>
             </w:rPr>
           </w:pPr>
-          <w:hyperlink w:anchor="_Toc241399592" w:history="1">
+          <w:hyperlink w:anchor="_Toc241438820" w:history="1">
             <w:r>
               <w:rPr>
                 <w:rStyle w:val="Collegamentoipertestuale"/>
@@ -1010,7 +1010,7 @@
               <w:rPr>
                 <w:noProof/>
               </w:rPr>
-              <w:instrText xml:space="preserve"> PAGEREF _Toc241399592 \h </w:instrText>
+              <w:instrText xml:space="preserve"> PAGEREF _Toc241438820 \h </w:instrText>
             </w:r>
             <w:r>
               <w:rPr>
@@ -1053,7 +1053,7 @@
               <w14:ligatures w14:val="standardContextual"/>
             </w:rPr>
           </w:pPr>
-          <w:hyperlink w:anchor="_Toc241399593" w:history="1">
+          <w:hyperlink w:anchor="_Toc241438821" w:history="1">
             <w:r>
               <w:rPr>
                 <w:rStyle w:val="Collegamentoipertestuale"/>
@@ -1079,7 +1079,7 @@
               <w:rPr>
                 <w:noProof/>
               </w:rPr>
-              <w:instrText xml:space="preserve"> PAGEREF _Toc241399593 \h </w:instrText>
+              <w:instrText xml:space="preserve"> PAGEREF _Toc241438821 \h </w:instrText>
             </w:r>
             <w:r>
               <w:rPr>
@@ -1122,7 +1122,7 @@
               <w14:ligatures w14:val="standardContextual"/>
             </w:rPr>
           </w:pPr>
-          <w:hyperlink w:anchor="_Toc241399594" w:history="1">
+          <w:hyperlink w:anchor="_Toc241438822" w:history="1">
             <w:r>
               <w:rPr>
                 <w:rStyle w:val="Collegamentoipertestuale"/>
@@ -1148,7 +1148,7 @@
               <w:rPr>
                 <w:noProof/>
               </w:rPr>
-              <w:instrText xml:space="preserve"> PAGEREF _Toc241399594 \h </w:instrText>
+              <w:instrText xml:space="preserve"> PAGEREF _Toc241438822 \h </w:instrText>
             </w:r>
             <w:r>
               <w:rPr>
@@ -1191,7 +1191,7 @@
               <w14:ligatures w14:val="standardContextual"/>
             </w:rPr>
           </w:pPr>
-          <w:hyperlink w:anchor="_Toc241399595" w:history="1">
+          <w:hyperlink w:anchor="_Toc241438823" w:history="1">
             <w:r>
               <w:rPr>
                 <w:rStyle w:val="Collegamentoipertestuale"/>
@@ -1217,7 +1217,7 @@
               <w:rPr>
                 <w:noProof/>
               </w:rPr>
-              <w:instrText xml:space="preserve"> PAGEREF _Toc241399595 \h </w:instrText>
+              <w:instrText xml:space="preserve"> PAGEREF _Toc241438823 \h </w:instrText>
             </w:r>
             <w:r>
               <w:rPr>
@@ -1234,7 +1234,7 @@
               <w:rPr>
                 <w:noProof/>
               </w:rPr>
-              <w:t>9</w:t>
+              <w:t>10</w:t>
             </w:r>
             <w:r>
               <w:rPr>
@@ -1260,7 +1260,7 @@
               <w14:ligatures w14:val="standardContextual"/>
             </w:rPr>
           </w:pPr>
-          <w:hyperlink w:anchor="_Toc241399596" w:history="1">
+          <w:hyperlink w:anchor="_Toc241438824" w:history="1">
             <w:r>
               <w:rPr>
                 <w:rStyle w:val="Collegamentoipertestuale"/>
@@ -1286,7 +1286,7 @@
               <w:rPr>
                 <w:noProof/>
               </w:rPr>
-              <w:instrText xml:space="preserve"> PAGEREF _Toc241399596 \h </w:instrText>
+              <w:instrText xml:space="preserve"> PAGEREF _Toc241438824 \h </w:instrText>
             </w:r>
             <w:r>
               <w:rPr>
@@ -1303,7 +1303,7 @@
               <w:rPr>
                 <w:noProof/>
               </w:rPr>
-              <w:t>10</w:t>
+              <w:t>11</w:t>
             </w:r>
             <w:r>
               <w:rPr>
@@ -1329,7 +1329,7 @@
               <w14:ligatures w14:val="standardContextual"/>
             </w:rPr>
           </w:pPr>
-          <w:hyperlink w:anchor="_Toc241399597" w:history="1">
+          <w:hyperlink w:anchor="_Toc241438825" w:history="1">
             <w:r>
               <w:rPr>
                 <w:rStyle w:val="Collegamentoipertestuale"/>
@@ -1354,7 +1354,7 @@
               <w:rPr>
                 <w:noProof/>
               </w:rPr>
-              <w:instrText xml:space="preserve"> PAGEREF _Toc241399597 \h </w:instrText>
+              <w:instrText xml:space="preserve"> PAGEREF _Toc241438825 \h </w:instrText>
             </w:r>
             <w:r>
               <w:rPr>
@@ -1371,7 +1371,7 @@
               <w:rPr>
                 <w:noProof/>
               </w:rPr>
-              <w:t>12</w:t>
+              <w:t>13</w:t>
             </w:r>
             <w:r>
               <w:rPr>
@@ -1397,7 +1397,7 @@
               <w14:ligatures w14:val="standardContextual"/>
             </w:rPr>
           </w:pPr>
-          <w:hyperlink w:anchor="_Toc241399598" w:history="1">
+          <w:hyperlink w:anchor="_Toc241438826" w:history="1">
             <w:r>
               <w:rPr>
                 <w:rStyle w:val="Collegamentoipertestuale"/>
@@ -1423,7 +1423,7 @@
               <w:rPr>
                 <w:noProof/>
               </w:rPr>
-              <w:instrText xml:space="preserve"> PAGEREF _Toc241399598 \h </w:instrText>
+              <w:instrText xml:space="preserve"> PAGEREF _Toc241438826 \h </w:instrText>
             </w:r>
             <w:r>
               <w:rPr>
@@ -1440,7 +1440,7 @@
               <w:rPr>
                 <w:noProof/>
               </w:rPr>
-              <w:t>12</w:t>
+              <w:t>13</w:t>
             </w:r>
             <w:r>
               <w:rPr>
@@ -1466,7 +1466,7 @@
               <w14:ligatures w14:val="standardContextual"/>
             </w:rPr>
           </w:pPr>
-          <w:hyperlink w:anchor="_Toc241399599" w:history="1">
+          <w:hyperlink w:anchor="_Toc241438827" w:history="1">
             <w:r>
               <w:rPr>
                 <w:rStyle w:val="Collegamentoipertestuale"/>
@@ -1491,7 +1491,7 @@
               <w:rPr>
                 <w:noProof/>
               </w:rPr>
-              <w:instrText xml:space="preserve"> PAGEREF _Toc241399599 \h </w:instrText>
+              <w:instrText xml:space="preserve"> PAGEREF _Toc241438827 \h </w:instrText>
             </w:r>
             <w:r>
               <w:rPr>
@@ -1508,7 +1508,7 @@
               <w:rPr>
                 <w:noProof/>
               </w:rPr>
-              <w:t>12</w:t>
+              <w:t>13</w:t>
             </w:r>
             <w:r>
               <w:rPr>
@@ -1534,7 +1534,7 @@
               <w14:ligatures w14:val="standardContextual"/>
             </w:rPr>
           </w:pPr>
-          <w:hyperlink w:anchor="_Toc241399600" w:history="1">
+          <w:hyperlink w:anchor="_Toc241438828" w:history="1">
             <w:r>
               <w:rPr>
                 <w:rStyle w:val="Collegamentoipertestuale"/>
@@ -1560,7 +1560,7 @@
               <w:rPr>
                 <w:noProof/>
               </w:rPr>
-              <w:instrText xml:space="preserve"> PAGEREF _Toc241399600 \h </w:instrText>
+              <w:instrText xml:space="preserve"> PAGEREF _Toc241438828 \h </w:instrText>
             </w:r>
             <w:r>
               <w:rPr>
@@ -1577,7 +1577,7 @@
               <w:rPr>
                 <w:noProof/>
               </w:rPr>
-              <w:t>13</w:t>
+              <w:t>14</w:t>
             </w:r>
             <w:r>
               <w:rPr>
@@ -1603,7 +1603,7 @@
               <w14:ligatures w14:val="standardContextual"/>
             </w:rPr>
           </w:pPr>
-          <w:hyperlink w:anchor="_Toc241399601" w:history="1">
+          <w:hyperlink w:anchor="_Toc241438829" w:history="1">
             <w:r>
               <w:rPr>
                 <w:rStyle w:val="Collegamentoipertestuale"/>
@@ -1629,7 +1629,7 @@
               <w:rPr>
                 <w:noProof/>
               </w:rPr>
-              <w:instrText xml:space="preserve"> PAGEREF _Toc241399601 \h </w:instrText>
+              <w:instrText xml:space="preserve"> PAGEREF _Toc241438829 \h </w:instrText>
             </w:r>
             <w:r>
               <w:rPr>
@@ -1646,7 +1646,7 @@
               <w:rPr>
                 <w:noProof/>
               </w:rPr>
-              <w:t>13</w:t>
+              <w:t>14</w:t>
             </w:r>
             <w:r>
               <w:rPr>
@@ -1670,7 +1670,7 @@
         <w:pageBreakBefore/>
         <w:spacing w:before="320" w:after="160"/>
       </w:pPr>
-      <w:bookmarkStart w:id="1" w:name="_Toc241399581"/>
+      <w:bookmarkStart w:id="1" w:name="_Toc241438809"/>
       <w:r>
         <w:rPr>
           <w:b/>
@@ -1817,7 +1817,7 @@
         <w:keepNext/>
         <w:spacing w:before="320" w:after="160"/>
       </w:pPr>
-      <w:bookmarkStart w:id="2" w:name="_Toc241399582"/>
+      <w:bookmarkStart w:id="2" w:name="_Toc241438810"/>
       <w:r>
         <w:rPr>
           <w:b/>
@@ -1905,7 +1905,7 @@
         <w:keepNext/>
         <w:spacing w:before="240" w:after="120"/>
       </w:pPr>
-      <w:bookmarkStart w:id="3" w:name="_Toc241399583"/>
+      <w:bookmarkStart w:id="3" w:name="_Toc241438811"/>
       <w:r>
         <w:rPr>
           <w:b/>
@@ -2435,7 +2435,7 @@
                 <w:sz w:val="20"/>
                 <w:szCs w:val="20"/>
               </w:rPr>
-              <w:t>Authorization Server, token opachi, rate limit sul login, autorizzazione sui tornei, CORS, configurazione di sicurezza</w:t>
+              <w:t>Authorization Server, token opachi, rate limit sul login, ownership di tornei e squadre, CORS, configurazione di sicurezza</w:t>
             </w:r>
           </w:p>
         </w:tc>
@@ -2553,7 +2553,7 @@
         <w:keepNext/>
         <w:spacing w:before="240" w:after="120"/>
       </w:pPr>
-      <w:bookmarkStart w:id="4" w:name="_Toc241399584"/>
+      <w:bookmarkStart w:id="4" w:name="_Toc241438812"/>
       <w:r>
         <w:rPr>
           <w:b/>
@@ -2864,7 +2864,7 @@
                 <w:sz w:val="20"/>
                 <w:szCs w:val="20"/>
               </w:rPr>
-              <w:t>CRUD squadre</w:t>
+              <w:t>CRUD squadre con proprietario</w:t>
             </w:r>
           </w:p>
         </w:tc>
@@ -2988,7 +2988,7 @@
           <w:sz w:val="25"/>
         </w:rPr>
       </w:pPr>
-      <w:bookmarkStart w:id="5" w:name="_Toc241399585"/>
+      <w:bookmarkStart w:id="5" w:name="_Toc241438813"/>
       <w:r>
         <w:rPr>
           <w:b/>
@@ -3163,7 +3163,7 @@
         <w:keepNext/>
         <w:spacing w:before="320" w:after="160"/>
       </w:pPr>
-      <w:bookmarkStart w:id="6" w:name="_Toc241399586"/>
+      <w:bookmarkStart w:id="6" w:name="_Toc241438814"/>
       <w:r>
         <w:rPr>
           <w:b/>
@@ -3201,7 +3201,7 @@
         <w:keepNext/>
         <w:spacing w:before="240" w:after="120"/>
       </w:pPr>
-      <w:bookmarkStart w:id="7" w:name="_Toc241399587"/>
+      <w:bookmarkStart w:id="7" w:name="_Toc241438815"/>
       <w:r>
         <w:rPr>
           <w:b/>
@@ -3784,7 +3784,7 @@
         <w:keepNext/>
         <w:spacing w:before="240" w:after="120"/>
       </w:pPr>
-      <w:bookmarkStart w:id="8" w:name="_Toc241399588"/>
+      <w:bookmarkStart w:id="8" w:name="_Toc241438816"/>
       <w:r>
         <w:rPr>
           <w:b/>
@@ -4472,7 +4472,7 @@
           <w:sz w:val="25"/>
         </w:rPr>
       </w:pPr>
-      <w:bookmarkStart w:id="9" w:name="_Toc241399589"/>
+      <w:bookmarkStart w:id="9" w:name="_Toc241438817"/>
       <w:r>
         <w:rPr>
           <w:b/>
@@ -4554,6 +4554,17 @@
         <w:t>V4__oauth2_authorizations.sql</w:t>
       </w:r>
       <w:r>
+        <w:t xml:space="preserve">, </w:t>
+      </w:r>
+      <w:r>
+        <w:rPr>
+          <w:rFonts w:ascii="Consolas" w:hAnsi="Consolas"/>
+          <w:color w:val="C0392B"/>
+          <w:sz w:val="20"/>
+        </w:rPr>
+        <w:t>V5__add_team_owner.sql</w:t>
+      </w:r>
+      <w:r>
         <w:t xml:space="preserve">), applicato automaticamente all'avvio in ordine di versione. Flyway registra nella tabella </w:t>
       </w:r>
       <w:r>
@@ -4565,7 +4576,7 @@
         <w:t>flyway_schema_history</w:t>
       </w:r>
       <w:r>
-        <w:t xml:space="preserve"> quali migrazioni sono già state eseguite, per cui ogni database — di sviluppo, di test o di produzione — si trova sempre nello stesso stato. L'ultima migrazione crea la tabella delle autorizzazioni usata dall'autenticazione, descritta nel capitolo 5.</w:t>
+        <w:t xml:space="preserve"> quali migrazioni sono già state eseguite, per cui ogni database — di sviluppo, di test o di produzione — si trova sempre nello stesso stato. La V4 crea la tabella delle autorizzazioni usata dall'autenticazione, descritta nel capitolo 5; la V5 aggiunge il proprietario delle squadre. Una migrazione già applicata non viene mai modificata: ogni cambiamento dello schema è una nuova versione.</w:t>
       </w:r>
     </w:p>
     <w:p>
@@ -4614,7 +4625,7 @@
         <w:keepNext/>
         <w:spacing w:before="320" w:after="160"/>
       </w:pPr>
-      <w:bookmarkStart w:id="10" w:name="_Toc241399590"/>
+      <w:bookmarkStart w:id="10" w:name="_Toc241438818"/>
       <w:r>
         <w:rPr>
           <w:b/>
@@ -4633,7 +4644,7 @@
         <w:keepNext/>
         <w:spacing w:before="240" w:after="120"/>
       </w:pPr>
-      <w:bookmarkStart w:id="11" w:name="_Toc241399591"/>
+      <w:bookmarkStart w:id="11" w:name="_Toc241438819"/>
       <w:r>
         <w:rPr>
           <w:b/>
@@ -4803,7 +4814,7 @@
         <w:keepNext/>
         <w:spacing w:before="240" w:after="120"/>
       </w:pPr>
-      <w:bookmarkStart w:id="12" w:name="_Toc241399592"/>
+      <w:bookmarkStart w:id="12" w:name="_Toc241438820"/>
       <w:r>
         <w:rPr>
           <w:b/>
@@ -4844,7 +4855,11 @@
         <w:t>in tempo reale</w:t>
       </w:r>
       <w:r>
-        <w:t xml:space="preserve"> a partire dalle sole partite concluse, senza mai salvarla su database. Questa è una scelta progettuale deliberata: una classifica persistita potrebbe andare fuori sincrono con i risultati se una partita venisse corretta, mentre una classifica calcolata al momento è per costruzione sempre coerente con i dati.</w:t>
+        <w:t xml:space="preserve"> a partire dalle sole partite concluse, senza mai salvarla su database. Questa è una scelta progettuale deliberata: una classifica </w:t>
+      </w:r>
+      <w:r>
+        <w:lastRenderedPageBreak/>
+        <w:t>persistita potrebbe andare fuori sincrono con i risultati se una partita venisse corretta, mentre una classifica calcolata al momento è per costruzione sempre coerente con i dati.</w:t>
       </w:r>
     </w:p>
     <w:p>
@@ -4853,7 +4868,6 @@
         <w:jc w:val="both"/>
       </w:pPr>
       <w:r>
-        <w:lastRenderedPageBreak/>
         <w:t xml:space="preserve">Ogni squadra è rappresentata da un accumulatore tipizzato </w:t>
       </w:r>
       <w:r>
@@ -5042,7 +5056,7 @@
         <w:keepNext/>
         <w:spacing w:before="240" w:after="120"/>
       </w:pPr>
-      <w:bookmarkStart w:id="13" w:name="_Toc241399593"/>
+      <w:bookmarkStart w:id="13" w:name="_Toc241438821"/>
       <w:r>
         <w:rPr>
           <w:b/>
@@ -5095,7 +5109,7 @@
           <w:u w:val="single"/>
         </w:rPr>
       </w:pPr>
-      <w:bookmarkStart w:id="14" w:name="_Toc241399594"/>
+      <w:bookmarkStart w:id="14" w:name="_Toc241438822"/>
       <w:r>
         <w:rPr>
           <w:b/>
@@ -5348,19 +5362,29 @@
         <w:spacing w:after="80" w:line="264" w:lineRule="auto"/>
       </w:pPr>
       <w:r>
-        <w:t xml:space="preserve">Non è possibile declassare l'ultimo </w:t>
-      </w:r>
-      <w:r>
-        <w:rPr>
-          <w:rFonts w:ascii="Consolas" w:eastAsia="Consolas" w:hAnsi="Consolas" w:cs="Consolas"/>
-          <w:color w:val="C0392B"/>
-          <w:sz w:val="20"/>
-          <w:szCs w:val="20"/>
+        <w:t xml:space="preserve">Chi crea una squadra ne diventa proprietario ed entra fra i membri come </w:t>
+      </w:r>
+      <w:r>
+        <w:rPr>
+          <w:rFonts w:ascii="Consolas" w:hAnsi="Consolas"/>
+          <w:color w:val="C0392B"/>
+          <w:sz w:val="20"/>
+        </w:rPr>
+        <w:t>CAPTAIN</w:t>
+      </w:r>
+      <w:r>
+        <w:t xml:space="preserve">; solo il proprietario o un </w:t>
+      </w:r>
+      <w:r>
+        <w:rPr>
+          <w:rFonts w:ascii="Consolas" w:hAnsi="Consolas"/>
+          <w:color w:val="C0392B"/>
+          <w:sz w:val="20"/>
         </w:rPr>
         <w:t>ADMIN</w:t>
       </w:r>
       <w:r>
-        <w:t xml:space="preserve"> rimasto nel sistema.</w:t>
+        <w:t xml:space="preserve"> possono modificarla e gestirne i membri.</w:t>
       </w:r>
     </w:p>
     <w:p>
@@ -5373,391 +5397,20 @@
         <w:spacing w:after="80" w:line="264" w:lineRule="auto"/>
       </w:pPr>
       <w:r>
-        <w:t>Un utente può modificare solo il proprio profilo; un ADMIN qualsiasi profilo.</w:t>
-      </w:r>
-    </w:p>
-    <w:p>
-      <w:pPr>
-        <w:spacing w:after="120" w:line="276" w:lineRule="auto"/>
-        <w:jc w:val="both"/>
-      </w:pPr>
-      <w:r>
-        <w:t xml:space="preserve">Nel loro insieme queste regole descrivono il ciclo di vita di un torneo: </w:t>
-      </w:r>
-      <w:r>
-        <w:rPr>
-          <w:rFonts w:ascii="Consolas" w:hAnsi="Consolas"/>
-          <w:color w:val="C0392B"/>
-          <w:sz w:val="20"/>
-        </w:rPr>
-        <w:t>DRAFT</w:t>
-      </w:r>
-      <w:r>
-        <w:t xml:space="preserve"> (iscrizioni aperte), </w:t>
-      </w:r>
-      <w:r>
-        <w:rPr>
-          <w:rFonts w:ascii="Consolas" w:hAnsi="Consolas"/>
-          <w:color w:val="C0392B"/>
-          <w:sz w:val="20"/>
-        </w:rPr>
-        <w:t>ACTIVE</w:t>
-      </w:r>
-      <w:r>
-        <w:t xml:space="preserve"> (calendario generato, risultati in corso) e </w:t>
-      </w:r>
-      <w:r>
-        <w:rPr>
-          <w:rFonts w:ascii="Consolas" w:hAnsi="Consolas"/>
-          <w:color w:val="C0392B"/>
-          <w:sz w:val="20"/>
-        </w:rPr>
-        <w:t>COMPLETED</w:t>
-      </w:r>
-      <w:r>
-        <w:t xml:space="preserve"> (torneo chiuso, dati consolidati). Ogni violazione produce una risposta </w:t>
-      </w:r>
-      <w:r>
-        <w:rPr>
-          <w:rFonts w:ascii="Consolas" w:hAnsi="Consolas"/>
-          <w:color w:val="C0392B"/>
-          <w:sz w:val="20"/>
-        </w:rPr>
-        <w:t>409 Conflict</w:t>
-      </w:r>
-      <w:r>
-        <w:t xml:space="preserve"> con un messaggio esplicito.</w:t>
-      </w:r>
-    </w:p>
-    <w:p>
-      <w:pPr>
-        <w:pStyle w:val="Titolo1"/>
-        <w:keepNext/>
-        <w:pageBreakBefore/>
-        <w:spacing w:before="320" w:after="160"/>
-      </w:pPr>
-      <w:bookmarkStart w:id="15" w:name="_Toc241399595"/>
-      <w:r>
-        <w:rPr>
-          <w:b/>
-          <w:bCs/>
-          <w:color w:val="1F4E79"/>
-          <w:sz w:val="30"/>
-          <w:szCs w:val="30"/>
-        </w:rPr>
         <w:lastRenderedPageBreak/>
-        <w:t>5. Sicurezza</w:t>
-      </w:r>
-      <w:bookmarkEnd w:id="15"/>
-    </w:p>
-    <w:p>
-      <w:pPr>
-        <w:spacing w:after="120" w:line="276" w:lineRule="auto"/>
-        <w:jc w:val="both"/>
-      </w:pPr>
-      <w:r>
-        <w:t xml:space="preserve">L'autenticazione è realizzata con </w:t>
-      </w:r>
-      <w:r>
-        <w:rPr>
-          <w:b/>
-        </w:rPr>
-        <w:t>Spring Security</w:t>
-      </w:r>
-      <w:r>
-        <w:t xml:space="preserve"> e </w:t>
-      </w:r>
-      <w:r>
-        <w:rPr>
-          <w:b/>
-        </w:rPr>
-        <w:t>Spring Authorization Server</w:t>
-      </w:r>
-      <w:r>
-        <w:t xml:space="preserve">, il modulo ufficiale di Spring per emettere e gestire token OAuth2. Al login, verificate le credenziali, il server emette due token: un </w:t>
-      </w:r>
-      <w:r>
-        <w:rPr>
-          <w:b/>
-        </w:rPr>
-        <w:t>access token opaco</w:t>
-      </w:r>
-      <w:r>
-        <w:t xml:space="preserve"> — una stringa casuale che non contiene alcun dato — valido 15 minuti, e un </w:t>
-      </w:r>
-      <w:r>
-        <w:rPr>
-          <w:b/>
-        </w:rPr>
-        <w:t>refresh token</w:t>
-      </w:r>
-      <w:r>
-        <w:t xml:space="preserve"> valido 7 giorni. Il client invia l'access token in ogni richiesta, nell'header </w:t>
-      </w:r>
-      <w:r>
-        <w:rPr>
-          <w:rFonts w:ascii="Consolas" w:hAnsi="Consolas"/>
-          <w:color w:val="C0392B"/>
-          <w:sz w:val="20"/>
-        </w:rPr>
-        <w:t>Authorization: Bearer &lt;token&gt;</w:t>
-      </w:r>
-      <w:r>
-        <w:t>; quando scade, lo rinnova con il refresh token senza dover ripetere il login.</w:t>
-      </w:r>
-    </w:p>
-    <w:p>
-      <w:pPr>
-        <w:spacing w:after="120" w:line="276" w:lineRule="auto"/>
-        <w:jc w:val="both"/>
-      </w:pPr>
-      <w:r>
-        <w:t xml:space="preserve">Le durate e la politica di rinnovo sono definite nelle </w:t>
-      </w:r>
-      <w:r>
-        <w:rPr>
-          <w:rFonts w:ascii="Consolas" w:hAnsi="Consolas"/>
-          <w:color w:val="C0392B"/>
-          <w:sz w:val="20"/>
-        </w:rPr>
-        <w:t>TokenSettings</w:t>
-      </w:r>
-      <w:r>
-        <w:t xml:space="preserve"> del client registrato (</w:t>
-      </w:r>
-      <w:r>
-        <w:rPr>
-          <w:rFonts w:ascii="Consolas" w:hAnsi="Consolas"/>
-          <w:color w:val="C0392B"/>
-          <w:sz w:val="20"/>
-        </w:rPr>
-        <w:t>RegisteredClient</w:t>
-      </w:r>
-      <w:r>
-        <w:t xml:space="preserve">) e sono configurabili da variabili d'ambiente. La </w:t>
-      </w:r>
-      <w:r>
-        <w:rPr>
-          <w:b/>
-        </w:rPr>
-        <w:t>rotazione dei refresh token</w:t>
-      </w:r>
-      <w:r>
-        <w:t xml:space="preserve"> è attiva: ogni rinnovo emette una nuova coppia e invalida la precedente, per cui un refresh token già usato non ha più alcun valore, anche se intercettato. I token sono generati dai componenti dell'Authorization Server, </w:t>
-      </w:r>
-      <w:r>
-        <w:rPr>
-          <w:rFonts w:ascii="Consolas" w:hAnsi="Consolas"/>
-          <w:color w:val="C0392B"/>
-          <w:sz w:val="20"/>
-        </w:rPr>
-        <w:t>OAuth2AccessTokenGenerator</w:t>
-      </w:r>
-      <w:r>
-        <w:t xml:space="preserve"> e </w:t>
-      </w:r>
-      <w:r>
-        <w:rPr>
-          <w:rFonts w:ascii="Consolas" w:hAnsi="Consolas"/>
-          <w:color w:val="C0392B"/>
-          <w:sz w:val="20"/>
-        </w:rPr>
-        <w:t>OAuth2RefreshTokenGenerator</w:t>
-      </w:r>
-      <w:r>
-        <w:t>.</w:t>
-      </w:r>
-    </w:p>
-    <w:p>
-      <w:pPr>
-        <w:spacing w:after="120" w:line="276" w:lineRule="auto"/>
-        <w:jc w:val="both"/>
-      </w:pPr>
-      <w:r>
-        <w:t xml:space="preserve">Sul modello di </w:t>
-      </w:r>
-      <w:r>
-        <w:rPr>
-          <w:b/>
-        </w:rPr>
-        <w:t>Django Knox</w:t>
-      </w:r>
-      <w:r>
-        <w:t xml:space="preserve">, nel database non viene mai salvato un token in chiaro. Il componente </w:t>
-      </w:r>
-      <w:r>
-        <w:rPr>
-          <w:rFonts w:ascii="Consolas" w:hAnsi="Consolas"/>
-          <w:color w:val="C0392B"/>
-          <w:sz w:val="20"/>
-        </w:rPr>
-        <w:t>HashedOAuth2AuthorizationService</w:t>
-      </w:r>
-      <w:r>
-        <w:t xml:space="preserve"> implementa l'interfaccia </w:t>
-      </w:r>
-      <w:r>
-        <w:rPr>
-          <w:rFonts w:ascii="Consolas" w:hAnsi="Consolas"/>
-          <w:color w:val="C0392B"/>
-          <w:sz w:val="20"/>
-        </w:rPr>
-        <w:t>OAuth2AuthorizationService</w:t>
-      </w:r>
-      <w:r>
-        <w:t xml:space="preserve"> dell'Authorization Server e scrive nella tabella </w:t>
-      </w:r>
-      <w:r>
-        <w:rPr>
-          <w:rFonts w:ascii="Consolas" w:hAnsi="Consolas"/>
-          <w:color w:val="C0392B"/>
-          <w:sz w:val="20"/>
-        </w:rPr>
-        <w:t>oauth2_authorizations</w:t>
-      </w:r>
-      <w:r>
-        <w:t xml:space="preserve"> solo l'</w:t>
-      </w:r>
-      <w:r>
-        <w:rPr>
-          <w:b/>
-        </w:rPr>
-        <w:t>hash SHA-512</w:t>
-      </w:r>
-      <w:r>
-        <w:t xml:space="preserve"> di ciascun token; la ricerca avviene calcolando l'hash del token ricevuto. Chi ottenesse una copia del database non potrebbe quindi usare alcun token. Poiché lo stato è conservato sul server, la </w:t>
-      </w:r>
-      <w:r>
-        <w:rPr>
-          <w:b/>
-        </w:rPr>
-        <w:t>revoca è immediata</w:t>
-      </w:r>
-      <w:r>
-        <w:t xml:space="preserve">: il </w:t>
-      </w:r>
-      <w:r>
-        <w:rPr>
-          <w:rFonts w:ascii="Consolas" w:hAnsi="Consolas"/>
-          <w:color w:val="C0392B"/>
-          <w:sz w:val="20"/>
-        </w:rPr>
-        <w:t>logout</w:t>
-      </w:r>
-      <w:r>
-        <w:t xml:space="preserve"> elimina la sessione corrente e il </w:t>
-      </w:r>
-      <w:r>
-        <w:rPr>
-          <w:rFonts w:ascii="Consolas" w:hAnsi="Consolas"/>
-          <w:color w:val="C0392B"/>
-          <w:sz w:val="20"/>
-        </w:rPr>
-        <w:t>logout-all</w:t>
-      </w:r>
-      <w:r>
-        <w:t xml:space="preserve"> tutte le sessioni dell'utente, su ogni dispositivo. Un task programmato (</w:t>
-      </w:r>
-      <w:r>
-        <w:rPr>
-          <w:rFonts w:ascii="Consolas" w:hAnsi="Consolas"/>
-          <w:color w:val="C0392B"/>
-          <w:sz w:val="20"/>
-        </w:rPr>
-        <w:t>ExpiredTokenCleanup</w:t>
-      </w:r>
-      <w:r>
-        <w:t>) elimina ogni ora le autorizzazioni scadute.</w:t>
-      </w:r>
-    </w:p>
-    <w:p>
-      <w:pPr>
-        <w:spacing w:after="120" w:line="276" w:lineRule="auto"/>
-        <w:jc w:val="both"/>
-      </w:pPr>
-      <w:r>
-        <w:t xml:space="preserve">Il backend svolge anche il ruolo di </w:t>
-      </w:r>
-      <w:r>
-        <w:rPr>
-          <w:b/>
-        </w:rPr>
-        <w:t>Resource Server</w:t>
-      </w:r>
-      <w:r>
-        <w:t xml:space="preserve">: il filtro standard di Spring Security estrae il token dall'header e lo passa a </w:t>
-      </w:r>
-      <w:r>
-        <w:rPr>
-          <w:rFonts w:ascii="Consolas" w:hAnsi="Consolas"/>
-          <w:color w:val="C0392B"/>
-          <w:sz w:val="20"/>
-        </w:rPr>
-        <w:t>StoredTokenIntrospector</w:t>
-      </w:r>
-      <w:r>
-        <w:t>, che lo verifica leggendo direttamente il database, senza chiamate HTTP, controlla che non sia scaduto e che l'utente esista ancora, e popola il SecurityContext con l'utente autenticato e i suoi ruoli.</w:t>
-      </w:r>
-    </w:p>
-    <w:p>
-      <w:pPr>
-        <w:spacing w:after="120" w:line="276" w:lineRule="auto"/>
-        <w:jc w:val="both"/>
-      </w:pPr>
-      <w:r>
-        <w:t>Il login e il rinnovo sono esposti come endpoint dell'API (</w:t>
-      </w:r>
-      <w:r>
-        <w:rPr>
-          <w:rFonts w:ascii="Consolas" w:hAnsi="Consolas"/>
-          <w:color w:val="C0392B"/>
-          <w:sz w:val="20"/>
-        </w:rPr>
-        <w:t>/api/auth/login</w:t>
-      </w:r>
-      <w:r>
-        <w:t xml:space="preserve"> e </w:t>
-      </w:r>
-      <w:r>
-        <w:rPr>
-          <w:rFonts w:ascii="Consolas" w:hAnsi="Consolas"/>
-          <w:color w:val="C0392B"/>
-          <w:sz w:val="20"/>
-        </w:rPr>
-        <w:t>/api/auth/refresh</w:t>
-      </w:r>
-      <w:r>
-        <w:t xml:space="preserve">) invece che tramite l'endpoint standard </w:t>
-      </w:r>
-      <w:r>
-        <w:rPr>
-          <w:rFonts w:ascii="Consolas" w:hAnsi="Consolas"/>
-          <w:color w:val="C0392B"/>
-          <w:sz w:val="20"/>
-        </w:rPr>
-        <w:t>/oauth2/token</w:t>
-      </w:r>
-      <w:r>
-        <w:t xml:space="preserve"> dell'Authorization Server. L'endpoint standard richiede infatti l'autenticazione del client con un segreto, che un'applicazione web eseguita nel browser non può custodire; la soluzione adottata usa comunque il modello dei token, i generatori e le impostazioni dell'Authorization Server, e mantiene semplice l'integrazione con il frontend.</w:t>
-      </w:r>
-    </w:p>
-    <w:p>
-      <w:pPr>
-        <w:spacing w:after="120" w:line="276" w:lineRule="auto"/>
-        <w:jc w:val="both"/>
-      </w:pPr>
-      <w:r>
-        <w:t xml:space="preserve">La protezione opera su </w:t>
-      </w:r>
-      <w:r>
-        <w:rPr>
-          <w:b/>
-          <w:bCs/>
-        </w:rPr>
-        <w:t>quattro livelli di accesso</w:t>
-      </w:r>
-      <w:r>
-        <w:t>:</w:t>
+        <w:t xml:space="preserve">Non è possibile declassare l'ultimo </w:t>
+      </w:r>
+      <w:r>
+        <w:rPr>
+          <w:rFonts w:ascii="Consolas" w:eastAsia="Consolas" w:hAnsi="Consolas" w:cs="Consolas"/>
+          <w:color w:val="C0392B"/>
+          <w:sz w:val="20"/>
+          <w:szCs w:val="20"/>
+        </w:rPr>
+        <w:t>ADMIN</w:t>
+      </w:r>
+      <w:r>
+        <w:t xml:space="preserve"> rimasto nel sistema.</w:t>
       </w:r>
     </w:p>
     <w:p>
@@ -5770,13 +5423,391 @@
         <w:spacing w:after="80" w:line="264" w:lineRule="auto"/>
       </w:pPr>
       <w:r>
+        <w:t>Un utente può modificare solo il proprio profilo; un ADMIN qualsiasi profilo.</w:t>
+      </w:r>
+    </w:p>
+    <w:p>
+      <w:pPr>
+        <w:spacing w:after="120" w:line="276" w:lineRule="auto"/>
+        <w:jc w:val="both"/>
+      </w:pPr>
+      <w:r>
+        <w:t xml:space="preserve">Nel loro insieme queste regole descrivono il ciclo di vita di un torneo: </w:t>
+      </w:r>
+      <w:r>
+        <w:rPr>
+          <w:rFonts w:ascii="Consolas" w:hAnsi="Consolas"/>
+          <w:color w:val="C0392B"/>
+          <w:sz w:val="20"/>
+        </w:rPr>
+        <w:t>DRAFT</w:t>
+      </w:r>
+      <w:r>
+        <w:t xml:space="preserve"> (iscrizioni aperte), </w:t>
+      </w:r>
+      <w:r>
+        <w:rPr>
+          <w:rFonts w:ascii="Consolas" w:hAnsi="Consolas"/>
+          <w:color w:val="C0392B"/>
+          <w:sz w:val="20"/>
+        </w:rPr>
+        <w:t>ACTIVE</w:t>
+      </w:r>
+      <w:r>
+        <w:t xml:space="preserve"> (calendario generato, risultati in corso) e </w:t>
+      </w:r>
+      <w:r>
+        <w:rPr>
+          <w:rFonts w:ascii="Consolas" w:hAnsi="Consolas"/>
+          <w:color w:val="C0392B"/>
+          <w:sz w:val="20"/>
+        </w:rPr>
+        <w:t>COMPLETED</w:t>
+      </w:r>
+      <w:r>
+        <w:t xml:space="preserve"> (torneo chiuso, dati consolidati). Ogni violazione produce una risposta </w:t>
+      </w:r>
+      <w:r>
+        <w:rPr>
+          <w:rFonts w:ascii="Consolas" w:hAnsi="Consolas"/>
+          <w:color w:val="C0392B"/>
+          <w:sz w:val="20"/>
+        </w:rPr>
+        <w:t>409 Conflict</w:t>
+      </w:r>
+      <w:r>
+        <w:t xml:space="preserve"> con un messaggio esplicito.</w:t>
+      </w:r>
+    </w:p>
+    <w:p>
+      <w:pPr>
+        <w:pStyle w:val="Titolo1"/>
+        <w:keepNext/>
+        <w:pageBreakBefore/>
+        <w:spacing w:before="320" w:after="160"/>
+      </w:pPr>
+      <w:bookmarkStart w:id="15" w:name="_Toc241438823"/>
+      <w:r>
         <w:rPr>
           <w:b/>
-        </w:rPr>
-        <w:t>pubblico</w:t>
-      </w:r>
-      <w:r>
-        <w:t xml:space="preserve"> — registrazione, login e rinnovo del token, accessibili senza access token;</w:t>
+          <w:bCs/>
+          <w:color w:val="1F4E79"/>
+          <w:sz w:val="30"/>
+          <w:szCs w:val="30"/>
+        </w:rPr>
+        <w:lastRenderedPageBreak/>
+        <w:t>5. Sicurezza</w:t>
+      </w:r>
+      <w:bookmarkEnd w:id="15"/>
+    </w:p>
+    <w:p>
+      <w:pPr>
+        <w:spacing w:after="120" w:line="276" w:lineRule="auto"/>
+        <w:jc w:val="both"/>
+      </w:pPr>
+      <w:r>
+        <w:t xml:space="preserve">L'autenticazione è realizzata con </w:t>
+      </w:r>
+      <w:r>
+        <w:rPr>
+          <w:b/>
+        </w:rPr>
+        <w:t>Spring Security</w:t>
+      </w:r>
+      <w:r>
+        <w:t xml:space="preserve"> e </w:t>
+      </w:r>
+      <w:r>
+        <w:rPr>
+          <w:b/>
+        </w:rPr>
+        <w:t>Spring Authorization Server</w:t>
+      </w:r>
+      <w:r>
+        <w:t xml:space="preserve">, il modulo ufficiale di Spring per emettere e gestire token OAuth2. Al login, verificate le credenziali, il server emette due token: un </w:t>
+      </w:r>
+      <w:r>
+        <w:rPr>
+          <w:b/>
+        </w:rPr>
+        <w:t>access token opaco</w:t>
+      </w:r>
+      <w:r>
+        <w:t xml:space="preserve"> — una stringa casuale che non contiene alcun dato — valido 15 minuti, e un </w:t>
+      </w:r>
+      <w:r>
+        <w:rPr>
+          <w:b/>
+        </w:rPr>
+        <w:t>refresh token</w:t>
+      </w:r>
+      <w:r>
+        <w:t xml:space="preserve"> valido 7 giorni. Il client invia l'access token in ogni richiesta, nell'header </w:t>
+      </w:r>
+      <w:r>
+        <w:rPr>
+          <w:rFonts w:ascii="Consolas" w:hAnsi="Consolas"/>
+          <w:color w:val="C0392B"/>
+          <w:sz w:val="20"/>
+        </w:rPr>
+        <w:t>Authorization: Bearer &lt;token&gt;</w:t>
+      </w:r>
+      <w:r>
+        <w:t>; quando scade, lo rinnova con il refresh token senza dover ripetere il login.</w:t>
+      </w:r>
+    </w:p>
+    <w:p>
+      <w:pPr>
+        <w:spacing w:after="120" w:line="276" w:lineRule="auto"/>
+        <w:jc w:val="both"/>
+      </w:pPr>
+      <w:r>
+        <w:t xml:space="preserve">Le durate e la politica di rinnovo sono definite nelle </w:t>
+      </w:r>
+      <w:r>
+        <w:rPr>
+          <w:rFonts w:ascii="Consolas" w:hAnsi="Consolas"/>
+          <w:color w:val="C0392B"/>
+          <w:sz w:val="20"/>
+        </w:rPr>
+        <w:t>TokenSettings</w:t>
+      </w:r>
+      <w:r>
+        <w:t xml:space="preserve"> del client registrato (</w:t>
+      </w:r>
+      <w:r>
+        <w:rPr>
+          <w:rFonts w:ascii="Consolas" w:hAnsi="Consolas"/>
+          <w:color w:val="C0392B"/>
+          <w:sz w:val="20"/>
+        </w:rPr>
+        <w:t>RegisteredClient</w:t>
+      </w:r>
+      <w:r>
+        <w:t xml:space="preserve">) e sono configurabili da variabili d'ambiente. La </w:t>
+      </w:r>
+      <w:r>
+        <w:rPr>
+          <w:b/>
+        </w:rPr>
+        <w:t>rotazione dei refresh token</w:t>
+      </w:r>
+      <w:r>
+        <w:t xml:space="preserve"> è attiva: ogni rinnovo emette una nuova coppia e invalida la precedente, per cui un refresh token già usato non ha più alcun valore, anche se intercettato. I token sono generati dai componenti dell'Authorization Server, </w:t>
+      </w:r>
+      <w:r>
+        <w:rPr>
+          <w:rFonts w:ascii="Consolas" w:hAnsi="Consolas"/>
+          <w:color w:val="C0392B"/>
+          <w:sz w:val="20"/>
+        </w:rPr>
+        <w:t>OAuth2AccessTokenGenerator</w:t>
+      </w:r>
+      <w:r>
+        <w:t xml:space="preserve"> e </w:t>
+      </w:r>
+      <w:r>
+        <w:rPr>
+          <w:rFonts w:ascii="Consolas" w:hAnsi="Consolas"/>
+          <w:color w:val="C0392B"/>
+          <w:sz w:val="20"/>
+        </w:rPr>
+        <w:t>OAuth2RefreshTokenGenerator</w:t>
+      </w:r>
+      <w:r>
+        <w:t>.</w:t>
+      </w:r>
+    </w:p>
+    <w:p>
+      <w:pPr>
+        <w:spacing w:after="120" w:line="276" w:lineRule="auto"/>
+        <w:jc w:val="both"/>
+      </w:pPr>
+      <w:r>
+        <w:t xml:space="preserve">Sul modello di </w:t>
+      </w:r>
+      <w:r>
+        <w:rPr>
+          <w:b/>
+        </w:rPr>
+        <w:t>Django Knox</w:t>
+      </w:r>
+      <w:r>
+        <w:t xml:space="preserve">, nel database non viene mai salvato un token in chiaro. Il componente </w:t>
+      </w:r>
+      <w:r>
+        <w:rPr>
+          <w:rFonts w:ascii="Consolas" w:hAnsi="Consolas"/>
+          <w:color w:val="C0392B"/>
+          <w:sz w:val="20"/>
+        </w:rPr>
+        <w:t>HashedOAuth2AuthorizationService</w:t>
+      </w:r>
+      <w:r>
+        <w:t xml:space="preserve"> implementa l'interfaccia </w:t>
+      </w:r>
+      <w:r>
+        <w:rPr>
+          <w:rFonts w:ascii="Consolas" w:hAnsi="Consolas"/>
+          <w:color w:val="C0392B"/>
+          <w:sz w:val="20"/>
+        </w:rPr>
+        <w:t>OAuth2AuthorizationService</w:t>
+      </w:r>
+      <w:r>
+        <w:t xml:space="preserve"> dell'Authorization Server e scrive nella tabella </w:t>
+      </w:r>
+      <w:r>
+        <w:rPr>
+          <w:rFonts w:ascii="Consolas" w:hAnsi="Consolas"/>
+          <w:color w:val="C0392B"/>
+          <w:sz w:val="20"/>
+        </w:rPr>
+        <w:t>oauth2_authorizations</w:t>
+      </w:r>
+      <w:r>
+        <w:t xml:space="preserve"> solo l'</w:t>
+      </w:r>
+      <w:r>
+        <w:rPr>
+          <w:b/>
+        </w:rPr>
+        <w:t>hash SHA-512</w:t>
+      </w:r>
+      <w:r>
+        <w:t xml:space="preserve"> di ciascun token; la ricerca avviene calcolando l'hash del token ricevuto. Chi ottenesse una copia del database non potrebbe quindi usare alcun token. Poiché lo stato è conservato sul server, la </w:t>
+      </w:r>
+      <w:r>
+        <w:rPr>
+          <w:b/>
+        </w:rPr>
+        <w:t>revoca è immediata</w:t>
+      </w:r>
+      <w:r>
+        <w:t xml:space="preserve">: il </w:t>
+      </w:r>
+      <w:r>
+        <w:rPr>
+          <w:rFonts w:ascii="Consolas" w:hAnsi="Consolas"/>
+          <w:color w:val="C0392B"/>
+          <w:sz w:val="20"/>
+        </w:rPr>
+        <w:t>logout</w:t>
+      </w:r>
+      <w:r>
+        <w:t xml:space="preserve"> elimina la sessione corrente e il </w:t>
+      </w:r>
+      <w:r>
+        <w:rPr>
+          <w:rFonts w:ascii="Consolas" w:hAnsi="Consolas"/>
+          <w:color w:val="C0392B"/>
+          <w:sz w:val="20"/>
+        </w:rPr>
+        <w:t>logout-all</w:t>
+      </w:r>
+      <w:r>
+        <w:t xml:space="preserve"> tutte le sessioni dell'utente, su ogni dispositivo. Un task programmato (</w:t>
+      </w:r>
+      <w:r>
+        <w:rPr>
+          <w:rFonts w:ascii="Consolas" w:hAnsi="Consolas"/>
+          <w:color w:val="C0392B"/>
+          <w:sz w:val="20"/>
+        </w:rPr>
+        <w:t>ExpiredTokenCleanup</w:t>
+      </w:r>
+      <w:r>
+        <w:t>) elimina ogni ora le autorizzazioni scadute.</w:t>
+      </w:r>
+    </w:p>
+    <w:p>
+      <w:pPr>
+        <w:spacing w:after="120" w:line="276" w:lineRule="auto"/>
+        <w:jc w:val="both"/>
+      </w:pPr>
+      <w:r>
+        <w:t xml:space="preserve">Il backend svolge anche il ruolo di </w:t>
+      </w:r>
+      <w:r>
+        <w:rPr>
+          <w:b/>
+        </w:rPr>
+        <w:t>Resource Server</w:t>
+      </w:r>
+      <w:r>
+        <w:t xml:space="preserve">: il filtro standard di Spring Security estrae il token dall'header e lo passa a </w:t>
+      </w:r>
+      <w:r>
+        <w:rPr>
+          <w:rFonts w:ascii="Consolas" w:hAnsi="Consolas"/>
+          <w:color w:val="C0392B"/>
+          <w:sz w:val="20"/>
+        </w:rPr>
+        <w:t>StoredTokenIntrospector</w:t>
+      </w:r>
+      <w:r>
+        <w:t>, che lo verifica leggendo direttamente il database, senza chiamate HTTP, controlla che non sia scaduto e che l'utente esista ancora, e popola il SecurityContext con l'utente autenticato e i suoi ruoli.</w:t>
+      </w:r>
+    </w:p>
+    <w:p>
+      <w:pPr>
+        <w:spacing w:after="120" w:line="276" w:lineRule="auto"/>
+        <w:jc w:val="both"/>
+      </w:pPr>
+      <w:r>
+        <w:t>Il login e il rinnovo sono esposti come endpoint dell'API (</w:t>
+      </w:r>
+      <w:r>
+        <w:rPr>
+          <w:rFonts w:ascii="Consolas" w:hAnsi="Consolas"/>
+          <w:color w:val="C0392B"/>
+          <w:sz w:val="20"/>
+        </w:rPr>
+        <w:t>/api/auth/login</w:t>
+      </w:r>
+      <w:r>
+        <w:t xml:space="preserve"> e </w:t>
+      </w:r>
+      <w:r>
+        <w:rPr>
+          <w:rFonts w:ascii="Consolas" w:hAnsi="Consolas"/>
+          <w:color w:val="C0392B"/>
+          <w:sz w:val="20"/>
+        </w:rPr>
+        <w:t>/api/auth/refresh</w:t>
+      </w:r>
+      <w:r>
+        <w:t xml:space="preserve">) invece che tramite l'endpoint standard </w:t>
+      </w:r>
+      <w:r>
+        <w:rPr>
+          <w:rFonts w:ascii="Consolas" w:hAnsi="Consolas"/>
+          <w:color w:val="C0392B"/>
+          <w:sz w:val="20"/>
+        </w:rPr>
+        <w:t>/oauth2/token</w:t>
+      </w:r>
+      <w:r>
+        <w:t xml:space="preserve"> dell'Authorization Server. L'endpoint standard richiede infatti l'autenticazione del client con un segreto, che un'applicazione web eseguita nel browser non può custodire; la soluzione adottata usa comunque il modello dei token, i generatori e le impostazioni dell'Authorization Server, e mantiene semplice l'integrazione con il frontend.</w:t>
+      </w:r>
+    </w:p>
+    <w:p>
+      <w:pPr>
+        <w:spacing w:after="120" w:line="276" w:lineRule="auto"/>
+        <w:jc w:val="both"/>
+      </w:pPr>
+      <w:r>
+        <w:t xml:space="preserve">La protezione opera su </w:t>
+      </w:r>
+      <w:r>
+        <w:rPr>
+          <w:b/>
+          <w:bCs/>
+        </w:rPr>
+        <w:t>quattro livelli di accesso</w:t>
+      </w:r>
+      <w:r>
+        <w:t>:</w:t>
       </w:r>
     </w:p>
     <w:p>
@@ -5791,12 +5822,11 @@
       <w:r>
         <w:rPr>
           <w:b/>
-          <w:bCs/>
-        </w:rPr>
-        <w:t>autenticato</w:t>
-      </w:r>
-      <w:r>
-        <w:t xml:space="preserve"> — la maggior parte delle letture, accessibili a qualunque utente con token valido;</w:t>
+        </w:rPr>
+        <w:t>pubblico</w:t>
+      </w:r>
+      <w:r>
+        <w:t xml:space="preserve"> — registrazione, login e rinnovo del token, accessibili senza access token;</w:t>
       </w:r>
     </w:p>
     <w:p>
@@ -5813,22 +5843,10 @@
           <w:b/>
           <w:bCs/>
         </w:rPr>
-        <w:t>basato su ruolo</w:t>
-      </w:r>
-      <w:r>
-        <w:t xml:space="preserve"> — operazioni sensibili riservate a ADMIN o ORGANIZER tramite l'annotazione </w:t>
-      </w:r>
-      <w:r>
-        <w:rPr>
-          <w:rFonts w:ascii="Consolas" w:eastAsia="Consolas" w:hAnsi="Consolas" w:cs="Consolas"/>
-          <w:color w:val="C0392B"/>
-          <w:sz w:val="20"/>
-          <w:szCs w:val="20"/>
-        </w:rPr>
-        <w:t>@PreAuthorize</w:t>
-      </w:r>
-      <w:r>
-        <w:t>.</w:t>
+        <w:t>autenticato</w:t>
+      </w:r>
+      <w:r>
+        <w:t xml:space="preserve"> — la maggior parte delle letture, accessibili a qualunque utente con token valido;</w:t>
       </w:r>
     </w:p>
     <w:p>
@@ -5843,22 +5861,43 @@
       <w:r>
         <w:rPr>
           <w:b/>
+          <w:bCs/>
+        </w:rPr>
+        <w:t>basato su ruolo</w:t>
+      </w:r>
+      <w:r>
+        <w:t xml:space="preserve"> — operazioni sensibili riservate a ADMIN o ORGANIZER tramite l'annotazione </w:t>
+      </w:r>
+      <w:r>
+        <w:rPr>
+          <w:rFonts w:ascii="Consolas" w:eastAsia="Consolas" w:hAnsi="Consolas" w:cs="Consolas"/>
+          <w:color w:val="C0392B"/>
+          <w:sz w:val="20"/>
+          <w:szCs w:val="20"/>
+        </w:rPr>
+        <w:t>@PreAuthorize</w:t>
+      </w:r>
+      <w:r>
+        <w:t>.</w:t>
+      </w:r>
+    </w:p>
+    <w:p>
+      <w:pPr>
+        <w:pStyle w:val="Paragrafoelenco"/>
+        <w:numPr>
+          <w:ilvl w:val="0"/>
+          <w:numId w:val="1"/>
+        </w:numPr>
+        <w:spacing w:after="80" w:line="264" w:lineRule="auto"/>
+      </w:pPr>
+      <w:r>
+        <w:rPr>
+          <w:b/>
         </w:rPr>
         <w:t>basato sulla risorsa</w:t>
       </w:r>
       <w:r>
-        <w:t xml:space="preserve"> — per le operazioni su un torneo il ruolo </w:t>
-      </w:r>
-      <w:r>
-        <w:rPr>
-          <w:rFonts w:ascii="Consolas" w:hAnsi="Consolas"/>
-          <w:color w:val="C0392B"/>
-          <w:sz w:val="20"/>
-        </w:rPr>
-        <w:t>ORGANIZER</w:t>
-      </w:r>
-      <w:r>
-        <w:t xml:space="preserve"> non basta: bisogna essere tra gli organizzatori di quel torneo specifico.</w:t>
+        <w:t xml:space="preserve"> — per le operazioni su un torneo o su una squadra il ruolo non basta: bisogna esserne organizzatore o proprietario.</w:t>
       </w:r>
     </w:p>
     <w:p>
@@ -5953,7 +5992,7 @@
         <w:t>@tournamentSecurity.isOrganizer(#tournamentId, authentication)</w:t>
       </w:r>
       <w:r>
-        <w:t xml:space="preserve">) ed eseguita con una singola query di esistenza. Allo stesso modo la modifica del profilo è consentita solo al proprietario o a un </w:t>
+        <w:t xml:space="preserve">) ed eseguita con una singola query di esistenza. Con lo stesso schema </w:t>
       </w:r>
       <w:r>
         <w:rPr>
@@ -5961,10 +6000,32 @@
           <w:color w:val="C0392B"/>
           <w:sz w:val="20"/>
         </w:rPr>
+        <w:t>TeamSecurity</w:t>
+      </w:r>
+      <w:r>
+        <w:t xml:space="preserve"> protegge le squadre: chi ne crea una ne diventa proprietario e capitano, e solo lui o un </w:t>
+      </w:r>
+      <w:r>
+        <w:rPr>
+          <w:rFonts w:ascii="Consolas" w:hAnsi="Consolas"/>
+          <w:color w:val="C0392B"/>
+          <w:sz w:val="20"/>
+        </w:rPr>
         <w:t>ADMIN</w:t>
       </w:r>
       <w:r>
-        <w:t>, e l'indirizzo email di un utente è visibile solo all'utente stesso o a un amministratore.</w:t>
+        <w:t xml:space="preserve"> possono modificarla e gestirne i membri. Infine la modifica del profilo è consentita solo al proprietario o a un </w:t>
+      </w:r>
+      <w:r>
+        <w:rPr>
+          <w:rFonts w:ascii="Consolas" w:hAnsi="Consolas"/>
+          <w:color w:val="C0392B"/>
+          <w:sz w:val="20"/>
+        </w:rPr>
+        <w:t>ADMIN</w:t>
+      </w:r>
+      <w:r>
+        <w:t>, e l'indirizzo email e il numero di telefono di un utente sono visibili solo all'utente stesso o a un amministratore.</w:t>
       </w:r>
     </w:p>
     <w:p>
@@ -6116,7 +6177,18 @@
         <w:t>Retry-After</w:t>
       </w:r>
       <w:r>
-        <w:t xml:space="preserve"> quanti secondi attendere.</w:t>
+        <w:t xml:space="preserve"> quanti secondi attendere. Quando l'applicazione è dietro un reverse proxy, l'IP reale del client viene letto dall'header </w:t>
+      </w:r>
+      <w:r>
+        <w:rPr>
+          <w:rFonts w:ascii="Consolas" w:hAnsi="Consolas"/>
+          <w:color w:val="C0392B"/>
+          <w:sz w:val="20"/>
+        </w:rPr>
+        <w:t>X-Forwarded-For</w:t>
+      </w:r>
+      <w:r>
+        <w:t>; Tomcat se ne fida solo se la richiesta arriva da un proxy interno, per cui un client esterno non può falsificarlo per aggirare il limite. Un task programmato elimina periodicamente i contatori non più in uso.</w:t>
       </w:r>
     </w:p>
     <w:p>
@@ -6143,7 +6215,7 @@
         <w:keepNext/>
         <w:spacing w:before="320" w:after="160"/>
       </w:pPr>
-      <w:bookmarkStart w:id="16" w:name="_Toc241399596"/>
+      <w:bookmarkStart w:id="16" w:name="_Toc241438824"/>
       <w:r>
         <w:rPr>
           <w:b/>
@@ -6727,6 +6799,7 @@
                 <w:sz w:val="20"/>
                 <w:szCs w:val="20"/>
               </w:rPr>
+              <w:lastRenderedPageBreak/>
               <w:t>ResourceNotFound</w:t>
             </w:r>
           </w:p>
@@ -7078,7 +7151,6 @@
                 <w:sz w:val="20"/>
                 <w:szCs w:val="20"/>
               </w:rPr>
-              <w:lastRenderedPageBreak/>
               <w:t>DataIntegrityViolation</w:t>
             </w:r>
           </w:p>
@@ -7366,7 +7438,7 @@
         <w:pageBreakBefore/>
         <w:spacing w:before="320" w:after="160"/>
       </w:pPr>
-      <w:bookmarkStart w:id="17" w:name="_Toc241399597"/>
+      <w:bookmarkStart w:id="17" w:name="_Toc241438825"/>
       <w:r>
         <w:rPr>
           <w:b/>
@@ -7390,7 +7462,7 @@
         <w:rPr>
           <w:b/>
         </w:rPr>
-        <w:t>166 test</w:t>
+        <w:t>171 test</w:t>
       </w:r>
       <w:r>
         <w:t>, tutti superati, con una copertura del codice (</w:t>
@@ -7408,7 +7480,7 @@
         <w:rPr>
           <w:b/>
         </w:rPr>
-        <w:t>93%</w:t>
+        <w:t>94%</w:t>
       </w:r>
       <w:r>
         <w:t xml:space="preserve"> — ampiamente superiore al minimo del 35% richiesto. Sono esclusi dalla misurazione solo i package </w:t>
@@ -7535,7 +7607,7 @@
         <w:keepNext/>
         <w:spacing w:before="240" w:after="120"/>
       </w:pPr>
-      <w:bookmarkStart w:id="18" w:name="_Toc241399598"/>
+      <w:bookmarkStart w:id="18" w:name="_Toc241438826"/>
       <w:r>
         <w:rPr>
           <w:b/>
@@ -7839,7 +7911,7 @@
                 <w:sz w:val="20"/>
                 <w:szCs w:val="20"/>
               </w:rPr>
-              <w:t>100%</w:t>
+              <w:t>99%</w:t>
             </w:r>
           </w:p>
         </w:tc>
@@ -7953,7 +8025,7 @@
                 <w:sz w:val="20"/>
                 <w:szCs w:val="20"/>
               </w:rPr>
-              <w:t>81%</w:t>
+              <w:t>89%</w:t>
             </w:r>
           </w:p>
         </w:tc>
@@ -8003,7 +8075,7 @@
                 <w:sz w:val="20"/>
                 <w:szCs w:val="20"/>
               </w:rPr>
-              <w:t>93%</w:t>
+              <w:t>94%</w:t>
             </w:r>
           </w:p>
         </w:tc>
@@ -8020,7 +8092,7 @@
           <w:sz w:val="25"/>
         </w:rPr>
       </w:pPr>
-      <w:bookmarkStart w:id="19" w:name="_Toc241399599"/>
+      <w:bookmarkStart w:id="19" w:name="_Toc241438827"/>
       <w:r>
         <w:rPr>
           <w:b/>
@@ -8066,7 +8138,7 @@
         <w:keepNext/>
         <w:spacing w:before="320" w:after="160"/>
       </w:pPr>
-      <w:bookmarkStart w:id="20" w:name="_Toc241399600"/>
+      <w:bookmarkStart w:id="20" w:name="_Toc241438828"/>
       <w:r>
         <w:rPr>
           <w:b/>
@@ -8259,7 +8331,7 @@
         <w:keepNext/>
         <w:spacing w:before="320" w:after="160"/>
       </w:pPr>
-      <w:bookmarkStart w:id="21" w:name="_Toc241399601"/>
+      <w:bookmarkStart w:id="21" w:name="_Toc241438829"/>
       <w:r>
         <w:rPr>
           <w:b/>

</xml_diff>